<commit_message>
Fix table cross-references in JM-WP-BM-01
</commit_message>
<xml_diff>
--- a/docs/JM-WP-BM-01.docx
+++ b/docs/JM-WP-BM-01.docx
@@ -1159,7 +1159,7 @@
     </w:p>
     <w:bookmarkEnd w:id="31"/>
     <w:bookmarkEnd w:id="32"/>
-    <w:bookmarkStart w:id="36" w:name="the-sc13-base-advice-models"/>
+    <w:bookmarkStart w:id="37" w:name="the-sc13-base-advice-models"/>
     <w:p>
       <w:pPr>
         <w:pStyle w:val="Heading1"/>
@@ -1475,7 +1475,7 @@
       </w:r>
     </w:p>
     <w:bookmarkEnd w:id="34"/>
-    <w:bookmarkStart w:id="35" w:name="summary-comparison"/>
+    <w:bookmarkStart w:id="36" w:name="summary-comparison"/>
     <w:p>
       <w:pPr>
         <w:pStyle w:val="Heading2"/>
@@ -1489,615 +1489,12 @@
         <w:pStyle w:val="FirstParagraph"/>
       </w:pPr>
       <w:r>
-        <w:t xml:space="preserve">Table 1 summarizes the main structural differences between the two SC13 advice models.</w:t>
-      </w:r>
-    </w:p>
-    <w:tbl>
-      <w:tblPr>
-        <w:tblStyle w:val="Table"/>
-        <w:tblW w:type="pct" w:w="5000"/>
-        <w:tblLayout w:type="fixed"/>
-        <w:tblLook w:firstRow="1" w:lastRow="0" w:firstColumn="0" w:lastColumn="0" w:noHBand="0" w:noVBand="0" w:val="0020"/>
-      </w:tblPr>
-      <w:tblGrid>
-        <w:gridCol w:w="2640"/>
-        <w:gridCol w:w="2640"/>
-        <w:gridCol w:w="2640"/>
-      </w:tblGrid>
-      <w:tr>
-        <w:trPr>
-          <w:tblHeader w:val="on"/>
-        </w:trPr>
-        <w:tc>
-          <w:tcPr/>
-          <w:p>
-            <w:pPr>
-              <w:pStyle w:val="Compact"/>
-            </w:pPr>
-            <w:r>
-              <w:t xml:space="preserve">Feature</w:t>
-            </w:r>
-          </w:p>
-        </w:tc>
-        <w:tc>
-          <w:tcPr/>
-          <w:p>
-            <w:pPr>
-              <w:pStyle w:val="Compact"/>
-            </w:pPr>
-            <w:r>
-              <w:rPr>
-                <w:rStyle w:val="VerbatimChar"/>
-              </w:rPr>
-              <w:t xml:space="preserve">h1_1.14</w:t>
-            </w:r>
-          </w:p>
-        </w:tc>
-        <w:tc>
-          <w:tcPr/>
-          <w:p>
-            <w:pPr>
-              <w:pStyle w:val="Compact"/>
-            </w:pPr>
-            <w:r>
-              <w:rPr>
-                <w:rStyle w:val="VerbatimChar"/>
-              </w:rPr>
-              <w:t xml:space="preserve">h2_1.14</w:t>
-            </w:r>
-          </w:p>
-        </w:tc>
-      </w:tr>
-      <w:tr>
-        <w:tc>
-          <w:tcPr/>
-          <w:p>
-            <w:pPr>
-              <w:pStyle w:val="Compact"/>
-            </w:pPr>
-            <w:r>
-              <w:t xml:space="preserve">Stock hypothesis</w:t>
-            </w:r>
-          </w:p>
-        </w:tc>
-        <w:tc>
-          <w:tcPr/>
-          <w:p>
-            <w:pPr>
-              <w:pStyle w:val="Compact"/>
-            </w:pPr>
-            <w:r>
-              <w:t xml:space="preserve">Single shared stock</w:t>
-            </w:r>
-          </w:p>
-        </w:tc>
-        <w:tc>
-          <w:tcPr/>
-          <w:p>
-            <w:pPr>
-              <w:pStyle w:val="Compact"/>
-            </w:pPr>
-            <w:r>
-              <w:t xml:space="preserve">Southern stock plus far north stock</w:t>
-            </w:r>
-          </w:p>
-        </w:tc>
-      </w:tr>
-      <w:tr>
-        <w:tc>
-          <w:tcPr/>
-          <w:p>
-            <w:pPr>
-              <w:pStyle w:val="Compact"/>
-            </w:pPr>
-            <w:r>
-              <w:t xml:space="preserve">Number of modeled stocks</w:t>
-            </w:r>
-          </w:p>
-        </w:tc>
-        <w:tc>
-          <w:tcPr/>
-          <w:p>
-            <w:pPr>
-              <w:pStyle w:val="Compact"/>
-            </w:pPr>
-            <w:r>
-              <w:t xml:space="preserve">1</w:t>
-            </w:r>
-          </w:p>
-        </w:tc>
-        <w:tc>
-          <w:tcPr/>
-          <w:p>
-            <w:pPr>
-              <w:pStyle w:val="Compact"/>
-            </w:pPr>
-            <w:r>
-              <w:t xml:space="preserve">2</w:t>
-            </w:r>
-          </w:p>
-        </w:tc>
-      </w:tr>
-      <w:tr>
-        <w:tc>
-          <w:tcPr/>
-          <w:p>
-            <w:pPr>
-              <w:pStyle w:val="Compact"/>
-            </w:pPr>
-            <w:r>
-              <w:t xml:space="preserve">Data file</w:t>
-            </w:r>
-          </w:p>
-        </w:tc>
-        <w:tc>
-          <w:tcPr/>
-          <w:p>
-            <w:pPr>
-              <w:pStyle w:val="Compact"/>
-            </w:pPr>
-            <w:r>
-              <w:rPr>
-                <w:rStyle w:val="VerbatimChar"/>
-              </w:rPr>
-              <w:t xml:space="preserve">assessment/input/1.14.dat</w:t>
-            </w:r>
-          </w:p>
-        </w:tc>
-        <w:tc>
-          <w:tcPr/>
-          <w:p>
-            <w:pPr>
-              <w:pStyle w:val="Compact"/>
-            </w:pPr>
-            <w:r>
-              <w:rPr>
-                <w:rStyle w:val="VerbatimChar"/>
-              </w:rPr>
-              <w:t xml:space="preserve">assessment/input/1.14.dat</w:t>
-            </w:r>
-          </w:p>
-        </w:tc>
-      </w:tr>
-      <w:tr>
-        <w:tc>
-          <w:tcPr/>
-          <w:p>
-            <w:pPr>
-              <w:pStyle w:val="Compact"/>
-            </w:pPr>
-            <w:r>
-              <w:t xml:space="preserve">Natural mortality</w:t>
-            </w:r>
-          </w:p>
-        </w:tc>
-        <w:tc>
-          <w:tcPr/>
-          <w:p>
-            <w:pPr>
-              <w:pStyle w:val="Compact"/>
-            </w:pPr>
-            <w:r>
-              <w:t xml:space="preserve">0.28</w:t>
-            </w:r>
-          </w:p>
-        </w:tc>
-        <w:tc>
-          <w:tcPr/>
-          <w:p>
-            <w:pPr>
-              <w:pStyle w:val="Compact"/>
-            </w:pPr>
-            <w:r>
-              <w:t xml:space="preserve">0.28 and 0.33</w:t>
-            </w:r>
-          </w:p>
-        </w:tc>
-      </w:tr>
-      <w:tr>
-        <w:tc>
-          <w:tcPr/>
-          <w:p>
-            <w:pPr>
-              <w:pStyle w:val="Compact"/>
-            </w:pPr>
-            <w:r>
-              <w:t xml:space="preserve">Maturity schedule</w:t>
-            </w:r>
-          </w:p>
-        </w:tc>
-        <w:tc>
-          <w:tcPr/>
-          <w:p>
-            <w:pPr>
-              <w:pStyle w:val="Compact"/>
-            </w:pPr>
-            <w:r>
-              <w:t xml:space="preserve">One schedule</w:t>
-            </w:r>
-          </w:p>
-        </w:tc>
-        <w:tc>
-          <w:tcPr/>
-          <w:p>
-            <w:pPr>
-              <w:pStyle w:val="Compact"/>
-            </w:pPr>
-            <w:r>
-              <w:t xml:space="preserve">Stock-specific schedules</w:t>
-            </w:r>
-          </w:p>
-        </w:tc>
-      </w:tr>
-      <w:tr>
-        <w:tc>
-          <w:tcPr/>
-          <w:p>
-            <w:pPr>
-              <w:pStyle w:val="Compact"/>
-            </w:pPr>
-            <w:r>
-              <w:t xml:space="preserve">Population weight-at-age</w:t>
-            </w:r>
-          </w:p>
-        </w:tc>
-        <w:tc>
-          <w:tcPr/>
-          <w:p>
-            <w:pPr>
-              <w:pStyle w:val="Compact"/>
-            </w:pPr>
-            <w:r>
-              <w:t xml:space="preserve">One schedule</w:t>
-            </w:r>
-          </w:p>
-        </w:tc>
-        <w:tc>
-          <w:tcPr/>
-          <w:p>
-            <w:pPr>
-              <w:pStyle w:val="Compact"/>
-            </w:pPr>
-            <w:r>
-              <w:t xml:space="preserve">Stock-specific schedules</w:t>
-            </w:r>
-          </w:p>
-        </w:tc>
-      </w:tr>
-      <w:tr>
-        <w:tc>
-          <w:tcPr/>
-          <w:p>
-            <w:pPr>
-              <w:pStyle w:val="Compact"/>
-            </w:pPr>
-            <w:r>
-              <w:t xml:space="preserve">Recruitment structure</w:t>
-            </w:r>
-          </w:p>
-        </w:tc>
-        <w:tc>
-          <w:tcPr/>
-          <w:p>
-            <w:pPr>
-              <w:pStyle w:val="Compact"/>
-            </w:pPr>
-            <w:r>
-              <w:t xml:space="preserve">One curve, 2000-2022</w:t>
-            </w:r>
-          </w:p>
-        </w:tc>
-        <w:tc>
-          <w:tcPr/>
-          <w:p>
-            <w:pPr>
-              <w:pStyle w:val="Compact"/>
-            </w:pPr>
-            <w:r>
-              <w:t xml:space="preserve">Three assignments with a 1999 regime shift</w:t>
-            </w:r>
-          </w:p>
-        </w:tc>
-      </w:tr>
-      <w:tr>
-        <w:tc>
-          <w:tcPr/>
-          <w:p>
-            <w:pPr>
-              <w:pStyle w:val="Compact"/>
-            </w:pPr>
-            <w:r>
-              <w:t xml:space="preserve">Far North selectivity</w:t>
-            </w:r>
-          </w:p>
-        </w:tc>
-        <w:tc>
-          <w:tcPr/>
-          <w:p>
-            <w:pPr>
-              <w:pStyle w:val="Compact"/>
-            </w:pPr>
-            <w:r>
-              <w:t xml:space="preserve">Annual variation from 1981</w:t>
-            </w:r>
-          </w:p>
-        </w:tc>
-        <w:tc>
-          <w:tcPr/>
-          <w:p>
-            <w:pPr>
-              <w:pStyle w:val="Compact"/>
-            </w:pPr>
-            <w:r>
-              <w:t xml:space="preserve">Simplified regime treatment centered on 2002</w:t>
-            </w:r>
-          </w:p>
-        </w:tc>
-      </w:tr>
-      <w:tr>
-        <w:tc>
-          <w:tcPr/>
-          <w:p>
-            <w:pPr>
-              <w:pStyle w:val="Compact"/>
-            </w:pPr>
-            <w:r>
-              <w:t xml:space="preserve">Projection horizon</w:t>
-            </w:r>
-          </w:p>
-        </w:tc>
-        <w:tc>
-          <w:tcPr/>
-          <w:p>
-            <w:pPr>
-              <w:pStyle w:val="Compact"/>
-            </w:pPr>
-            <w:r>
-              <w:t xml:space="preserve">20 years</w:t>
-            </w:r>
-          </w:p>
-        </w:tc>
-        <w:tc>
-          <w:tcPr/>
-          <w:p>
-            <w:pPr>
-              <w:pStyle w:val="Compact"/>
-            </w:pPr>
-            <w:r>
-              <w:t xml:space="preserve">20 years</w:t>
-            </w:r>
-          </w:p>
-        </w:tc>
-      </w:tr>
-    </w:tbl>
-    <w:p>
-      <w:pPr>
-        <w:pStyle w:val="BodyText"/>
-      </w:pPr>
-      <w:r>
-        <w:t xml:space="preserve">The commonality between the two models is therefore greater than their difference in terms of data inputs and overall assessment machinery. The key differences lie in stock allocation, biology, recruitment structure, and the degree of complexity assigned to the northern part of the system.</w:t>
-      </w:r>
-    </w:p>
-    <w:bookmarkEnd w:id="35"/>
-    <w:bookmarkEnd w:id="36"/>
-    <w:bookmarkStart w:id="37" w:name="Xdf21a61c1b4d59d91b08b247089ff271b7fcfe4"/>
-    <w:p>
-      <w:pPr>
-        <w:pStyle w:val="Heading1"/>
-      </w:pPr>
-      <w:r>
-        <w:t xml:space="preserve">5. Why the SC13 Base Model Is Difficult to Transfer Directly into MSE</w:t>
-      </w:r>
-    </w:p>
-    <w:p>
-      <w:pPr>
-        <w:pStyle w:val="FirstParagraph"/>
-      </w:pPr>
-      <w:r>
-        <w:t xml:space="preserve">The July 2025 MSE workshop concluded that the base assessment should first be documented and then simplified before being used as an MSE operating model. The repository materials support that conclusion.</w:t>
-      </w:r>
-    </w:p>
-    <w:p>
-      <w:pPr>
-        <w:pStyle w:val="BodyText"/>
-      </w:pPr>
-      <w:r>
-        <w:t xml:space="preserve">The SC13 base model uses extensive time-varying selectivity. This was increased further in the 2025 assessment to improve fits for the south-central Chile and offshore fleets. Time-varying selectivity may be necessary in annual assessments, but it can make MSE results difficult to interpret because changes in management performance may reflect selectivity specification as much as underlying stock dynamics</w:t>
-      </w:r>
-      <w:r>
-        <w:t xml:space="preserve"> </w:t>
-      </w:r>
-      <w:r>
-        <w:t xml:space="preserve">(Linton &amp; Bence, 2011)</w:t>
-      </w:r>
-      <w:r>
-        <w:t xml:space="preserve">.</w:t>
-      </w:r>
-    </w:p>
-    <w:p>
-      <w:pPr>
-        <w:pStyle w:val="BodyText"/>
-      </w:pPr>
-      <w:r>
-        <w:t xml:space="preserve">In the base model the reference points are dynamic.</w:t>
-      </w:r>
-      <w:r>
-        <w:t xml:space="preserve"> </w:t>
-      </w:r>
-      <w:r>
-        <w:rPr>
-          <w:rStyle w:val="VerbatimChar"/>
-        </w:rPr>
-        <w:t xml:space="preserve">BMSY</w:t>
-      </w:r>
-      <w:r>
-        <w:t xml:space="preserve"> </w:t>
-      </w:r>
-      <w:r>
-        <w:t xml:space="preserve">and</w:t>
-      </w:r>
-      <w:r>
-        <w:t xml:space="preserve"> </w:t>
-      </w:r>
-      <w:r>
-        <w:rPr>
-          <w:rStyle w:val="VerbatimChar"/>
-        </w:rPr>
-        <w:t xml:space="preserve">FMSY</w:t>
-      </w:r>
-      <w:r>
-        <w:t xml:space="preserve"> </w:t>
-      </w:r>
-      <w:r>
-        <w:t xml:space="preserve">typically depend on terminal-year conditions, especially relative catch shares, selectivity-at-age, and weights-at-age.</w:t>
-      </w:r>
-      <w:r>
-        <w:t xml:space="preserve"> </w:t>
-      </w:r>
-      <w:r>
-        <w:t xml:space="preserve">This makes stock status and advice partly conditional on the most recent fitted model state rather than solely on a stable management benchmark.</w:t>
-      </w:r>
-      <w:r>
-        <w:t xml:space="preserve"> </w:t>
-      </w:r>
-      <w:r>
-        <w:t xml:space="preserve">The appropriateness of this as an assessment choice was raised over several meetings and discussions</w:t>
-      </w:r>
-      <w:r>
-        <w:t xml:space="preserve"> </w:t>
-      </w:r>
-      <w:r>
-        <w:t xml:space="preserve">as it complicates the OM design because the benchmark itself changes with the assessment outcome.</w:t>
-      </w:r>
-    </w:p>
-    <w:p>
-      <w:pPr>
-        <w:pStyle w:val="BodyText"/>
-      </w:pPr>
-      <w:r>
-        <w:t xml:space="preserve">Similarly, the projection assumptions differ from the fitting assumptions. The projection scripts</w:t>
-      </w:r>
-      <w:r>
-        <w:t xml:space="preserve"> </w:t>
-      </w:r>
-      <w:r>
-        <w:t xml:space="preserve">show that future calculations rely on fixed selectivity and, in some scenarios, a shortened low-productivity recruitment history. This means that advice is generated from a model in which the fitting phase and the projection phase are intentionally not identical. In MSE, that layering needs to be explicit and deliberate rather than inherited as an assessment convention</w:t>
-      </w:r>
-      <w:r>
-        <w:t xml:space="preserve"> </w:t>
-      </w:r>
-      <w:r>
-        <w:t xml:space="preserve">(Punt et al., 2016; Siple et al., 2021)</w:t>
-      </w:r>
-      <w:r>
-        <w:t xml:space="preserve">.</w:t>
-      </w:r>
-    </w:p>
-    <w:p>
-      <w:pPr>
-        <w:pStyle w:val="BodyText"/>
-      </w:pPr>
-      <w:r>
-        <w:t xml:space="preserve">Additionally stock-structure uncertainty is mixed in with other differences.</w:t>
-      </w:r>
-      <w:r>
-        <w:t xml:space="preserve"> </w:t>
-      </w:r>
-      <w:r>
-        <w:t xml:space="preserve">The contrast between</w:t>
-      </w:r>
-      <w:r>
-        <w:t xml:space="preserve"> </w:t>
-      </w:r>
-      <w:r>
-        <w:rPr>
-          <w:rStyle w:val="VerbatimChar"/>
-        </w:rPr>
-        <w:t xml:space="preserve">h1_1.14</w:t>
-      </w:r>
-      <w:r>
-        <w:t xml:space="preserve"> </w:t>
-      </w:r>
-      <w:r>
-        <w:t xml:space="preserve">and</w:t>
-      </w:r>
-      <w:r>
-        <w:t xml:space="preserve"> </w:t>
-      </w:r>
-      <w:r>
-        <w:rPr>
-          <w:rStyle w:val="VerbatimChar"/>
-        </w:rPr>
-        <w:t xml:space="preserve">h2_1.14</w:t>
-      </w:r>
-      <w:r>
-        <w:t xml:space="preserve"> </w:t>
-      </w:r>
-      <w:r>
-        <w:t xml:space="preserve">is more than one stock versus two stocks as an issue.</w:t>
-      </w:r>
-      <w:r>
-        <w:t xml:space="preserve"> </w:t>
-      </w:r>
-      <w:r>
-        <w:t xml:space="preserve">The northern selectivity structure, different mortality, different maturity, different</w:t>
-      </w:r>
-      <w:r>
-        <w:t xml:space="preserve"> </w:t>
-      </w:r>
-      <w:r>
-        <w:t xml:space="preserve">population weight-at-age, and different recruitment regime treatment affect things between the</w:t>
-      </w:r>
-      <w:r>
-        <w:t xml:space="preserve"> </w:t>
-      </w:r>
-      <w:r>
-        <w:t xml:space="preserve">model configurations. For MSE, it will be helpful to separate uncertainty about stock structure</w:t>
-      </w:r>
-      <w:r>
-        <w:t xml:space="preserve"> </w:t>
-      </w:r>
-      <w:r>
-        <w:t xml:space="preserve">from uncertainty about how model complexity has been allocated within each hypothesis.</w:t>
-      </w:r>
-    </w:p>
-    <w:bookmarkEnd w:id="37"/>
-    <w:bookmarkStart w:id="94" w:name="proposed-simplified-alternatives"/>
-    <w:p>
-      <w:pPr>
-        <w:pStyle w:val="Heading1"/>
-      </w:pPr>
-      <w:r>
-        <w:t xml:space="preserve">6. Proposed Simplified Alternatives</w:t>
-      </w:r>
-    </w:p>
-    <w:p>
-      <w:pPr>
-        <w:pStyle w:val="FirstParagraph"/>
-      </w:pPr>
-      <w:r>
-        <w:t xml:space="preserve">The SC13 base model should therefore be regarded as the reference assessment formulation. Simplified alternatives should be judged according to how much of the essential behavior of the base model they retain while reducing structural complexity that is not strictly necessary for MSE.</w:t>
-      </w:r>
-    </w:p>
-    <w:p>
-      <w:pPr>
-        <w:pStyle w:val="BodyText"/>
-      </w:pPr>
-      <w:r>
-        <w:t xml:space="preserve">A practical first set of alternatives is as follows.</w:t>
-      </w:r>
-    </w:p>
-    <w:p>
-      <w:pPr>
-        <w:pStyle w:val="BodyText"/>
-      </w:pPr>
-      <w:r>
-        <w:t xml:space="preserve">Table</w:t>
-      </w:r>
-      <w:r>
-        <w:t xml:space="preserve"> </w:t>
-      </w:r>
-      <w:hyperlink w:anchor="tbl-simplified-model-summary">
+        <w:t xml:space="preserve">The main structural differences between the two SC13 advice models are summarized in</w:t>
+      </w:r>
+      <w:r>
+        <w:t xml:space="preserve"> </w:t>
+      </w:r>
+      <w:hyperlink w:anchor="tbl-sc13-model-summary">
         <w:r>
           <w:rPr>
             <w:rStyle w:val="Hyperlink"/>
@@ -2106,25 +1503,7 @@
         </w:r>
       </w:hyperlink>
       <w:r>
-        <w:t xml:space="preserve"> </w:t>
-      </w:r>
-      <w:r>
-        <w:t xml:space="preserve">summarizes the main working variants discussed in this section and how each differs from its</w:t>
-      </w:r>
-      <w:r>
-        <w:t xml:space="preserve"> </w:t>
-      </w:r>
-      <w:r>
-        <w:rPr>
-          <w:rStyle w:val="VerbatimChar"/>
-        </w:rPr>
-        <w:t xml:space="preserve">1.14</w:t>
-      </w:r>
-      <w:r>
-        <w:t xml:space="preserve"> </w:t>
-      </w:r>
-      <w:r>
-        <w:t xml:space="preserve">assessment counterpart.</w:t>
+        <w:t xml:space="preserve">.</w:t>
       </w:r>
     </w:p>
     <w:tbl>
@@ -2140,7 +1519,7 @@
       <w:tr>
         <w:tc>
           <w:tcPr/>
-          <w:bookmarkStart w:id="38" w:name="tbl-simplified-model-summary"/>
+          <w:bookmarkStart w:id="35" w:name="tbl-sc13-model-summary"/>
           <w:p>
             <w:pPr>
               <w:jc w:val="center"/>
@@ -2151,7 +1530,819 @@
               <w:pStyle w:val="ImageCaption"/>
             </w:pPr>
             <w:r>
-              <w:t xml:space="preserve">Table 1: Summary of the simplified model variants discussed in Section 6.</w:t>
+              <w:t xml:space="preserve">Table 1: Main structural differences between the SC13 single-stock advice model (</w:t>
+            </w:r>
+            <w:r>
+              <w:rPr>
+                <w:rStyle w:val="VerbatimChar"/>
+              </w:rPr>
+              <w:t xml:space="preserve">h1_1.14</w:t>
+            </w:r>
+            <w:r>
+              <w:t xml:space="preserve">) and two-stock advice model (</w:t>
+            </w:r>
+            <w:r>
+              <w:rPr>
+                <w:rStyle w:val="VerbatimChar"/>
+              </w:rPr>
+              <w:t xml:space="preserve">h2_1.14</w:t>
+            </w:r>
+            <w:r>
+              <w:t xml:space="preserve">).</w:t>
+            </w:r>
+          </w:p>
+          <w:tbl>
+            <w:tblPr>
+              <w:tblStyle w:val="Table"/>
+              <w:tblW w:type="pct" w:w="5000"/>
+              <w:tblLayout w:type="fixed"/>
+              <w:tblLook w:firstRow="1" w:lastRow="0" w:firstColumn="0" w:lastColumn="0" w:noHBand="0" w:noVBand="0" w:val="0020"/>
+            </w:tblPr>
+            <w:tblGrid>
+              <w:gridCol w:w="2020"/>
+              <w:gridCol w:w="2262"/>
+              <w:gridCol w:w="3636"/>
+            </w:tblGrid>
+            <w:tr>
+              <w:trPr>
+                <w:tblHeader w:val="on"/>
+              </w:trPr>
+              <w:tc>
+                <w:tcPr/>
+                <w:p>
+                  <w:pPr>
+                    <w:pStyle w:val="Compact"/>
+                    <w:jc w:val="left"/>
+                    <w:jc w:val="center"/>
+                  </w:pPr>
+                  <w:r>
+                    <w:t xml:space="preserve">Feature</w:t>
+                  </w:r>
+                </w:p>
+              </w:tc>
+              <w:tc>
+                <w:tcPr/>
+                <w:p>
+                  <w:pPr>
+                    <w:pStyle w:val="Compact"/>
+                    <w:jc w:val="left"/>
+                    <w:jc w:val="center"/>
+                  </w:pPr>
+                  <w:r>
+                    <w:t xml:space="preserve">h1_1.14</w:t>
+                  </w:r>
+                </w:p>
+              </w:tc>
+              <w:tc>
+                <w:tcPr/>
+                <w:p>
+                  <w:pPr>
+                    <w:pStyle w:val="Compact"/>
+                    <w:jc w:val="left"/>
+                    <w:jc w:val="center"/>
+                  </w:pPr>
+                  <w:r>
+                    <w:t xml:space="preserve">h2_1.14</w:t>
+                  </w:r>
+                </w:p>
+              </w:tc>
+            </w:tr>
+            <w:tr>
+              <w:tc>
+                <w:tcPr/>
+                <w:p>
+                  <w:pPr>
+                    <w:pStyle w:val="Compact"/>
+                    <w:jc w:val="left"/>
+                    <w:jc w:val="center"/>
+                  </w:pPr>
+                  <w:r>
+                    <w:t xml:space="preserve">Stock hypothesis</w:t>
+                  </w:r>
+                </w:p>
+              </w:tc>
+              <w:tc>
+                <w:tcPr/>
+                <w:p>
+                  <w:pPr>
+                    <w:pStyle w:val="Compact"/>
+                    <w:jc w:val="left"/>
+                    <w:jc w:val="center"/>
+                  </w:pPr>
+                  <w:r>
+                    <w:t xml:space="preserve">Single shared stock</w:t>
+                  </w:r>
+                </w:p>
+              </w:tc>
+              <w:tc>
+                <w:tcPr/>
+                <w:p>
+                  <w:pPr>
+                    <w:pStyle w:val="Compact"/>
+                    <w:jc w:val="left"/>
+                    <w:jc w:val="center"/>
+                  </w:pPr>
+                  <w:r>
+                    <w:t xml:space="preserve">Southern stock plus far north stock</w:t>
+                  </w:r>
+                </w:p>
+              </w:tc>
+            </w:tr>
+            <w:tr>
+              <w:tc>
+                <w:tcPr/>
+                <w:p>
+                  <w:pPr>
+                    <w:pStyle w:val="Compact"/>
+                    <w:jc w:val="left"/>
+                    <w:jc w:val="center"/>
+                  </w:pPr>
+                  <w:r>
+                    <w:t xml:space="preserve">Number of modeled stocks</w:t>
+                  </w:r>
+                </w:p>
+              </w:tc>
+              <w:tc>
+                <w:tcPr/>
+                <w:p>
+                  <w:pPr>
+                    <w:pStyle w:val="Compact"/>
+                    <w:jc w:val="left"/>
+                    <w:jc w:val="center"/>
+                  </w:pPr>
+                  <w:r>
+                    <w:t xml:space="preserve">1</w:t>
+                  </w:r>
+                </w:p>
+              </w:tc>
+              <w:tc>
+                <w:tcPr/>
+                <w:p>
+                  <w:pPr>
+                    <w:pStyle w:val="Compact"/>
+                    <w:jc w:val="left"/>
+                    <w:jc w:val="center"/>
+                  </w:pPr>
+                  <w:r>
+                    <w:t xml:space="preserve">2</w:t>
+                  </w:r>
+                </w:p>
+              </w:tc>
+            </w:tr>
+            <w:tr>
+              <w:tc>
+                <w:tcPr/>
+                <w:p>
+                  <w:pPr>
+                    <w:pStyle w:val="Compact"/>
+                    <w:jc w:val="left"/>
+                    <w:jc w:val="center"/>
+                  </w:pPr>
+                  <w:r>
+                    <w:t xml:space="preserve">Data file</w:t>
+                  </w:r>
+                </w:p>
+              </w:tc>
+              <w:tc>
+                <w:tcPr/>
+                <w:p>
+                  <w:pPr>
+                    <w:pStyle w:val="Compact"/>
+                    <w:jc w:val="left"/>
+                    <w:jc w:val="center"/>
+                  </w:pPr>
+                  <w:r>
+                    <w:rPr>
+                      <w:rStyle w:val="VerbatimChar"/>
+                    </w:rPr>
+                    <w:t xml:space="preserve">assessment/input/1.14.dat</w:t>
+                  </w:r>
+                </w:p>
+              </w:tc>
+              <w:tc>
+                <w:tcPr/>
+                <w:p>
+                  <w:pPr>
+                    <w:pStyle w:val="Compact"/>
+                    <w:jc w:val="left"/>
+                    <w:jc w:val="center"/>
+                  </w:pPr>
+                  <w:r>
+                    <w:rPr>
+                      <w:rStyle w:val="VerbatimChar"/>
+                    </w:rPr>
+                    <w:t xml:space="preserve">assessment/input/1.14.dat</w:t>
+                  </w:r>
+                </w:p>
+              </w:tc>
+            </w:tr>
+            <w:tr>
+              <w:tc>
+                <w:tcPr/>
+                <w:p>
+                  <w:pPr>
+                    <w:pStyle w:val="Compact"/>
+                    <w:jc w:val="left"/>
+                    <w:jc w:val="center"/>
+                  </w:pPr>
+                  <w:r>
+                    <w:t xml:space="preserve">Natural mortality</w:t>
+                  </w:r>
+                </w:p>
+              </w:tc>
+              <w:tc>
+                <w:tcPr/>
+                <w:p>
+                  <w:pPr>
+                    <w:pStyle w:val="Compact"/>
+                    <w:jc w:val="left"/>
+                    <w:jc w:val="center"/>
+                  </w:pPr>
+                  <w:r>
+                    <w:t xml:space="preserve">0.28</w:t>
+                  </w:r>
+                </w:p>
+              </w:tc>
+              <w:tc>
+                <w:tcPr/>
+                <w:p>
+                  <w:pPr>
+                    <w:pStyle w:val="Compact"/>
+                    <w:jc w:val="left"/>
+                    <w:jc w:val="center"/>
+                  </w:pPr>
+                  <w:r>
+                    <w:t xml:space="preserve">0.28 and 0.33</w:t>
+                  </w:r>
+                </w:p>
+              </w:tc>
+            </w:tr>
+            <w:tr>
+              <w:tc>
+                <w:tcPr/>
+                <w:p>
+                  <w:pPr>
+                    <w:pStyle w:val="Compact"/>
+                    <w:jc w:val="left"/>
+                    <w:jc w:val="center"/>
+                  </w:pPr>
+                  <w:r>
+                    <w:t xml:space="preserve">Maturity schedule</w:t>
+                  </w:r>
+                </w:p>
+              </w:tc>
+              <w:tc>
+                <w:tcPr/>
+                <w:p>
+                  <w:pPr>
+                    <w:pStyle w:val="Compact"/>
+                    <w:jc w:val="left"/>
+                    <w:jc w:val="center"/>
+                  </w:pPr>
+                  <w:r>
+                    <w:t xml:space="preserve">One schedule</w:t>
+                  </w:r>
+                </w:p>
+              </w:tc>
+              <w:tc>
+                <w:tcPr/>
+                <w:p>
+                  <w:pPr>
+                    <w:pStyle w:val="Compact"/>
+                    <w:jc w:val="left"/>
+                    <w:jc w:val="center"/>
+                  </w:pPr>
+                  <w:r>
+                    <w:t xml:space="preserve">Stock-specific schedules</w:t>
+                  </w:r>
+                </w:p>
+              </w:tc>
+            </w:tr>
+            <w:tr>
+              <w:tc>
+                <w:tcPr/>
+                <w:p>
+                  <w:pPr>
+                    <w:pStyle w:val="Compact"/>
+                    <w:jc w:val="left"/>
+                    <w:jc w:val="center"/>
+                  </w:pPr>
+                  <w:r>
+                    <w:t xml:space="preserve">Population weight-at-age</w:t>
+                  </w:r>
+                </w:p>
+              </w:tc>
+              <w:tc>
+                <w:tcPr/>
+                <w:p>
+                  <w:pPr>
+                    <w:pStyle w:val="Compact"/>
+                    <w:jc w:val="left"/>
+                    <w:jc w:val="center"/>
+                  </w:pPr>
+                  <w:r>
+                    <w:t xml:space="preserve">One schedule</w:t>
+                  </w:r>
+                </w:p>
+              </w:tc>
+              <w:tc>
+                <w:tcPr/>
+                <w:p>
+                  <w:pPr>
+                    <w:pStyle w:val="Compact"/>
+                    <w:jc w:val="left"/>
+                    <w:jc w:val="center"/>
+                  </w:pPr>
+                  <w:r>
+                    <w:t xml:space="preserve">Stock-specific schedules</w:t>
+                  </w:r>
+                </w:p>
+              </w:tc>
+            </w:tr>
+            <w:tr>
+              <w:tc>
+                <w:tcPr/>
+                <w:p>
+                  <w:pPr>
+                    <w:pStyle w:val="Compact"/>
+                    <w:jc w:val="left"/>
+                    <w:jc w:val="center"/>
+                  </w:pPr>
+                  <w:r>
+                    <w:t xml:space="preserve">Recruitment structure</w:t>
+                  </w:r>
+                </w:p>
+              </w:tc>
+              <w:tc>
+                <w:tcPr/>
+                <w:p>
+                  <w:pPr>
+                    <w:pStyle w:val="Compact"/>
+                    <w:jc w:val="left"/>
+                    <w:jc w:val="center"/>
+                  </w:pPr>
+                  <w:r>
+                    <w:t xml:space="preserve">One curve, 2000-2022</w:t>
+                  </w:r>
+                </w:p>
+              </w:tc>
+              <w:tc>
+                <w:tcPr/>
+                <w:p>
+                  <w:pPr>
+                    <w:pStyle w:val="Compact"/>
+                    <w:jc w:val="left"/>
+                    <w:jc w:val="center"/>
+                  </w:pPr>
+                  <w:r>
+                    <w:t xml:space="preserve">Three assignments with a 1999 regime shift</w:t>
+                  </w:r>
+                </w:p>
+              </w:tc>
+            </w:tr>
+            <w:tr>
+              <w:tc>
+                <w:tcPr/>
+                <w:p>
+                  <w:pPr>
+                    <w:pStyle w:val="Compact"/>
+                    <w:jc w:val="left"/>
+                    <w:jc w:val="center"/>
+                  </w:pPr>
+                  <w:r>
+                    <w:t xml:space="preserve">Far North selectivity</w:t>
+                  </w:r>
+                </w:p>
+              </w:tc>
+              <w:tc>
+                <w:tcPr/>
+                <w:p>
+                  <w:pPr>
+                    <w:pStyle w:val="Compact"/>
+                    <w:jc w:val="left"/>
+                    <w:jc w:val="center"/>
+                  </w:pPr>
+                  <w:r>
+                    <w:t xml:space="preserve">Annual variation from 1981</w:t>
+                  </w:r>
+                </w:p>
+              </w:tc>
+              <w:tc>
+                <w:tcPr/>
+                <w:p>
+                  <w:pPr>
+                    <w:pStyle w:val="Compact"/>
+                    <w:jc w:val="left"/>
+                    <w:jc w:val="center"/>
+                  </w:pPr>
+                  <w:r>
+                    <w:t xml:space="preserve">Simplified regime treatment centered on 2002</w:t>
+                  </w:r>
+                </w:p>
+              </w:tc>
+            </w:tr>
+            <w:tr>
+              <w:tc>
+                <w:tcPr/>
+                <w:p>
+                  <w:pPr>
+                    <w:pStyle w:val="Compact"/>
+                    <w:jc w:val="left"/>
+                    <w:jc w:val="center"/>
+                  </w:pPr>
+                  <w:r>
+                    <w:t xml:space="preserve">Projection horizon</w:t>
+                  </w:r>
+                </w:p>
+              </w:tc>
+              <w:tc>
+                <w:tcPr/>
+                <w:p>
+                  <w:pPr>
+                    <w:pStyle w:val="Compact"/>
+                    <w:jc w:val="left"/>
+                    <w:jc w:val="center"/>
+                  </w:pPr>
+                  <w:r>
+                    <w:t xml:space="preserve">20 years</w:t>
+                  </w:r>
+                </w:p>
+              </w:tc>
+              <w:tc>
+                <w:tcPr/>
+                <w:p>
+                  <w:pPr>
+                    <w:pStyle w:val="Compact"/>
+                    <w:jc w:val="left"/>
+                    <w:jc w:val="center"/>
+                  </w:pPr>
+                  <w:r>
+                    <w:t xml:space="preserve">20 years</w:t>
+                  </w:r>
+                </w:p>
+              </w:tc>
+            </w:tr>
+          </w:tbl>
+          <w:bookmarkEnd w:id="35"/>
+          <w:p/>
+        </w:tc>
+      </w:tr>
+    </w:tbl>
+    <w:p>
+      <w:pPr>
+        <w:pStyle w:val="BodyText"/>
+      </w:pPr>
+      <w:r>
+        <w:t xml:space="preserve">The commonality between the two models is therefore greater than their difference in terms of data inputs and overall assessment machinery. The key differences lie in stock allocation, biology, recruitment structure, and the degree of complexity assigned to the northern part of the system.</w:t>
+      </w:r>
+    </w:p>
+    <w:bookmarkEnd w:id="36"/>
+    <w:bookmarkEnd w:id="37"/>
+    <w:bookmarkStart w:id="38" w:name="base-model-considerations"/>
+    <w:p>
+      <w:pPr>
+        <w:pStyle w:val="Heading1"/>
+      </w:pPr>
+      <w:r>
+        <w:t xml:space="preserve">5. Base model considerations</w:t>
+      </w:r>
+    </w:p>
+    <w:p>
+      <w:pPr>
+        <w:pStyle w:val="FirstParagraph"/>
+      </w:pPr>
+      <w:r>
+        <w:t xml:space="preserve">The July 2025 MSE workshop concluded that the base assessment should probably</w:t>
+      </w:r>
+      <w:r>
+        <w:t xml:space="preserve"> </w:t>
+      </w:r>
+      <w:r>
+        <w:t xml:space="preserve">be more clearly documented and then perhaps simplified for use as an</w:t>
+      </w:r>
+      <w:r>
+        <w:t xml:space="preserve"> </w:t>
+      </w:r>
+      <w:r>
+        <w:t xml:space="preserve">MSE operating model.</w:t>
+      </w:r>
+    </w:p>
+    <w:p>
+      <w:pPr>
+        <w:pStyle w:val="BodyText"/>
+      </w:pPr>
+      <w:r>
+        <w:t xml:space="preserve">The SC13 base model uses extensive time-varying selectivity. This practice continued</w:t>
+      </w:r>
+      <w:r>
+        <w:t xml:space="preserve"> </w:t>
+      </w:r>
+      <w:r>
+        <w:t xml:space="preserve">in the 2025 assessment to improve fits for the south-central Chile and offshore fleets.</w:t>
+      </w:r>
+      <w:r>
+        <w:t xml:space="preserve"> </w:t>
+      </w:r>
+      <w:r>
+        <w:t xml:space="preserve">Time-varying selectivity may be necessary in annual assessments, but it can make MSE</w:t>
+      </w:r>
+      <w:r>
+        <w:t xml:space="preserve"> </w:t>
+      </w:r>
+      <w:r>
+        <w:t xml:space="preserve">results difficult to interpret because changes in management performance may reflect</w:t>
+      </w:r>
+      <w:r>
+        <w:t xml:space="preserve"> </w:t>
+      </w:r>
+      <w:r>
+        <w:t xml:space="preserve">selectivity specification as much as underlying stock dynamics</w:t>
+      </w:r>
+      <w:r>
+        <w:t xml:space="preserve"> </w:t>
+      </w:r>
+      <w:r>
+        <w:t xml:space="preserve">(Linton &amp; Bence, 2011)</w:t>
+      </w:r>
+      <w:r>
+        <w:t xml:space="preserve">.</w:t>
+      </w:r>
+    </w:p>
+    <w:p>
+      <w:pPr>
+        <w:pStyle w:val="BodyText"/>
+      </w:pPr>
+      <w:r>
+        <w:t xml:space="preserve">In the base model the reference points are dynamic.</w:t>
+      </w:r>
+      <w:r>
+        <w:t xml:space="preserve"> </w:t>
+      </w:r>
+      <w:r>
+        <w:rPr>
+          <w:rStyle w:val="VerbatimChar"/>
+        </w:rPr>
+        <w:t xml:space="preserve">BMSY</w:t>
+      </w:r>
+      <w:r>
+        <w:t xml:space="preserve"> </w:t>
+      </w:r>
+      <w:r>
+        <w:t xml:space="preserve">and</w:t>
+      </w:r>
+      <w:r>
+        <w:t xml:space="preserve"> </w:t>
+      </w:r>
+      <w:r>
+        <w:rPr>
+          <w:rStyle w:val="VerbatimChar"/>
+        </w:rPr>
+        <w:t xml:space="preserve">FMSY</w:t>
+      </w:r>
+      <w:r>
+        <w:t xml:space="preserve"> </w:t>
+      </w:r>
+      <w:r>
+        <w:t xml:space="preserve">typically</w:t>
+      </w:r>
+      <w:r>
+        <w:t xml:space="preserve"> </w:t>
+      </w:r>
+      <w:r>
+        <w:t xml:space="preserve">depend on terminal-year conditions, especially relative catch shares,</w:t>
+      </w:r>
+      <w:r>
+        <w:t xml:space="preserve"> </w:t>
+      </w:r>
+      <w:r>
+        <w:t xml:space="preserve">selectivity-at-age, and weights-at-age.</w:t>
+      </w:r>
+      <w:r>
+        <w:t xml:space="preserve"> </w:t>
+      </w:r>
+      <w:r>
+        <w:t xml:space="preserve">This makes stock status and advice partly conditional on the most recent fitted</w:t>
+      </w:r>
+      <w:r>
+        <w:t xml:space="preserve"> </w:t>
+      </w:r>
+      <w:r>
+        <w:t xml:space="preserve">model state rather than solely on a stable management benchmark.</w:t>
+      </w:r>
+      <w:r>
+        <w:t xml:space="preserve"> </w:t>
+      </w:r>
+      <w:r>
+        <w:t xml:space="preserve">The appropriateness of this as an assessment choice was raised over several meetings and discussions</w:t>
+      </w:r>
+      <w:r>
+        <w:t xml:space="preserve"> </w:t>
+      </w:r>
+      <w:r>
+        <w:t xml:space="preserve">as it complicates the OM design because the benchmark itself changes with the assessment outcome.</w:t>
+      </w:r>
+    </w:p>
+    <w:p>
+      <w:pPr>
+        <w:pStyle w:val="BodyText"/>
+      </w:pPr>
+      <w:r>
+        <w:t xml:space="preserve">Similarly, the projection assumptions differ from the fitting assumptions. The projection scripts</w:t>
+      </w:r>
+      <w:r>
+        <w:t xml:space="preserve"> </w:t>
+      </w:r>
+      <w:r>
+        <w:t xml:space="preserve">show that future calculations rely on fixed selectivity and, in some scenarios, a</w:t>
+      </w:r>
+      <w:r>
+        <w:t xml:space="preserve"> </w:t>
+      </w:r>
+      <w:r>
+        <w:t xml:space="preserve">shortened low-productivity recruitment history. This means that advice is generated</w:t>
+      </w:r>
+      <w:r>
+        <w:t xml:space="preserve"> </w:t>
+      </w:r>
+      <w:r>
+        <w:t xml:space="preserve">from a model in which the fitting phase and the projection phase are intentionally</w:t>
+      </w:r>
+      <w:r>
+        <w:t xml:space="preserve"> </w:t>
+      </w:r>
+      <w:r>
+        <w:t xml:space="preserve">different. In MSE, that layering needs to be explicit and deliberate rather than</w:t>
+      </w:r>
+      <w:r>
+        <w:t xml:space="preserve"> </w:t>
+      </w:r>
+      <w:r>
+        <w:t xml:space="preserve">inherited as an assessment convention</w:t>
+      </w:r>
+      <w:r>
+        <w:t xml:space="preserve"> </w:t>
+      </w:r>
+      <w:r>
+        <w:t xml:space="preserve">(Punt et al., 2016; Siple et al., 2021)</w:t>
+      </w:r>
+      <w:r>
+        <w:t xml:space="preserve">.</w:t>
+      </w:r>
+    </w:p>
+    <w:p>
+      <w:pPr>
+        <w:pStyle w:val="BodyText"/>
+      </w:pPr>
+      <w:r>
+        <w:t xml:space="preserve">Additionally stock-structure uncertainty is mixed in with other differences.</w:t>
+      </w:r>
+      <w:r>
+        <w:t xml:space="preserve"> </w:t>
+      </w:r>
+      <w:r>
+        <w:t xml:space="preserve">The contrast between</w:t>
+      </w:r>
+      <w:r>
+        <w:t xml:space="preserve"> </w:t>
+      </w:r>
+      <w:r>
+        <w:rPr>
+          <w:rStyle w:val="VerbatimChar"/>
+        </w:rPr>
+        <w:t xml:space="preserve">h1_1.14</w:t>
+      </w:r>
+      <w:r>
+        <w:t xml:space="preserve"> </w:t>
+      </w:r>
+      <w:r>
+        <w:t xml:space="preserve">and</w:t>
+      </w:r>
+      <w:r>
+        <w:t xml:space="preserve"> </w:t>
+      </w:r>
+      <w:r>
+        <w:rPr>
+          <w:rStyle w:val="VerbatimChar"/>
+        </w:rPr>
+        <w:t xml:space="preserve">h2_1.14</w:t>
+      </w:r>
+      <w:r>
+        <w:t xml:space="preserve"> </w:t>
+      </w:r>
+      <w:r>
+        <w:t xml:space="preserve">is more than one stock versus two</w:t>
+      </w:r>
+      <w:r>
+        <w:t xml:space="preserve"> </w:t>
+      </w:r>
+      <w:r>
+        <w:t xml:space="preserve">stocks as an issue.</w:t>
+      </w:r>
+      <w:r>
+        <w:t xml:space="preserve"> </w:t>
+      </w:r>
+      <w:r>
+        <w:t xml:space="preserve">The northern selectivity structure, different mortality, different maturity, different</w:t>
+      </w:r>
+      <w:r>
+        <w:t xml:space="preserve"> </w:t>
+      </w:r>
+      <w:r>
+        <w:t xml:space="preserve">population weight-at-age, and different recruitment regime treatment affect things between the</w:t>
+      </w:r>
+      <w:r>
+        <w:t xml:space="preserve"> </w:t>
+      </w:r>
+      <w:r>
+        <w:t xml:space="preserve">model configurations. For MSE, it will be helpful to separate uncertainty about stock structure</w:t>
+      </w:r>
+      <w:r>
+        <w:t xml:space="preserve"> </w:t>
+      </w:r>
+      <w:r>
+        <w:t xml:space="preserve">from uncertainty about how model complexity has been allocated within each hypothesis.</w:t>
+      </w:r>
+    </w:p>
+    <w:bookmarkEnd w:id="38"/>
+    <w:bookmarkStart w:id="99" w:name="proposed-simplified-alternatives"/>
+    <w:p>
+      <w:pPr>
+        <w:pStyle w:val="Heading1"/>
+      </w:pPr>
+      <w:r>
+        <w:t xml:space="preserve">6. Proposed Simplified Alternatives</w:t>
+      </w:r>
+    </w:p>
+    <w:p>
+      <w:pPr>
+        <w:pStyle w:val="FirstParagraph"/>
+      </w:pPr>
+      <w:r>
+        <w:t xml:space="preserve">The SC13 base model should be treated as the reference assessment formulation. Simplified alternatives should therefore be judged by how much of the essential behavior of the base model they retain while removing structural complexity that is not needed for MSE.</w:t>
+      </w:r>
+    </w:p>
+    <w:p>
+      <w:pPr>
+        <w:pStyle w:val="BodyText"/>
+      </w:pPr>
+      <w:r>
+        <w:t xml:space="preserve">A practical first working set of alternatives is summarized in</w:t>
+      </w:r>
+      <w:r>
+        <w:t xml:space="preserve"> </w:t>
+      </w:r>
+      <w:hyperlink w:anchor="tbl-simplified-model-summary">
+        <w:r>
+          <w:rPr>
+            <w:rStyle w:val="Hyperlink"/>
+          </w:rPr>
+          <w:t xml:space="preserve">Table 2</w:t>
+        </w:r>
+      </w:hyperlink>
+      <w:r>
+        <w:t xml:space="preserve">. The table highlights how each variant differs from its relevant</w:t>
+      </w:r>
+      <w:r>
+        <w:t xml:space="preserve"> </w:t>
+      </w:r>
+      <w:r>
+        <w:rPr>
+          <w:rStyle w:val="VerbatimChar"/>
+        </w:rPr>
+        <w:t xml:space="preserve">1.14</w:t>
+      </w:r>
+      <w:r>
+        <w:t xml:space="preserve"> </w:t>
+      </w:r>
+      <w:r>
+        <w:t xml:space="preserve">assessment counterpart in data treatment, selectivity treatment, and intended purpose.</w:t>
+      </w:r>
+    </w:p>
+    <w:tbl>
+      <w:tblPr>
+        <w:tblStyle w:val="Table"/>
+        <w:tblW w:type="pct" w:w="5000"/>
+        <w:tblLayout w:type="fixed"/>
+        <w:tblLook w:firstRow="0" w:lastRow="0" w:firstColumn="0" w:lastColumn="0" w:noHBand="0" w:noVBand="0" w:val="0000"/>
+      </w:tblPr>
+      <w:tblGrid>
+        <w:gridCol w:w="7920"/>
+      </w:tblGrid>
+      <w:tr>
+        <w:tc>
+          <w:tcPr/>
+          <w:bookmarkStart w:id="39" w:name="tbl-simplified-model-summary"/>
+          <w:p>
+            <w:pPr>
+              <w:jc w:val="center"/>
+            </w:pPr>
+            <w:pPr>
+              <w:jc w:val="left"/>
+              <w:spacing w:before="200"/>
+              <w:pStyle w:val="ImageCaption"/>
+            </w:pPr>
+            <w:r>
+              <w:t xml:space="preserve">Table 2: Summary of the simplified model variants discussed in Section 6.</w:t>
             </w:r>
           </w:p>
           <w:tbl>
@@ -2597,7 +2788,7 @@
               </w:tc>
             </w:tr>
           </w:tbl>
-          <w:bookmarkEnd w:id="38"/>
+          <w:bookmarkEnd w:id="39"/>
           <w:p/>
         </w:tc>
       </w:tr>
@@ -2607,7 +2798,7 @@
         <w:pStyle w:val="BodyText"/>
       </w:pPr>
       <w:r>
-        <w:t xml:space="preserve">No separate</w:t>
+        <w:t xml:space="preserve">The</w:t>
       </w:r>
       <w:r>
         <w:t xml:space="preserve"> </w:t>
@@ -2622,7 +2813,13 @@
         <w:t xml:space="preserve"> </w:t>
       </w:r>
       <w:r>
-        <w:t xml:space="preserve">label is used in the current working set. Instead,</w:t>
+        <w:t xml:space="preserve">serves as the two-stock reduced-index analogue,</w:t>
+      </w:r>
+      <w:r>
+        <w:br/>
+      </w:r>
+      <w:r>
+        <w:t xml:space="preserve">while</w:t>
       </w:r>
       <w:r>
         <w:t xml:space="preserve"> </w:t>
@@ -2637,10 +2834,10 @@
         <w:t xml:space="preserve"> </w:t>
       </w:r>
       <w:r>
-        <w:t xml:space="preserve">serves as the two-stock reduced-index analogue while also carrying the harmonized Far North selectivity treatment.</w:t>
-      </w:r>
-    </w:p>
-    <w:bookmarkStart w:id="50" w:name="reduced-number-of-indices"/>
+        <w:t xml:space="preserve">frames the harmonized Far North selectivity treatment.</w:t>
+      </w:r>
+    </w:p>
+    <w:bookmarkStart w:id="51" w:name="reduced-number-of-indices"/>
     <w:p>
       <w:pPr>
         <w:pStyle w:val="Heading2"/>
@@ -2843,7 +3040,7 @@
       <w:tr>
         <w:tc>
           <w:tcPr/>
-          <w:bookmarkStart w:id="42" w:name="fig-reduced-indices-ssb"/>
+          <w:bookmarkStart w:id="43" w:name="fig-reduced-indices-ssb"/>
           <w:p>
             <w:pPr>
               <w:pStyle w:val="Compact"/>
@@ -2854,18 +3051,18 @@
                 <wp:inline>
                   <wp:extent cx="5334000" cy="3194843"/>
                   <wp:effectExtent b="0" l="0" r="0" t="0"/>
-                  <wp:docPr descr="" title="" id="40" name="Picture"/>
+                  <wp:docPr descr="" title="" id="41" name="Picture"/>
                   <a:graphic>
                     <a:graphicData uri="http://schemas.openxmlformats.org/drawingml/2006/picture">
                       <pic:pic>
                         <pic:nvPicPr>
-                          <pic:cNvPr descr="JM-WP-BM-01_files/figure-docx/fig-reduced-indices-ssb-1.png" id="41" name="Picture"/>
+                          <pic:cNvPr descr="JM-WP-BM-01_files/figure-docx/fig-reduced-indices-ssb-1.png" id="42" name="Picture"/>
                           <pic:cNvPicPr>
                             <a:picLocks noChangeArrowheads="1" noChangeAspect="1"/>
                           </pic:cNvPicPr>
                         </pic:nvPicPr>
                         <pic:blipFill>
-                          <a:blip r:embed="rId39"/>
+                          <a:blip r:embed="rId40"/>
                           <a:stretch>
                             <a:fillRect/>
                           </a:stretch>
@@ -2923,7 +3120,7 @@
               <w:t xml:space="preserve">).</w:t>
             </w:r>
           </w:p>
-          <w:bookmarkEnd w:id="42"/>
+          <w:bookmarkEnd w:id="43"/>
         </w:tc>
       </w:tr>
     </w:tbl>
@@ -2940,7 +3137,7 @@
       <w:tr>
         <w:tc>
           <w:tcPr/>
-          <w:bookmarkStart w:id="46" w:name="fig-reduced-indices-rec"/>
+          <w:bookmarkStart w:id="47" w:name="fig-reduced-indices-rec"/>
           <w:p>
             <w:pPr>
               <w:pStyle w:val="Compact"/>
@@ -2951,18 +3148,18 @@
                 <wp:inline>
                   <wp:extent cx="5334000" cy="3194843"/>
                   <wp:effectExtent b="0" l="0" r="0" t="0"/>
-                  <wp:docPr descr="" title="" id="44" name="Picture"/>
+                  <wp:docPr descr="" title="" id="45" name="Picture"/>
                   <a:graphic>
                     <a:graphicData uri="http://schemas.openxmlformats.org/drawingml/2006/picture">
                       <pic:pic>
                         <pic:nvPicPr>
-                          <pic:cNvPr descr="JM-WP-BM-01_files/figure-docx/fig-reduced-indices-rec-1.png" id="45" name="Picture"/>
+                          <pic:cNvPr descr="JM-WP-BM-01_files/figure-docx/fig-reduced-indices-rec-1.png" id="46" name="Picture"/>
                           <pic:cNvPicPr>
                             <a:picLocks noChangeArrowheads="1" noChangeAspect="1"/>
                           </pic:cNvPicPr>
                         </pic:nvPicPr>
                         <pic:blipFill>
-                          <a:blip r:embed="rId43"/>
+                          <a:blip r:embed="rId44"/>
                           <a:stretch>
                             <a:fillRect/>
                           </a:stretch>
@@ -3020,7 +3217,7 @@
               <w:t xml:space="preserve">).</w:t>
             </w:r>
           </w:p>
-          <w:bookmarkEnd w:id="46"/>
+          <w:bookmarkEnd w:id="47"/>
         </w:tc>
       </w:tr>
     </w:tbl>
@@ -3170,18 +3367,18 @@
                 <wp:inline>
                   <wp:extent cx="152400" cy="152400"/>
                   <wp:effectExtent b="0" l="0" r="0" t="0"/>
-                  <wp:docPr descr="" title="" id="48" name="Picture"/>
+                  <wp:docPr descr="" title="" id="49" name="Picture"/>
                   <a:graphic>
                     <a:graphicData uri="http://schemas.openxmlformats.org/drawingml/2006/picture">
                       <pic:pic>
                         <pic:nvPicPr>
-                          <pic:cNvPr descr="/Applications/quarto/share/formats/docx/note.png" id="49" name="Picture"/>
+                          <pic:cNvPr descr="/Applications/quarto/share/formats/docx/note.png" id="50" name="Picture"/>
                           <pic:cNvPicPr>
                             <a:picLocks noChangeArrowheads="1" noChangeAspect="1"/>
                           </pic:cNvPicPr>
                         </pic:nvPicPr>
                         <pic:blipFill>
-                          <a:blip r:embed="rId47"/>
+                          <a:blip r:embed="rId48"/>
                           <a:stretch>
                             <a:fillRect/>
                           </a:stretch>
@@ -3289,8 +3486,8 @@
         <w:t xml:space="preserve">.</w:t>
       </w:r>
     </w:p>
-    <w:bookmarkEnd w:id="50"/>
-    <w:bookmarkStart w:id="83" w:name="simplified-selectivity-alternatives"/>
+    <w:bookmarkEnd w:id="51"/>
+    <w:bookmarkStart w:id="84" w:name="simplified-selectivity-alternatives"/>
     <w:p>
       <w:pPr>
         <w:pStyle w:val="Heading2"/>
@@ -3331,7 +3528,7 @@
         <w:t xml:space="preserve">The first dimension is the selectivity structure used during model fitting. One option is to replace long annual selectivity histories with a limited set of blocks for each fleet — for example a historical block, a modern block, and a current block. This preserves the broad evidence that fishery selectivity has changed over time while avoiding dozens of annual deviations that are difficult to interpret and project forward. Block-based selectivity is recommended as the primary simplified alternative for the MSE operating models. It provides an interpretable and tractable representation of selectivity change without the parameter proliferation of annual non-parametric estimation.</w:t>
       </w:r>
     </w:p>
-    <w:bookmarkStart w:id="82" w:name="X518721fe55853f821d30f8adb270621fb439ada"/>
+    <w:bookmarkStart w:id="83" w:name="X518721fe55853f821d30f8adb270621fb439ada"/>
     <w:p>
       <w:pPr>
         <w:pStyle w:val="Heading3"/>
@@ -3348,7 +3545,7 @@
         <w:t xml:space="preserve">Using the age-composition tables (Annex Tables 3-5) and the selectivity heatmaps (Annex Figures 37-38), it is possible to define time blocks where the age pattern, as a proxy for selectivity-at-age, is broadly stable for each fleet. The reduction below follows the main regime shifts visible in the data and is broadly consistent with how the current model already treats selectivity in some components.</w:t>
       </w:r>
     </w:p>
-    <w:bookmarkStart w:id="51" w:name="fleet-1-north-chile"/>
+    <w:bookmarkStart w:id="52" w:name="fleet-1-north-chile"/>
     <w:p>
       <w:pPr>
         <w:pStyle w:val="Heading4"/>
@@ -3449,8 +3646,8 @@
         <w:t xml:space="preserve">The main structural breaks for this fleet are around 1987 and 2016, which is also consistent with the increase in mean age shown in Annex Figure 31.</w:t>
       </w:r>
     </w:p>
-    <w:bookmarkEnd w:id="51"/>
-    <w:bookmarkStart w:id="52" w:name="fleet-2-south-central-chile"/>
+    <w:bookmarkEnd w:id="52"/>
+    <w:bookmarkStart w:id="53" w:name="fleet-2-south-central-chile"/>
     <w:p>
       <w:pPr>
         <w:pStyle w:val="Heading4"/>
@@ -3551,8 +3748,8 @@
         <w:t xml:space="preserve">These blocks are consistent with the gradual aging trend noted elsewhere in the report, including the increase in mean age over the last decade.</w:t>
       </w:r>
     </w:p>
-    <w:bookmarkEnd w:id="52"/>
-    <w:bookmarkStart w:id="53" w:name="fleet-3-far-north"/>
+    <w:bookmarkEnd w:id="53"/>
+    <w:bookmarkStart w:id="54" w:name="fleet-3-far-north"/>
     <w:p>
       <w:pPr>
         <w:pStyle w:val="Heading4"/>
@@ -3668,8 +3865,8 @@
         <w:t xml:space="preserve">treatment already uses a simplified two-regime split around 2002, but the data suggest somewhat finer structure could be supported.</w:t>
       </w:r>
     </w:p>
-    <w:bookmarkEnd w:id="53"/>
-    <w:bookmarkStart w:id="54" w:name="fleet-4-offshore-trawl"/>
+    <w:bookmarkEnd w:id="54"/>
+    <w:bookmarkStart w:id="55" w:name="fleet-4-offshore-trawl"/>
     <w:p>
       <w:pPr>
         <w:pStyle w:val="Heading4"/>
@@ -3751,8 +3948,8 @@
         <w:t xml:space="preserve">These changes are consistent with the recent selectivity changes noted in the SC13 sensitivity runs.</w:t>
       </w:r>
     </w:p>
-    <w:bookmarkEnd w:id="54"/>
-    <w:bookmarkStart w:id="55" w:name="cross-fleet-simplification"/>
+    <w:bookmarkEnd w:id="55"/>
+    <w:bookmarkStart w:id="56" w:name="cross-fleet-simplification"/>
     <w:p>
       <w:pPr>
         <w:pStyle w:val="Heading4"/>
@@ -3865,8 +4062,8 @@
         <w:t xml:space="preserve">extra flexibility for Fleet 4 after 2018, where the short series suggests sharper recent changes.</w:t>
       </w:r>
     </w:p>
-    <w:bookmarkEnd w:id="55"/>
-    <w:bookmarkStart w:id="56" w:name="key-insight"/>
+    <w:bookmarkEnd w:id="56"/>
+    <w:bookmarkStart w:id="57" w:name="key-insight"/>
     <w:p>
       <w:pPr>
         <w:pStyle w:val="Heading4"/>
@@ -3956,8 +4153,8 @@
         <w:t xml:space="preserve">These broad breakpoints also align with changes in fishing pressure, the stock rebuilding phase, and the model note that recent selectivity favors older fish.</w:t>
       </w:r>
     </w:p>
-    <w:bookmarkEnd w:id="56"/>
-    <w:bookmarkStart w:id="81" w:name="illustrative-fit-with-selectivity-blocks"/>
+    <w:bookmarkEnd w:id="57"/>
+    <w:bookmarkStart w:id="82" w:name="illustrative-fit-with-selectivity-blocks"/>
     <w:p>
       <w:pPr>
         <w:pStyle w:val="Heading4"/>
@@ -4045,7 +4242,7 @@
         <w:t xml:space="preserve">.</w:t>
       </w:r>
     </w:p>
-    <w:bookmarkStart w:id="65" w:name="fig-selectivity-fishery-compare"/>
+    <w:bookmarkStart w:id="66" w:name="fig-selectivity-fishery-compare"/>
     <w:tbl>
       <w:tblPr>
         <w:tblStyle w:val="Table"/>
@@ -4073,7 +4270,7 @@
             <w:tr>
               <w:tc>
                 <w:tcPr/>
-                <w:bookmarkStart w:id="60" w:name="fig-selectivity-fishery-compare-1"/>
+                <w:bookmarkStart w:id="61" w:name="fig-selectivity-fishery-compare-1"/>
                 <w:p>
                   <w:pPr>
                     <w:pStyle w:val="Compact"/>
@@ -4085,18 +4282,18 @@
                       <wp:inline>
                         <wp:extent cx="2971800" cy="4754880"/>
                         <wp:effectExtent b="0" l="0" r="0" t="0"/>
-                        <wp:docPr descr="" title="" id="58" name="Picture"/>
+                        <wp:docPr descr="" title="" id="59" name="Picture"/>
                         <a:graphic>
                           <a:graphicData uri="http://schemas.openxmlformats.org/drawingml/2006/picture">
                             <pic:pic>
                               <pic:nvPicPr>
-                                <pic:cNvPr descr="JM-WP-BM-01_files/figure-docx/fig-selectivity-fishery-compare-1.png" id="59" name="Picture"/>
+                                <pic:cNvPr descr="JM-WP-BM-01_files/figure-docx/fig-selectivity-fishery-compare-1.png" id="60" name="Picture"/>
                                 <pic:cNvPicPr>
                                   <a:picLocks noChangeArrowheads="1" noChangeAspect="1"/>
                                 </pic:cNvPicPr>
                               </pic:nvPicPr>
                               <pic:blipFill>
-                                <a:blip r:embed="rId57"/>
+                                <a:blip r:embed="rId58"/>
                                 <a:stretch>
                                   <a:fillRect/>
                                 </a:stretch>
@@ -4146,7 +4343,7 @@
                     <w:t xml:space="preserve">h1_2.00</w:t>
                   </w:r>
                 </w:p>
-                <w:bookmarkEnd w:id="60"/>
+                <w:bookmarkEnd w:id="61"/>
               </w:tc>
             </w:tr>
           </w:tbl>
@@ -4167,7 +4364,7 @@
             <w:tr>
               <w:tc>
                 <w:tcPr/>
-                <w:bookmarkStart w:id="64" w:name="fig-selectivity-fishery-compare-2"/>
+                <w:bookmarkStart w:id="65" w:name="fig-selectivity-fishery-compare-2"/>
                 <w:p>
                   <w:pPr>
                     <w:pStyle w:val="Compact"/>
@@ -4179,18 +4376,18 @@
                       <wp:inline>
                         <wp:extent cx="2971800" cy="4754880"/>
                         <wp:effectExtent b="0" l="0" r="0" t="0"/>
-                        <wp:docPr descr="" title="" id="62" name="Picture"/>
+                        <wp:docPr descr="" title="" id="63" name="Picture"/>
                         <a:graphic>
                           <a:graphicData uri="http://schemas.openxmlformats.org/drawingml/2006/picture">
                             <pic:pic>
                               <pic:nvPicPr>
-                                <pic:cNvPr descr="JM-WP-BM-01_files/figure-docx/fig-selectivity-fishery-compare-2.png" id="63" name="Picture"/>
+                                <pic:cNvPr descr="JM-WP-BM-01_files/figure-docx/fig-selectivity-fishery-compare-2.png" id="64" name="Picture"/>
                                 <pic:cNvPicPr>
                                   <a:picLocks noChangeArrowheads="1" noChangeAspect="1"/>
                                 </pic:cNvPicPr>
                               </pic:nvPicPr>
                               <pic:blipFill>
-                                <a:blip r:embed="rId61"/>
+                                <a:blip r:embed="rId62"/>
                                 <a:stretch>
                                   <a:fillRect/>
                                 </a:stretch>
@@ -4240,7 +4437,7 @@
                     <w:t xml:space="preserve">h1_2.01</w:t>
                   </w:r>
                 </w:p>
-                <w:bookmarkEnd w:id="64"/>
+                <w:bookmarkEnd w:id="65"/>
               </w:tc>
             </w:tr>
           </w:tbl>
@@ -4296,7 +4493,7 @@
         <w:t xml:space="preserve">.</w:t>
       </w:r>
     </w:p>
-    <w:bookmarkEnd w:id="65"/>
+    <w:bookmarkEnd w:id="66"/>
     <w:p>
       <w:pPr>
         <w:pStyle w:val="BodyText"/>
@@ -4417,11 +4614,23 @@
           <w:rPr>
             <w:rStyle w:val="Hyperlink"/>
           </w:rPr>
-          <w:t xml:space="preserve">Table 2</w:t>
+          <w:t xml:space="preserve">Table 3</w:t>
         </w:r>
       </w:hyperlink>
       <w:r>
-        <w:t xml:space="preserve">. The reduced-index sensitivity lowers the index-related likelihood contributions with only a modest reduction in total fit, whereas the block-selectivity model achieves a much larger reduction in estimated parameters but at the cost of substantially higher age- and index-fit components.</w:t>
+        <w:t xml:space="preserve">. Relative to</w:t>
+      </w:r>
+      <w:r>
+        <w:t xml:space="preserve"> </w:t>
+      </w:r>
+      <w:r>
+        <w:rPr>
+          <w:rStyle w:val="VerbatimChar"/>
+        </w:rPr>
+        <w:t xml:space="preserve">h1_1.14</w:t>
+      </w:r>
+      <w:r>
+        <w:t xml:space="preserve">, the reduced-index sensitivity lowers the retained index-related likelihood contributions without materially worsening the overall fit, whereas the block-selectivity model reduces the number of estimated parameters more aggressively but at the cost of substantially higher age- and index-fit components.</w:t>
       </w:r>
     </w:p>
     <w:tbl>
@@ -4437,7 +4646,7 @@
       <w:tr>
         <w:tc>
           <w:tcPr/>
-          <w:bookmarkStart w:id="66" w:name="tbl-h1-like-components"/>
+          <w:bookmarkStart w:id="67" w:name="tbl-h1-like-components"/>
           <w:p>
             <w:pPr>
               <w:jc w:val="center"/>
@@ -4448,7 +4657,7 @@
               <w:pStyle w:val="ImageCaption"/>
             </w:pPr>
             <w:r>
-              <w:t xml:space="preserve">Table 2: Negative-log-likelihood components and estimated parameter counts for the single-stock base model (</w:t>
+              <w:t xml:space="preserve">Table 3: Negative-log-likelihood components and estimated parameter counts for the single-stock base model (</w:t>
             </w:r>
             <w:r>
               <w:rPr>
@@ -6769,7 +6978,7 @@
               </w:tc>
             </w:tr>
           </w:tbl>
-          <w:bookmarkEnd w:id="66"/>
+          <w:bookmarkEnd w:id="67"/>
         </w:tc>
       </w:tr>
     </w:tbl>
@@ -6880,7 +7089,7 @@
         </w:r>
       </w:hyperlink>
       <w:r>
-        <w:t xml:space="preserve">. This comparison places the base model alongside the reduced-index and Far North harmonization variants. It shows that</w:t>
+        <w:t xml:space="preserve">. This first comparison focuses on the base model, the reduced-index sensitivity, and the reduced-index model with block selectivity. It shows that</w:t>
       </w:r>
       <w:r>
         <w:t xml:space="preserve"> </w:t>
@@ -6892,7 +7101,10 @@
         <w:t xml:space="preserve">h1_2.00</w:t>
       </w:r>
       <w:r>
-        <w:t xml:space="preserve">,</w:t>
+        <w:t xml:space="preserve"> </w:t>
+      </w:r>
+      <w:r>
+        <w:t xml:space="preserve">stays broadly close to</w:t>
       </w:r>
       <w:r>
         <w:t xml:space="preserve"> </w:t>
@@ -6901,10 +7113,13 @@
         <w:rPr>
           <w:rStyle w:val="VerbatimChar"/>
         </w:rPr>
-        <w:t xml:space="preserve">h1_2.02</w:t>
-      </w:r>
-      <w:r>
-        <w:t xml:space="preserve">, and</w:t>
+        <w:t xml:space="preserve">h1_1.14</w:t>
+      </w:r>
+      <w:r>
+        <w:t xml:space="preserve"> </w:t>
+      </w:r>
+      <w:r>
+        <w:t xml:space="preserve">for the South-Central Chile CPUE, Peruvian CPUE, and Offshore CPUE series, whereas the additional selectivity simplification in</w:t>
       </w:r>
       <w:r>
         <w:t xml:space="preserve"> </w:t>
@@ -6913,13 +7128,13 @@
         <w:rPr>
           <w:rStyle w:val="VerbatimChar"/>
         </w:rPr>
-        <w:t xml:space="preserve">h2_2.02</w:t>
-      </w:r>
-      <w:r>
-        <w:t xml:space="preserve"> </w:t>
-      </w:r>
-      <w:r>
-        <w:t xml:space="preserve">retain broadly similar fits to the South-Central Chile CPUE, Peruvian CPUE, and Offshore CPUE series, while differing more materially in the Acoustic North series and, to a lesser extent, in the recent Chile CPUE trajectory.</w:t>
+        <w:t xml:space="preserve">h1_2.01</w:t>
+      </w:r>
+      <w:r>
+        <w:t xml:space="preserve"> </w:t>
+      </w:r>
+      <w:r>
+        <w:t xml:space="preserve">produces visibly worse fits for several of the retained indices, especially Acoustic North and Peru CPUE.</w:t>
       </w:r>
     </w:p>
     <w:tbl>
@@ -6935,7 +7150,7 @@
       <w:tr>
         <w:tc>
           <w:tcPr/>
-          <w:bookmarkStart w:id="70" w:name="fig-h1-index-fits"/>
+          <w:bookmarkStart w:id="71" w:name="fig-h1-index-fits"/>
           <w:p>
             <w:pPr>
               <w:pStyle w:val="Compact"/>
@@ -6946,18 +7161,18 @@
                 <wp:inline>
                   <wp:extent cx="5334000" cy="4333875"/>
                   <wp:effectExtent b="0" l="0" r="0" t="0"/>
-                  <wp:docPr descr="" title="" id="68" name="Picture"/>
+                  <wp:docPr descr="" title="" id="69" name="Picture"/>
                   <a:graphic>
                     <a:graphicData uri="http://schemas.openxmlformats.org/drawingml/2006/picture">
                       <pic:pic>
                         <pic:nvPicPr>
-                          <pic:cNvPr descr="JM-WP-BM-01_files/figure-docx/fig-h1-index-fits-1.png" id="69" name="Picture"/>
+                          <pic:cNvPr descr="JM-WP-BM-01_files/figure-docx/fig-h1-index-fits-1.png" id="70" name="Picture"/>
                           <pic:cNvPicPr>
                             <a:picLocks noChangeArrowheads="1" noChangeAspect="1"/>
                           </pic:cNvPicPr>
                         </pic:nvPicPr>
                         <pic:blipFill>
-                          <a:blip r:embed="rId67"/>
+                          <a:blip r:embed="rId68"/>
                           <a:stretch>
                             <a:fillRect/>
                           </a:stretch>
@@ -7018,18 +7233,6 @@
               <w:t xml:space="preserve">h1_2.00</w:t>
             </w:r>
             <w:r>
-              <w:t xml:space="preserve">,</w:t>
-            </w:r>
-            <w:r>
-              <w:t xml:space="preserve"> </w:t>
-            </w:r>
-            <w:r>
-              <w:rPr>
-                <w:rStyle w:val="VerbatimChar"/>
-              </w:rPr>
-              <w:t xml:space="preserve">h1_2.02</w:t>
-            </w:r>
-            <w:r>
               <w:t xml:space="preserve">, and</w:t>
             </w:r>
             <w:r>
@@ -7039,13 +7242,13 @@
               <w:rPr>
                 <w:rStyle w:val="VerbatimChar"/>
               </w:rPr>
-              <w:t xml:space="preserve">h2_2.02</w:t>
+              <w:t xml:space="preserve">h1_2.01</w:t>
             </w:r>
             <w:r>
               <w:t xml:space="preserve">. Panels show the retained comparable index series: South-Central Chile CPUE, Acoustic North, Peruvian CPUE, and Offshore CPUE.</w:t>
             </w:r>
           </w:p>
-          <w:bookmarkEnd w:id="70"/>
+          <w:bookmarkEnd w:id="71"/>
         </w:tc>
       </w:tr>
     </w:tbl>
@@ -7108,18 +7311,18 @@
                 <wp:inline>
                   <wp:extent cx="152400" cy="152400"/>
                   <wp:effectExtent b="0" l="0" r="0" t="0"/>
-                  <wp:docPr descr="" title="" id="71" name="Picture"/>
+                  <wp:docPr descr="" title="" id="72" name="Picture"/>
                   <a:graphic>
                     <a:graphicData uri="http://schemas.openxmlformats.org/drawingml/2006/picture">
                       <pic:pic>
                         <pic:nvPicPr>
-                          <pic:cNvPr descr="/Applications/quarto/share/formats/docx/note.png" id="72" name="Picture"/>
+                          <pic:cNvPr descr="/Applications/quarto/share/formats/docx/note.png" id="73" name="Picture"/>
                           <pic:cNvPicPr>
                             <a:picLocks noChangeArrowheads="1" noChangeAspect="1"/>
                           </pic:cNvPicPr>
                         </pic:nvPicPr>
                         <pic:blipFill>
-                          <a:blip r:embed="rId47"/>
+                          <a:blip r:embed="rId48"/>
                           <a:stretch>
                             <a:fillRect/>
                           </a:stretch>
@@ -7268,7 +7471,7 @@
       <w:tr>
         <w:tc>
           <w:tcPr/>
-          <w:bookmarkStart w:id="76" w:name="fig-selectivity-blocks-ssb"/>
+          <w:bookmarkStart w:id="77" w:name="fig-selectivity-blocks-ssb"/>
           <w:p>
             <w:pPr>
               <w:pStyle w:val="Compact"/>
@@ -7279,18 +7482,18 @@
                 <wp:inline>
                   <wp:extent cx="5334000" cy="3194843"/>
                   <wp:effectExtent b="0" l="0" r="0" t="0"/>
-                  <wp:docPr descr="" title="" id="74" name="Picture"/>
+                  <wp:docPr descr="" title="" id="75" name="Picture"/>
                   <a:graphic>
                     <a:graphicData uri="http://schemas.openxmlformats.org/drawingml/2006/picture">
                       <pic:pic>
                         <pic:nvPicPr>
-                          <pic:cNvPr descr="JM-WP-BM-01_files/figure-docx/fig-selectivity-blocks-ssb-1.png" id="75" name="Picture"/>
+                          <pic:cNvPr descr="JM-WP-BM-01_files/figure-docx/fig-selectivity-blocks-ssb-1.png" id="76" name="Picture"/>
                           <pic:cNvPicPr>
                             <a:picLocks noChangeArrowheads="1" noChangeAspect="1"/>
                           </pic:cNvPicPr>
                         </pic:nvPicPr>
                         <pic:blipFill>
-                          <a:blip r:embed="rId73"/>
+                          <a:blip r:embed="rId74"/>
                           <a:stretch>
                             <a:fillRect/>
                           </a:stretch>
@@ -7348,7 +7551,7 @@
               <w:t xml:space="preserve">).</w:t>
             </w:r>
           </w:p>
-          <w:bookmarkEnd w:id="76"/>
+          <w:bookmarkEnd w:id="77"/>
         </w:tc>
       </w:tr>
     </w:tbl>
@@ -7365,7 +7568,7 @@
       <w:tr>
         <w:tc>
           <w:tcPr/>
-          <w:bookmarkStart w:id="80" w:name="fig-selectivity-blocks-rec"/>
+          <w:bookmarkStart w:id="81" w:name="fig-selectivity-blocks-rec"/>
           <w:p>
             <w:pPr>
               <w:pStyle w:val="Compact"/>
@@ -7376,18 +7579,18 @@
                 <wp:inline>
                   <wp:extent cx="5334000" cy="3194843"/>
                   <wp:effectExtent b="0" l="0" r="0" t="0"/>
-                  <wp:docPr descr="" title="" id="78" name="Picture"/>
+                  <wp:docPr descr="" title="" id="79" name="Picture"/>
                   <a:graphic>
                     <a:graphicData uri="http://schemas.openxmlformats.org/drawingml/2006/picture">
                       <pic:pic>
                         <pic:nvPicPr>
-                          <pic:cNvPr descr="JM-WP-BM-01_files/figure-docx/fig-selectivity-blocks-rec-1.png" id="79" name="Picture"/>
+                          <pic:cNvPr descr="JM-WP-BM-01_files/figure-docx/fig-selectivity-blocks-rec-1.png" id="80" name="Picture"/>
                           <pic:cNvPicPr>
                             <a:picLocks noChangeArrowheads="1" noChangeAspect="1"/>
                           </pic:cNvPicPr>
                         </pic:nvPicPr>
                         <pic:blipFill>
-                          <a:blip r:embed="rId77"/>
+                          <a:blip r:embed="rId78"/>
                           <a:stretch>
                             <a:fillRect/>
                           </a:stretch>
@@ -7445,14 +7648,14 @@
               <w:t xml:space="preserve">).</w:t>
             </w:r>
           </w:p>
-          <w:bookmarkEnd w:id="80"/>
+          <w:bookmarkEnd w:id="81"/>
         </w:tc>
       </w:tr>
     </w:tbl>
-    <w:bookmarkEnd w:id="81"/>
     <w:bookmarkEnd w:id="82"/>
     <w:bookmarkEnd w:id="83"/>
-    <w:bookmarkStart w:id="87" w:name="harmonized-northern-treatment"/>
+    <w:bookmarkEnd w:id="84"/>
+    <w:bookmarkStart w:id="92" w:name="harmonized-northern-treatment"/>
     <w:p>
       <w:pPr>
         <w:pStyle w:val="Heading2"/>
@@ -7608,18 +7811,18 @@
                 <wp:inline>
                   <wp:extent cx="152400" cy="152400"/>
                   <wp:effectExtent b="0" l="0" r="0" t="0"/>
-                  <wp:docPr descr="" title="" id="84" name="Picture"/>
+                  <wp:docPr descr="" title="" id="85" name="Picture"/>
                   <a:graphic>
                     <a:graphicData uri="http://schemas.openxmlformats.org/drawingml/2006/picture">
                       <pic:pic>
                         <pic:nvPicPr>
-                          <pic:cNvPr descr="/Applications/quarto/share/formats/docx/note.png" id="85" name="Picture"/>
+                          <pic:cNvPr descr="/Applications/quarto/share/formats/docx/note.png" id="86" name="Picture"/>
                           <pic:cNvPicPr>
                             <a:picLocks noChangeArrowheads="1" noChangeAspect="1"/>
                           </pic:cNvPicPr>
                         </pic:nvPicPr>
                         <pic:blipFill>
-                          <a:blip r:embed="rId47"/>
+                          <a:blip r:embed="rId48"/>
                           <a:stretch>
                             <a:fillRect/>
                           </a:stretch>
@@ -7938,7 +8141,21 @@
           <w:rPr>
             <w:rStyle w:val="Hyperlink"/>
           </w:rPr>
-          <w:t xml:space="preserve">Table 3</w:t>
+          <w:t xml:space="preserve">Table 4</w:t>
+        </w:r>
+      </w:hyperlink>
+      <w:r>
+        <w:t xml:space="preserve">, and the corresponding retained-index fits are shown in</w:t>
+      </w:r>
+      <w:r>
+        <w:t xml:space="preserve"> </w:t>
+      </w:r>
+      <w:hyperlink w:anchor="fig-harmonized-index-fits">
+        <w:r>
+          <w:rPr>
+            <w:rStyle w:val="Hyperlink"/>
+          </w:rPr>
+          <w:t xml:space="preserve">Figure 7</w:t>
         </w:r>
       </w:hyperlink>
       <w:r>
@@ -7958,7 +8175,7 @@
       <w:tr>
         <w:tc>
           <w:tcPr/>
-          <w:bookmarkStart w:id="86" w:name="tbl-north-harmonized-like-components"/>
+          <w:bookmarkStart w:id="87" w:name="tbl-north-harmonized-like-components"/>
           <w:p>
             <w:pPr>
               <w:jc w:val="center"/>
@@ -7969,7 +8186,7 @@
               <w:pStyle w:val="ImageCaption"/>
             </w:pPr>
             <w:r>
-              <w:t xml:space="preserve">Table 3: Negative-log-likelihood components and estimated parameter counts for the reduced-index single-stock model (</w:t>
+              <w:t xml:space="preserve">Table 4: Negative-log-likelihood components and estimated parameter counts for the reduced-index single-stock model (</w:t>
             </w:r>
             <w:r>
               <w:rPr>
@@ -10188,12 +10405,191 @@
               </w:tc>
             </w:tr>
           </w:tbl>
-          <w:bookmarkEnd w:id="86"/>
+          <w:bookmarkEnd w:id="87"/>
         </w:tc>
       </w:tr>
     </w:tbl>
-    <w:bookmarkEnd w:id="87"/>
-    <w:bookmarkStart w:id="90" w:name="simplified-recruitment-alternatives"/>
+    <w:p>
+      <w:pPr>
+        <w:pStyle w:val="BodyText"/>
+      </w:pPr>
+      <w:r>
+        <w:t xml:space="preserve">The retained comparable index fits for these harmonized models are shown in</w:t>
+      </w:r>
+      <w:r>
+        <w:t xml:space="preserve"> </w:t>
+      </w:r>
+      <w:hyperlink w:anchor="fig-harmonized-index-fits">
+        <w:r>
+          <w:rPr>
+            <w:rStyle w:val="Hyperlink"/>
+          </w:rPr>
+          <w:t xml:space="preserve">Figure 7</w:t>
+        </w:r>
+      </w:hyperlink>
+      <w:r>
+        <w:t xml:space="preserve">. Relative to</w:t>
+      </w:r>
+      <w:r>
+        <w:t xml:space="preserve"> </w:t>
+      </w:r>
+      <w:r>
+        <w:rPr>
+          <w:rStyle w:val="VerbatimChar"/>
+        </w:rPr>
+        <w:t xml:space="preserve">h1_2.00</w:t>
+      </w:r>
+      <w:r>
+        <w:t xml:space="preserve">, the single-stock harmonized variant</w:t>
+      </w:r>
+      <w:r>
+        <w:t xml:space="preserve"> </w:t>
+      </w:r>
+      <w:r>
+        <w:rPr>
+          <w:rStyle w:val="VerbatimChar"/>
+        </w:rPr>
+        <w:t xml:space="preserve">h1_2.02</w:t>
+      </w:r>
+      <w:r>
+        <w:t xml:space="preserve"> </w:t>
+      </w:r>
+      <w:r>
+        <w:t xml:space="preserve">changes little in the South-Central Chile CPUE, Peru CPUE, and Offshore CPUE panels, while the two-stock harmonized variant</w:t>
+      </w:r>
+      <w:r>
+        <w:t xml:space="preserve"> </w:t>
+      </w:r>
+      <w:r>
+        <w:rPr>
+          <w:rStyle w:val="VerbatimChar"/>
+        </w:rPr>
+        <w:t xml:space="preserve">h2_2.02</w:t>
+      </w:r>
+      <w:r>
+        <w:t xml:space="preserve"> </w:t>
+      </w:r>
+      <w:r>
+        <w:t xml:space="preserve">differs more clearly in the Acoustic North fit and in parts of the Chile CPUE trajectory.</w:t>
+      </w:r>
+    </w:p>
+    <w:tbl>
+      <w:tblPr>
+        <w:tblStyle w:val="Table"/>
+        <w:tblW w:type="pct" w:w="5000"/>
+        <w:tblLayout w:type="fixed"/>
+        <w:tblLook w:firstRow="0" w:lastRow="0" w:firstColumn="0" w:lastColumn="0" w:noHBand="0" w:noVBand="0" w:val="0000"/>
+      </w:tblPr>
+      <w:tblGrid>
+        <w:gridCol w:w="7920"/>
+      </w:tblGrid>
+      <w:tr>
+        <w:tc>
+          <w:tcPr/>
+          <w:bookmarkStart w:id="91" w:name="fig-harmonized-index-fits"/>
+          <w:p>
+            <w:pPr>
+              <w:pStyle w:val="Compact"/>
+              <w:jc w:val="center"/>
+            </w:pPr>
+            <w:r>
+              <w:drawing>
+                <wp:inline>
+                  <wp:extent cx="5334000" cy="4333875"/>
+                  <wp:effectExtent b="0" l="0" r="0" t="0"/>
+                  <wp:docPr descr="" title="" id="89" name="Picture"/>
+                  <a:graphic>
+                    <a:graphicData uri="http://schemas.openxmlformats.org/drawingml/2006/picture">
+                      <pic:pic>
+                        <pic:nvPicPr>
+                          <pic:cNvPr descr="JM-WP-BM-01_files/figure-docx/fig-harmonized-index-fits-1.png" id="90" name="Picture"/>
+                          <pic:cNvPicPr>
+                            <a:picLocks noChangeArrowheads="1" noChangeAspect="1"/>
+                          </pic:cNvPicPr>
+                        </pic:nvPicPr>
+                        <pic:blipFill>
+                          <a:blip r:embed="rId88"/>
+                          <a:stretch>
+                            <a:fillRect/>
+                          </a:stretch>
+                        </pic:blipFill>
+                        <pic:spPr bwMode="auto">
+                          <a:xfrm>
+                            <a:off x="0" y="0"/>
+                            <a:ext cx="5334000" cy="4333875"/>
+                          </a:xfrm>
+                          <a:prstGeom prst="rect">
+                            <a:avLst/>
+                          </a:prstGeom>
+                          <a:noFill/>
+                          <a:ln w="9525">
+                            <a:noFill/>
+                            <a:headEnd/>
+                            <a:tailEnd/>
+                          </a:ln>
+                        </pic:spPr>
+                      </pic:pic>
+                    </a:graphicData>
+                  </a:graphic>
+                </wp:inline>
+              </w:drawing>
+            </w:r>
+          </w:p>
+          <w:p>
+            <w:pPr>
+              <w:jc w:val="center"/>
+            </w:pPr>
+            <w:pPr>
+              <w:jc w:val="left"/>
+              <w:spacing w:before="200"/>
+              <w:pStyle w:val="ImageCaption"/>
+            </w:pPr>
+            <w:r>
+              <w:t xml:space="preserve">Figure 7: Observed and fitted index trajectories for</w:t>
+            </w:r>
+            <w:r>
+              <w:t xml:space="preserve"> </w:t>
+            </w:r>
+            <w:r>
+              <w:rPr>
+                <w:rStyle w:val="VerbatimChar"/>
+              </w:rPr>
+              <w:t xml:space="preserve">h1_2.00</w:t>
+            </w:r>
+            <w:r>
+              <w:t xml:space="preserve">,</w:t>
+            </w:r>
+            <w:r>
+              <w:t xml:space="preserve"> </w:t>
+            </w:r>
+            <w:r>
+              <w:rPr>
+                <w:rStyle w:val="VerbatimChar"/>
+              </w:rPr>
+              <w:t xml:space="preserve">h1_2.02</w:t>
+            </w:r>
+            <w:r>
+              <w:t xml:space="preserve">, and</w:t>
+            </w:r>
+            <w:r>
+              <w:t xml:space="preserve"> </w:t>
+            </w:r>
+            <w:r>
+              <w:rPr>
+                <w:rStyle w:val="VerbatimChar"/>
+              </w:rPr>
+              <w:t xml:space="preserve">h2_2.02</w:t>
+            </w:r>
+            <w:r>
+              <w:t xml:space="preserve">. Panels show the retained comparable index series: South-Central Chile CPUE, Acoustic North, Peruvian CPUE, and Offshore CPUE.</w:t>
+            </w:r>
+          </w:p>
+          <w:bookmarkEnd w:id="91"/>
+        </w:tc>
+      </w:tr>
+    </w:tbl>
+    <w:bookmarkEnd w:id="92"/>
+    <w:bookmarkStart w:id="95" w:name="simplified-recruitment-alternatives"/>
     <w:p>
       <w:pPr>
         <w:pStyle w:val="Heading2"/>
@@ -10251,18 +10647,18 @@
                 <wp:inline>
                   <wp:extent cx="152400" cy="152400"/>
                   <wp:effectExtent b="0" l="0" r="0" t="0"/>
-                  <wp:docPr descr="" title="" id="88" name="Picture"/>
+                  <wp:docPr descr="" title="" id="93" name="Picture"/>
                   <a:graphic>
                     <a:graphicData uri="http://schemas.openxmlformats.org/drawingml/2006/picture">
                       <pic:pic>
                         <pic:nvPicPr>
-                          <pic:cNvPr descr="/Applications/quarto/share/formats/docx/note.png" id="89" name="Picture"/>
+                          <pic:cNvPr descr="/Applications/quarto/share/formats/docx/note.png" id="94" name="Picture"/>
                           <pic:cNvPicPr>
                             <a:picLocks noChangeArrowheads="1" noChangeAspect="1"/>
                           </pic:cNvPicPr>
                         </pic:nvPicPr>
                         <pic:blipFill>
-                          <a:blip r:embed="rId47"/>
+                          <a:blip r:embed="rId48"/>
                           <a:stretch>
                             <a:fillRect/>
                           </a:stretch>
@@ -10349,8 +10745,8 @@
         </w:tc>
       </w:tr>
     </w:tbl>
-    <w:bookmarkEnd w:id="90"/>
-    <w:bookmarkStart w:id="93" w:name="fixed-reference-point-alternatives"/>
+    <w:bookmarkEnd w:id="95"/>
+    <w:bookmarkStart w:id="98" w:name="fixed-reference-point-alternatives"/>
     <w:p>
       <w:pPr>
         <w:pStyle w:val="Heading2"/>
@@ -10446,18 +10842,18 @@
                 <wp:inline>
                   <wp:extent cx="152400" cy="152400"/>
                   <wp:effectExtent b="0" l="0" r="0" t="0"/>
-                  <wp:docPr descr="" title="" id="91" name="Picture"/>
+                  <wp:docPr descr="" title="" id="96" name="Picture"/>
                   <a:graphic>
                     <a:graphicData uri="http://schemas.openxmlformats.org/drawingml/2006/picture">
                       <pic:pic>
                         <pic:nvPicPr>
-                          <pic:cNvPr descr="/Applications/quarto/share/formats/docx/note.png" id="92" name="Picture"/>
+                          <pic:cNvPr descr="/Applications/quarto/share/formats/docx/note.png" id="97" name="Picture"/>
                           <pic:cNvPicPr>
                             <a:picLocks noChangeArrowheads="1" noChangeAspect="1"/>
                           </pic:cNvPicPr>
                         </pic:nvPicPr>
                         <pic:blipFill>
-                          <a:blip r:embed="rId47"/>
+                          <a:blip r:embed="rId48"/>
                           <a:stretch>
                             <a:fillRect/>
                           </a:stretch>
@@ -10575,9 +10971,9 @@
         <w:t xml:space="preserve">The recommended approach is therefore to calculate reference points once, using the terminal selectivity block and the current biological schedules, and use those fixed values as management benchmarks throughout the MSE simulation. Sensitivity to the choice of reference period can be examined as part of robustness testing.</w:t>
       </w:r>
     </w:p>
-    <w:bookmarkEnd w:id="93"/>
-    <w:bookmarkEnd w:id="94"/>
-    <w:bookmarkStart w:id="95" w:name="summary"/>
+    <w:bookmarkEnd w:id="98"/>
+    <w:bookmarkEnd w:id="99"/>
+    <w:bookmarkStart w:id="100" w:name="summary"/>
     <w:p>
       <w:pPr>
         <w:pStyle w:val="Heading1"/>
@@ -10834,8 +11230,8 @@
         <w:t xml:space="preserve">The next step is to construct and compare simplified alternatives that remain faithful to the broad SC13 assessment picture while avoiding the complicated issues identified during the July 2025 MSE workshop. The reviewer comments documented here provide a prioritized roadmap for that work.</w:t>
       </w:r>
     </w:p>
-    <w:bookmarkEnd w:id="95"/>
-    <w:bookmarkStart w:id="105" w:name="appendix-compact-equation-summary"/>
+    <w:bookmarkEnd w:id="100"/>
+    <w:bookmarkStart w:id="110" w:name="appendix-compact-equation-summary"/>
     <w:p>
       <w:pPr>
         <w:pStyle w:val="Heading1"/>
@@ -10852,7 +11248,7 @@
         <w:t xml:space="preserve">This appendix gives a compact schematic description of the equations underlying the SC13 Joint Jack Mackerel Model. It is intended to summarize the structure used in this working paper rather than to reproduce every implementation detail of the ADMB code or every option described in the technical annex and user guide.</w:t>
       </w:r>
     </w:p>
-    <w:bookmarkStart w:id="96" w:name="notation"/>
+    <w:bookmarkStart w:id="101" w:name="notation"/>
     <w:p>
       <w:pPr>
         <w:pStyle w:val="Heading2"/>
@@ -11442,8 +11838,8 @@
         <w:t xml:space="preserve">.</w:t>
       </w:r>
     </w:p>
-    <w:bookmarkEnd w:id="96"/>
-    <w:bookmarkStart w:id="97" w:name="population-update"/>
+    <w:bookmarkEnd w:id="101"/>
+    <w:bookmarkStart w:id="102" w:name="population-update"/>
     <w:p>
       <w:pPr>
         <w:pStyle w:val="Heading2"/>
@@ -12451,8 +12847,8 @@
         <w:t xml:space="preserve">is the fraction of annual mortality occurring before spawning.</w:t>
       </w:r>
     </w:p>
-    <w:bookmarkEnd w:id="97"/>
-    <w:bookmarkStart w:id="98" w:name="stock-recruitment-relationship"/>
+    <w:bookmarkEnd w:id="102"/>
+    <w:bookmarkStart w:id="103" w:name="stock-recruitment-relationship"/>
     <w:p>
       <w:pPr>
         <w:pStyle w:val="Heading2"/>
@@ -12977,8 +13373,8 @@
         <w:t xml:space="preserve">, recruitment is assigned across two stocks with a more complex regime structure, including the 1999 shift described in the control file.</w:t>
       </w:r>
     </w:p>
-    <w:bookmarkEnd w:id="98"/>
-    <w:bookmarkStart w:id="99" w:name="fishing-mortality-and-catch"/>
+    <w:bookmarkEnd w:id="103"/>
+    <w:bookmarkStart w:id="104" w:name="fishing-mortality-and-catch"/>
     <w:p>
       <w:pPr>
         <w:pStyle w:val="Heading2"/>
@@ -13654,8 +14050,8 @@
         </m:oMath>
       </m:oMathPara>
     </w:p>
-    <w:bookmarkEnd w:id="99"/>
-    <w:bookmarkStart w:id="100" w:name="abundance-indices"/>
+    <w:bookmarkEnd w:id="104"/>
+    <w:bookmarkStart w:id="105" w:name="abundance-indices"/>
     <w:p>
       <w:pPr>
         <w:pStyle w:val="Heading2"/>
@@ -14062,8 +14458,8 @@
         <w:t xml:space="preserve">places the survey or CPUE observation within the year. This expression is schematic because some indices are closer to numbers-at-age and others to biomass, but it captures the model logic used across the SC13 index components.</w:t>
       </w:r>
     </w:p>
-    <w:bookmarkEnd w:id="100"/>
-    <w:bookmarkStart w:id="101" w:name="age-and-length-compositions"/>
+    <w:bookmarkEnd w:id="105"/>
+    <w:bookmarkStart w:id="106" w:name="age-and-length-compositions"/>
     <w:p>
       <w:pPr>
         <w:pStyle w:val="Heading2"/>
@@ -14576,8 +14972,8 @@
         <w:t xml:space="preserve">, derived from the von Bertalanffy growth specification used by the model.</w:t>
       </w:r>
     </w:p>
-    <w:bookmarkEnd w:id="101"/>
-    <w:bookmarkStart w:id="102" w:name="observation-likelihoods"/>
+    <w:bookmarkEnd w:id="106"/>
+    <w:bookmarkStart w:id="107" w:name="observation-likelihoods"/>
     <w:p>
       <w:pPr>
         <w:pStyle w:val="Heading2"/>
@@ -15186,8 +15582,8 @@
         <w:t xml:space="preserve">The SC13 model uses Francis weighting for age-composition effective sample sizes, so the composition likelihood is strongly affected by those externally specified weights.</w:t>
       </w:r>
     </w:p>
-    <w:bookmarkEnd w:id="102"/>
-    <w:bookmarkStart w:id="103" w:name="objective-function"/>
+    <w:bookmarkEnd w:id="107"/>
+    <w:bookmarkStart w:id="108" w:name="objective-function"/>
     <w:p>
       <w:pPr>
         <w:pStyle w:val="Heading2"/>
@@ -15533,8 +15929,8 @@
         <w:t xml:space="preserve">, is especially important in SC13 because the model includes extensive penalties on fishery and survey selectivity trajectories to regularize the time-varying non-parametric selectivity schedules.</w:t>
       </w:r>
     </w:p>
-    <w:bookmarkEnd w:id="103"/>
-    <w:bookmarkStart w:id="104" w:name="dynamic-reference-points"/>
+    <w:bookmarkEnd w:id="108"/>
+    <w:bookmarkStart w:id="109" w:name="dynamic-reference-points"/>
     <w:p>
       <w:pPr>
         <w:pStyle w:val="Heading2"/>
@@ -15958,9 +16354,9 @@
         <w:t xml:space="preserve">vary through time in the SC13 assessment rather than remaining fixed constants.</w:t>
       </w:r>
     </w:p>
-    <w:bookmarkEnd w:id="104"/>
-    <w:bookmarkEnd w:id="105"/>
-    <w:bookmarkStart w:id="139" w:name="references"/>
+    <w:bookmarkEnd w:id="109"/>
+    <w:bookmarkEnd w:id="110"/>
+    <w:bookmarkStart w:id="144" w:name="references"/>
     <w:p>
       <w:pPr>
         <w:pStyle w:val="Heading1"/>
@@ -15969,8 +16365,8 @@
         <w:t xml:space="preserve">References</w:t>
       </w:r>
     </w:p>
-    <w:bookmarkStart w:id="138" w:name="refs"/>
-    <w:bookmarkStart w:id="107" w:name="ref-vonbertalanffy1957growth"/>
+    <w:bookmarkStart w:id="143" w:name="refs"/>
+    <w:bookmarkStart w:id="112" w:name="ref-vonbertalanffy1957growth"/>
     <w:p>
       <w:pPr>
         <w:pStyle w:val="Bibliography"/>
@@ -16007,7 +16403,7 @@
       <w:r>
         <w:t xml:space="preserve"> </w:t>
       </w:r>
-      <w:hyperlink r:id="rId106">
+      <w:hyperlink r:id="rId111">
         <w:r>
           <w:rPr>
             <w:rStyle w:val="Hyperlink"/>
@@ -16016,8 +16412,8 @@
         </w:r>
       </w:hyperlink>
     </w:p>
-    <w:bookmarkEnd w:id="107"/>
-    <w:bookmarkStart w:id="108" w:name="ref-beverton1957dynamics"/>
+    <w:bookmarkEnd w:id="112"/>
+    <w:bookmarkStart w:id="113" w:name="ref-beverton1957dynamics"/>
     <w:p>
       <w:pPr>
         <w:pStyle w:val="Bibliography"/>
@@ -16042,8 +16438,8 @@
         <w:t xml:space="preserve">(Vol. 19, p. 533). H. M. Stationery Office.</w:t>
       </w:r>
     </w:p>
-    <w:bookmarkEnd w:id="108"/>
-    <w:bookmarkStart w:id="110" w:name="ref-butterworth1999procedures"/>
+    <w:bookmarkEnd w:id="113"/>
+    <w:bookmarkStart w:id="115" w:name="ref-butterworth1999procedures"/>
     <w:p>
       <w:pPr>
         <w:pStyle w:val="Bibliography"/>
@@ -16080,7 +16476,7 @@
       <w:r>
         <w:t xml:space="preserve"> </w:t>
       </w:r>
-      <w:hyperlink r:id="rId109">
+      <w:hyperlink r:id="rId114">
         <w:r>
           <w:rPr>
             <w:rStyle w:val="Hyperlink"/>
@@ -16089,8 +16485,8 @@
         </w:r>
       </w:hyperlink>
     </w:p>
-    <w:bookmarkEnd w:id="110"/>
-    <w:bookmarkStart w:id="112" w:name="ref-carruthers2024roadmap"/>
+    <w:bookmarkEnd w:id="115"/>
+    <w:bookmarkStart w:id="117" w:name="ref-carruthers2024roadmap"/>
     <w:p>
       <w:pPr>
         <w:pStyle w:val="Bibliography"/>
@@ -16153,7 +16549,7 @@
       <w:r>
         <w:t xml:space="preserve"> </w:t>
       </w:r>
-      <w:hyperlink r:id="rId111">
+      <w:hyperlink r:id="rId116">
         <w:r>
           <w:rPr>
             <w:rStyle w:val="Hyperlink"/>
@@ -16162,8 +16558,8 @@
         </w:r>
       </w:hyperlink>
     </w:p>
-    <w:bookmarkEnd w:id="112"/>
-    <w:bookmarkStart w:id="114" w:name="ref-fournier2012admb"/>
+    <w:bookmarkEnd w:id="117"/>
+    <w:bookmarkStart w:id="119" w:name="ref-fournier2012admb"/>
     <w:p>
       <w:pPr>
         <w:pStyle w:val="Bibliography"/>
@@ -16200,7 +16596,7 @@
       <w:r>
         <w:t xml:space="preserve"> </w:t>
       </w:r>
-      <w:hyperlink r:id="rId113">
+      <w:hyperlink r:id="rId118">
         <w:r>
           <w:rPr>
             <w:rStyle w:val="Hyperlink"/>
@@ -16209,8 +16605,8 @@
         </w:r>
       </w:hyperlink>
     </w:p>
-    <w:bookmarkEnd w:id="114"/>
-    <w:bookmarkStart w:id="116" w:name="ref-fournier1982catchage"/>
+    <w:bookmarkEnd w:id="119"/>
+    <w:bookmarkStart w:id="121" w:name="ref-fournier1982catchage"/>
     <w:p>
       <w:pPr>
         <w:pStyle w:val="Bibliography"/>
@@ -16247,7 +16643,7 @@
       <w:r>
         <w:t xml:space="preserve"> </w:t>
       </w:r>
-      <w:hyperlink r:id="rId115">
+      <w:hyperlink r:id="rId120">
         <w:r>
           <w:rPr>
             <w:rStyle w:val="Hyperlink"/>
@@ -16256,8 +16652,8 @@
         </w:r>
       </w:hyperlink>
     </w:p>
-    <w:bookmarkEnd w:id="116"/>
-    <w:bookmarkStart w:id="118" w:name="ref-francis2011weighting"/>
+    <w:bookmarkEnd w:id="121"/>
+    <w:bookmarkStart w:id="123" w:name="ref-francis2011weighting"/>
     <w:p>
       <w:pPr>
         <w:pStyle w:val="Bibliography"/>
@@ -16294,7 +16690,7 @@
       <w:r>
         <w:t xml:space="preserve"> </w:t>
       </w:r>
-      <w:hyperlink r:id="rId117">
+      <w:hyperlink r:id="rId122">
         <w:r>
           <w:rPr>
             <w:rStyle w:val="Hyperlink"/>
@@ -16303,8 +16699,8 @@
         </w:r>
       </w:hyperlink>
     </w:p>
-    <w:bookmarkEnd w:id="118"/>
-    <w:bookmarkStart w:id="120" w:name="ref-hilborn1992quantitative"/>
+    <w:bookmarkEnd w:id="123"/>
+    <w:bookmarkStart w:id="125" w:name="ref-hilborn1992quantitative"/>
     <w:p>
       <w:pPr>
         <w:pStyle w:val="Bibliography"/>
@@ -16328,7 +16724,7 @@
       <w:r>
         <w:t xml:space="preserve"> </w:t>
       </w:r>
-      <w:hyperlink r:id="rId119">
+      <w:hyperlink r:id="rId124">
         <w:r>
           <w:rPr>
             <w:rStyle w:val="Hyperlink"/>
@@ -16337,8 +16733,8 @@
         </w:r>
       </w:hyperlink>
     </w:p>
-    <w:bookmarkEnd w:id="120"/>
-    <w:bookmarkStart w:id="122" w:name="ref-linton2011selectivity"/>
+    <w:bookmarkEnd w:id="125"/>
+    <w:bookmarkStart w:id="127" w:name="ref-linton2011selectivity"/>
     <w:p>
       <w:pPr>
         <w:pStyle w:val="Bibliography"/>
@@ -16375,7 +16771,7 @@
       <w:r>
         <w:t xml:space="preserve"> </w:t>
       </w:r>
-      <w:hyperlink r:id="rId121">
+      <w:hyperlink r:id="rId126">
         <w:r>
           <w:rPr>
             <w:rStyle w:val="Hyperlink"/>
@@ -16384,8 +16780,8 @@
         </w:r>
       </w:hyperlink>
     </w:p>
-    <w:bookmarkEnd w:id="122"/>
-    <w:bookmarkStart w:id="123" w:name="ref-mccullagh1989glm"/>
+    <w:bookmarkEnd w:id="127"/>
+    <w:bookmarkStart w:id="128" w:name="ref-mccullagh1989glm"/>
     <w:p>
       <w:pPr>
         <w:pStyle w:val="Bibliography"/>
@@ -16410,8 +16806,8 @@
         <w:t xml:space="preserve">(2nd ed.). Chapman; Hall.</w:t>
       </w:r>
     </w:p>
-    <w:bookmarkEnd w:id="123"/>
-    <w:bookmarkStart w:id="125" w:name="ref-nelder1972glm"/>
+    <w:bookmarkEnd w:id="128"/>
+    <w:bookmarkStart w:id="130" w:name="ref-nelder1972glm"/>
     <w:p>
       <w:pPr>
         <w:pStyle w:val="Bibliography"/>
@@ -16448,7 +16844,7 @@
       <w:r>
         <w:t xml:space="preserve"> </w:t>
       </w:r>
-      <w:hyperlink r:id="rId124">
+      <w:hyperlink r:id="rId129">
         <w:r>
           <w:rPr>
             <w:rStyle w:val="Hyperlink"/>
@@ -16457,8 +16853,8 @@
         </w:r>
       </w:hyperlink>
     </w:p>
-    <w:bookmarkEnd w:id="125"/>
-    <w:bookmarkStart w:id="127" w:name="ref-punt2016bestpractices"/>
+    <w:bookmarkEnd w:id="130"/>
+    <w:bookmarkStart w:id="132" w:name="ref-punt2016bestpractices"/>
     <w:p>
       <w:pPr>
         <w:pStyle w:val="Bibliography"/>
@@ -16495,7 +16891,7 @@
       <w:r>
         <w:t xml:space="preserve"> </w:t>
       </w:r>
-      <w:hyperlink r:id="rId126">
+      <w:hyperlink r:id="rId131">
         <w:r>
           <w:rPr>
             <w:rStyle w:val="Hyperlink"/>
@@ -16504,8 +16900,8 @@
         </w:r>
       </w:hyperlink>
     </w:p>
-    <w:bookmarkEnd w:id="127"/>
-    <w:bookmarkStart w:id="129" w:name="ref-rousseau2019fleets"/>
+    <w:bookmarkEnd w:id="132"/>
+    <w:bookmarkStart w:id="134" w:name="ref-rousseau2019fleets"/>
     <w:p>
       <w:pPr>
         <w:pStyle w:val="Bibliography"/>
@@ -16542,7 +16938,7 @@
       <w:r>
         <w:t xml:space="preserve"> </w:t>
       </w:r>
-      <w:hyperlink r:id="rId128">
+      <w:hyperlink r:id="rId133">
         <w:r>
           <w:rPr>
             <w:rStyle w:val="Hyperlink"/>
@@ -16551,8 +16947,8 @@
         </w:r>
       </w:hyperlink>
     </w:p>
-    <w:bookmarkEnd w:id="129"/>
-    <w:bookmarkStart w:id="131" w:name="ref-schnute1995error"/>
+    <w:bookmarkEnd w:id="134"/>
+    <w:bookmarkStart w:id="136" w:name="ref-schnute1995error"/>
     <w:p>
       <w:pPr>
         <w:pStyle w:val="Bibliography"/>
@@ -16589,7 +16985,7 @@
       <w:r>
         <w:t xml:space="preserve"> </w:t>
       </w:r>
-      <w:hyperlink r:id="rId130">
+      <w:hyperlink r:id="rId135">
         <w:r>
           <w:rPr>
             <w:rStyle w:val="Hyperlink"/>
@@ -16598,8 +16994,8 @@
         </w:r>
       </w:hyperlink>
     </w:p>
-    <w:bookmarkEnd w:id="131"/>
-    <w:bookmarkStart w:id="133" w:name="ref-siple2021smallpelagics"/>
+    <w:bookmarkEnd w:id="136"/>
+    <w:bookmarkStart w:id="138" w:name="ref-siple2021smallpelagics"/>
     <w:p>
       <w:pPr>
         <w:pStyle w:val="Bibliography"/>
@@ -16636,7 +17032,7 @@
       <w:r>
         <w:t xml:space="preserve"> </w:t>
       </w:r>
-      <w:hyperlink r:id="rId132">
+      <w:hyperlink r:id="rId137">
         <w:r>
           <w:rPr>
             <w:rStyle w:val="Hyperlink"/>
@@ -16645,8 +17041,8 @@
         </w:r>
       </w:hyperlink>
     </w:p>
-    <w:bookmarkEnd w:id="133"/>
-    <w:bookmarkStart w:id="135" w:name="ref-sprfmo2025mseworkshop"/>
+    <w:bookmarkEnd w:id="138"/>
+    <w:bookmarkStart w:id="140" w:name="ref-sprfmo2025mseworkshop"/>
     <w:p>
       <w:pPr>
         <w:pStyle w:val="Bibliography"/>
@@ -16715,7 +17111,7 @@
       <w:r>
         <w:t xml:space="preserve"> </w:t>
       </w:r>
-      <w:hyperlink r:id="rId134">
+      <w:hyperlink r:id="rId139">
         <w:r>
           <w:rPr>
             <w:rStyle w:val="Hyperlink"/>
@@ -16724,8 +17120,8 @@
         </w:r>
       </w:hyperlink>
     </w:p>
-    <w:bookmarkEnd w:id="135"/>
-    <w:bookmarkStart w:id="137" w:name="ref-sprfmo2025annex11"/>
+    <w:bookmarkEnd w:id="140"/>
+    <w:bookmarkStart w:id="142" w:name="ref-sprfmo2025annex11"/>
     <w:p>
       <w:pPr>
         <w:pStyle w:val="Bibliography"/>
@@ -16749,7 +17145,7 @@
       <w:r>
         <w:t xml:space="preserve"> </w:t>
       </w:r>
-      <w:hyperlink r:id="rId136">
+      <w:hyperlink r:id="rId141">
         <w:r>
           <w:rPr>
             <w:rStyle w:val="Hyperlink"/>
@@ -16758,9 +17154,9 @@
         </w:r>
       </w:hyperlink>
     </w:p>
-    <w:bookmarkEnd w:id="137"/>
-    <w:bookmarkEnd w:id="138"/>
-    <w:bookmarkEnd w:id="139"/>
+    <w:bookmarkEnd w:id="142"/>
+    <w:bookmarkEnd w:id="143"/>
+    <w:bookmarkEnd w:id="144"/>
     <w:sectPr>
       <w:footnotePr>
         <w:numRestart w:val="eachSect"/>

</xml_diff>

<commit_message>
Refine JM-WP-BM-01 discussion text
</commit_message>
<xml_diff>
--- a/docs/JM-WP-BM-01.docx
+++ b/docs/JM-WP-BM-01.docx
@@ -10603,7 +10603,37 @@
         <w:pStyle w:val="FirstParagraph"/>
       </w:pPr>
       <w:r>
-        <w:t xml:space="preserve">A second option is to reduce recruitment complexity by using one recruitment relationship per stock hypothesis, or one per stock under the two-stock model, without additional regime splitting unless that feature is shown to be essential for management performance. The preferred approach is therefore to fit a single Beverton-Holt relationship per stock in the simplified operating model, and then treat regime differences as a robustness test rather than a primary structural alternative.</w:t>
+        <w:t xml:space="preserve">Another option is to reduce recruitment complexity by using one recruitment</w:t>
+      </w:r>
+      <w:r>
+        <w:t xml:space="preserve"> </w:t>
+      </w:r>
+      <w:r>
+        <w:t xml:space="preserve">relationship per stock hypothesis, or one per stock under the two-stock model,</w:t>
+      </w:r>
+      <w:r>
+        <w:t xml:space="preserve"> </w:t>
+      </w:r>
+      <w:r>
+        <w:t xml:space="preserve">without additional regime splitting unless that feature is shown to be essential</w:t>
+      </w:r>
+      <w:r>
+        <w:t xml:space="preserve"> </w:t>
+      </w:r>
+      <w:r>
+        <w:t xml:space="preserve">for management performance. The preferred approach is therefore to fit a single</w:t>
+      </w:r>
+      <w:r>
+        <w:t xml:space="preserve"> </w:t>
+      </w:r>
+      <w:r>
+        <w:t xml:space="preserve">Beverton-Holt relationship per stock in the simplified operating model, and then</w:t>
+      </w:r>
+      <w:r>
+        <w:t xml:space="preserve"> </w:t>
+      </w:r>
+      <w:r>
+        <w:t xml:space="preserve">treat regime differences as a robustness test rather than a primary structural alternative.</w:t>
       </w:r>
     </w:p>
     <w:tbl>
@@ -10760,7 +10790,25 @@
         <w:pStyle w:val="FirstParagraph"/>
       </w:pPr>
       <w:r>
-        <w:t xml:space="preserve">A third option is to evaluate MSE performance relative to fixed biomass and harvest-rate benchmarks rather than dynamic reference points estimated from terminal-year conditions. This would make the interpretation of management performance much clearer while still allowing later comparison back to the SC13 assessment convention.</w:t>
+        <w:t xml:space="preserve">An issue also arose regarding fixed biomass and harvest-rate reference points</w:t>
+      </w:r>
+      <w:r>
+        <w:br/>
+      </w:r>
+      <w:r>
+        <w:t xml:space="preserve">rather than dynamic reference points estimated from terminal-year conditions.</w:t>
+      </w:r>
+      <w:r>
+        <w:t xml:space="preserve"> </w:t>
+      </w:r>
+      <w:r>
+        <w:t xml:space="preserve">This would make the interpretation of management performance much clearer</w:t>
+      </w:r>
+      <w:r>
+        <w:t xml:space="preserve"> </w:t>
+      </w:r>
+      <w:r>
+        <w:t xml:space="preserve">while still allowing later comparison back to the SC13 assessment convention.</w:t>
       </w:r>
     </w:p>
     <w:p>
@@ -10798,7 +10846,37 @@
         <w:t xml:space="preserve"> </w:t>
       </w:r>
       <w:r>
-        <w:t xml:space="preserve">shift with terminal-year selectivity and weight-at-age — is appropriate in the annual assessment context but problematic for MSE. If reference points change every year as a function of the operating model state, it becomes difficult to distinguish genuine changes in stock productivity from artefacts of the simulation design.</w:t>
+        <w:t xml:space="preserve">shift</w:t>
+      </w:r>
+      <w:r>
+        <w:t xml:space="preserve"> </w:t>
+      </w:r>
+      <w:r>
+        <w:t xml:space="preserve">with terminal-year selectivity and weight-at-age — is appropriate in the</w:t>
+      </w:r>
+      <w:r>
+        <w:t xml:space="preserve"> </w:t>
+      </w:r>
+      <w:r>
+        <w:t xml:space="preserve">annual assessment context but problematic for MSE. If reference points change</w:t>
+      </w:r>
+      <w:r>
+        <w:t xml:space="preserve"> </w:t>
+      </w:r>
+      <w:r>
+        <w:t xml:space="preserve">every year as a function of the operating model state, it becomes difficult</w:t>
+      </w:r>
+      <w:r>
+        <w:t xml:space="preserve"> </w:t>
+      </w:r>
+      <w:r>
+        <w:t xml:space="preserve">to distinguish genuine changes in stock productivity from artefacts of the</w:t>
+      </w:r>
+      <w:r>
+        <w:t xml:space="preserve"> </w:t>
+      </w:r>
+      <w:r>
+        <w:t xml:space="preserve">simulation design.</w:t>
       </w:r>
     </w:p>
     <w:tbl>
@@ -11227,7 +11305,25 @@
         <w:pStyle w:val="FirstParagraph"/>
       </w:pPr>
       <w:r>
-        <w:t xml:space="preserve">The next step is to construct and compare simplified alternatives that remain faithful to the broad SC13 assessment picture while avoiding the complicated issues identified during the July 2025 MSE workshop. The reviewer comments documented here provide a prioritized roadmap for that work.</w:t>
+        <w:t xml:space="preserve">In this document we constructed and compared simplified alternatives. There were some</w:t>
+      </w:r>
+      <w:r>
+        <w:t xml:space="preserve"> </w:t>
+      </w:r>
+      <w:r>
+        <w:t xml:space="preserve">important differences in the results but broadly they remain faithful to the</w:t>
+      </w:r>
+      <w:r>
+        <w:t xml:space="preserve"> </w:t>
+      </w:r>
+      <w:r>
+        <w:t xml:space="preserve">SC13 assessment picture. The next steps will be to evaluate the potential</w:t>
+      </w:r>
+      <w:r>
+        <w:t xml:space="preserve"> </w:t>
+      </w:r>
+      <w:r>
+        <w:t xml:space="preserve">improvements to the standardization of indices.</w:t>
       </w:r>
     </w:p>
     <w:bookmarkEnd w:id="100"/>

</xml_diff>

<commit_message>
Add h1_2.01.1 selectivity sensitivity
</commit_message>
<xml_diff>
--- a/docs/JM-WP-BM-01.docx
+++ b/docs/JM-WP-BM-01.docx
@@ -2264,7 +2264,7 @@
       </w:r>
     </w:p>
     <w:bookmarkEnd w:id="38"/>
-    <w:bookmarkStart w:id="111" w:name="proposed-simplified-alternatives"/>
+    <w:bookmarkStart w:id="121" w:name="proposed-simplified-alternatives"/>
     <w:p>
       <w:pPr>
         <w:pStyle w:val="Heading1"/>
@@ -2353,12 +2353,12 @@
               <w:tblLook w:firstRow="1" w:lastRow="0" w:firstColumn="0" w:lastColumn="0" w:noHBand="0" w:noVBand="0" w:val="0020"/>
             </w:tblPr>
             <w:tblGrid>
-              <w:gridCol w:w="186"/>
-              <w:gridCol w:w="373"/>
-              <w:gridCol w:w="373"/>
-              <w:gridCol w:w="2663"/>
-              <w:gridCol w:w="2429"/>
-              <w:gridCol w:w="1892"/>
+              <w:gridCol w:w="204"/>
+              <w:gridCol w:w="327"/>
+              <w:gridCol w:w="327"/>
+              <w:gridCol w:w="2333"/>
+              <w:gridCol w:w="2455"/>
+              <w:gridCol w:w="2271"/>
             </w:tblGrid>
             <w:tr>
               <w:trPr>
@@ -2608,6 +2608,101 @@
                   </w:pPr>
                   <w:r>
                     <w:t xml:space="preserve">Tests broad fishery selectivity simplification.</w:t>
+                  </w:r>
+                </w:p>
+              </w:tc>
+            </w:tr>
+            <w:tr>
+              <w:tc>
+                <w:tcPr/>
+                <w:p>
+                  <w:pPr>
+                    <w:pStyle w:val="Compact"/>
+                    <w:jc w:val="left"/>
+                    <w:jc w:val="center"/>
+                  </w:pPr>
+                  <w:r>
+                    <w:t xml:space="preserve">h1_2.01.1</w:t>
+                  </w:r>
+                </w:p>
+              </w:tc>
+              <w:tc>
+                <w:tcPr/>
+                <w:p>
+                  <w:pPr>
+                    <w:pStyle w:val="Compact"/>
+                    <w:jc w:val="left"/>
+                    <w:jc w:val="center"/>
+                  </w:pPr>
+                  <w:r>
+                    <w:t xml:space="preserve">h1_2.01</w:t>
+                  </w:r>
+                </w:p>
+              </w:tc>
+              <w:tc>
+                <w:tcPr/>
+                <w:p>
+                  <w:pPr>
+                    <w:pStyle w:val="Compact"/>
+                    <w:jc w:val="left"/>
+                    <w:jc w:val="center"/>
+                  </w:pPr>
+                  <w:r>
+                    <w:t xml:space="preserve">Single stock</w:t>
+                  </w:r>
+                </w:p>
+              </w:tc>
+              <w:tc>
+                <w:tcPr/>
+                <w:p>
+                  <w:pPr>
+                    <w:pStyle w:val="Compact"/>
+                    <w:jc w:val="left"/>
+                    <w:jc w:val="center"/>
+                  </w:pPr>
+                  <w:r>
+                    <w:t xml:space="preserve">Same reduced-index data as h1_2.01.</w:t>
+                  </w:r>
+                </w:p>
+              </w:tc>
+              <w:tc>
+                <w:tcPr/>
+                <w:p>
+                  <w:pPr>
+                    <w:pStyle w:val="Compact"/>
+                    <w:jc w:val="left"/>
+                    <w:jc w:val="center"/>
+                  </w:pPr>
+                  <w:r>
+                    <w:t xml:space="preserve">Keeps the</w:t>
+                  </w:r>
+                  <w:r>
+                    <w:t xml:space="preserve"> </w:t>
+                  </w:r>
+                  <w:r>
+                    <w:rPr>
+                      <w:rStyle w:val="VerbatimChar"/>
+                    </w:rPr>
+                    <w:t xml:space="preserve">h1_2.01</w:t>
+                  </w:r>
+                  <w:r>
+                    <w:t xml:space="preserve"> </w:t>
+                  </w:r>
+                  <w:r>
+                    <w:t xml:space="preserve">block structure except restores annual selectivity variability for the South-Central Chile fishery.</w:t>
+                  </w:r>
+                </w:p>
+              </w:tc>
+              <w:tc>
+                <w:tcPr/>
+                <w:p>
+                  <w:pPr>
+                    <w:pStyle w:val="Compact"/>
+                    <w:jc w:val="left"/>
+                    <w:jc w:val="center"/>
+                  </w:pPr>
+                  <w:r>
+                    <w:t xml:space="preserve">Tests whether restoring S-C Chile selectivity flexibility recovers fit within the block-selectivity framework.</w:t>
                   </w:r>
                 </w:p>
               </w:tc>
@@ -3487,7 +3582,7 @@
       </w:r>
     </w:p>
     <w:bookmarkEnd w:id="51"/>
-    <w:bookmarkStart w:id="88" w:name="simplified-selectivity-alternatives"/>
+    <w:bookmarkStart w:id="98" w:name="simplified-selectivity-alternatives"/>
     <w:p>
       <w:pPr>
         <w:pStyle w:val="Heading2"/>
@@ -3528,7 +3623,7 @@
         <w:t xml:space="preserve">The first dimension is the selectivity structure used during model fitting. One option is to replace long annual selectivity histories with a limited set of blocks for each fleet — for example a historical block, a modern block, and a current block. This preserves the broad evidence that fishery selectivity has changed over time while avoiding dozens of annual deviations that are difficult to interpret and project forward. Block-based selectivity is recommended as the primary simplified alternative for the MSE operating models. It provides an interpretable and tractable representation of selectivity change without the parameter proliferation of annual non-parametric estimation.</w:t>
       </w:r>
     </w:p>
-    <w:bookmarkStart w:id="87" w:name="X518721fe55853f821d30f8adb270621fb439ada"/>
+    <w:bookmarkStart w:id="97" w:name="X518721fe55853f821d30f8adb270621fb439ada"/>
     <w:p>
       <w:pPr>
         <w:pStyle w:val="Heading3"/>
@@ -4154,7 +4249,7 @@
       </w:r>
     </w:p>
     <w:bookmarkEnd w:id="57"/>
-    <w:bookmarkStart w:id="86" w:name="illustrative-fit-with-selectivity-blocks"/>
+    <w:bookmarkStart w:id="96" w:name="illustrative-fit-with-selectivity-blocks"/>
     <w:p>
       <w:pPr>
         <w:pStyle w:val="Heading4"/>
@@ -7888,10 +7983,2787 @@
         </w:tc>
       </w:tr>
     </w:tbl>
-    <w:bookmarkEnd w:id="86"/>
-    <w:bookmarkEnd w:id="87"/>
-    <w:bookmarkEnd w:id="88"/>
-    <w:bookmarkStart w:id="96" w:name="harmonized-northern-treatment"/>
+    <w:p>
+      <w:pPr>
+        <w:pStyle w:val="BodyText"/>
+      </w:pPr>
+      <w:r>
+        <w:t xml:space="preserve">The corresponding selectivity surfaces are shown in</w:t>
+      </w:r>
+      <w:r>
+        <w:t xml:space="preserve"> </w:t>
+      </w:r>
+      <w:hyperlink w:anchor="fig-selectivity-sc-allowance-compare">
+        <w:r>
+          <w:rPr>
+            <w:rStyle w:val="Hyperlink"/>
+          </w:rPr>
+          <w:t xml:space="preserve">Figure 8</w:t>
+        </w:r>
+      </w:hyperlink>
+      <w:r>
+        <w:t xml:space="preserve">. This comparison makes the construction of</w:t>
+      </w:r>
+      <w:r>
+        <w:t xml:space="preserve"> </w:t>
+      </w:r>
+      <w:r>
+        <w:rPr>
+          <w:rStyle w:val="VerbatimChar"/>
+        </w:rPr>
+        <w:t xml:space="preserve">h1_2.01.1</w:t>
+      </w:r>
+      <w:r>
+        <w:t xml:space="preserve"> </w:t>
+      </w:r>
+      <w:r>
+        <w:t xml:space="preserve">explicit: the North Chile, Far North, and Offshore fleets retain the block-based patterns from</w:t>
+      </w:r>
+      <w:r>
+        <w:t xml:space="preserve"> </w:t>
+      </w:r>
+      <w:r>
+        <w:rPr>
+          <w:rStyle w:val="VerbatimChar"/>
+        </w:rPr>
+        <w:t xml:space="preserve">h1_2.01</w:t>
+      </w:r>
+      <w:r>
+        <w:t xml:space="preserve">, while the South-Central Chile fishery reverts to the more flexible annual treatment. The main visual difference between the two panels is therefore concentrated in that one fishery, which is the intended diagnostic for whether the broader changes in</w:t>
+      </w:r>
+      <w:r>
+        <w:t xml:space="preserve"> </w:t>
+      </w:r>
+      <w:r>
+        <w:rPr>
+          <w:rStyle w:val="VerbatimChar"/>
+        </w:rPr>
+        <w:t xml:space="preserve">h1_2.01</w:t>
+      </w:r>
+      <w:r>
+        <w:t xml:space="preserve"> </w:t>
+      </w:r>
+      <w:r>
+        <w:t xml:space="preserve">are being driven primarily by S-C Chile selectivity regularization.</w:t>
+      </w:r>
+    </w:p>
+    <w:bookmarkStart w:id="94" w:name="fig-selectivity-sc-allowance-compare"/>
+    <w:tbl>
+      <w:tblPr>
+        <w:tblStyle w:val="Table"/>
+        <w:tblW w:type="pct" w:w="4900"/>
+        <w:tblLayout w:type="fixed"/>
+        <w:tblLook w:firstRow="0" w:lastRow="0" w:firstColumn="0" w:lastColumn="0" w:noHBand="0" w:noVBand="0" w:val="0000"/>
+      </w:tblPr>
+      <w:tblGrid>
+        <w:gridCol w:w="3880"/>
+        <w:gridCol w:w="3880"/>
+      </w:tblGrid>
+      <w:tr>
+        <w:tc>
+          <w:tcPr/>
+          <w:tbl>
+            <w:tblPr>
+              <w:tblStyle w:val="Table"/>
+              <w:tblW w:type="pct" w:w="4900"/>
+              <w:tblLayout w:type="fixed"/>
+              <w:tblLook w:firstRow="0" w:lastRow="0" w:firstColumn="0" w:lastColumn="0" w:noHBand="0" w:noVBand="0" w:val="0000"/>
+            </w:tblPr>
+            <w:tblGrid>
+              <w:gridCol w:w="7761"/>
+            </w:tblGrid>
+            <w:tr>
+              <w:tc>
+                <w:tcPr/>
+                <w:bookmarkStart w:id="89" w:name="fig-selectivity-sc-allowance-compare-1"/>
+                <w:p>
+                  <w:pPr>
+                    <w:pStyle w:val="Compact"/>
+                    <w:jc w:val="center"/>
+                    <w:jc w:val="left"/>
+                  </w:pPr>
+                  <w:r>
+                    <w:drawing>
+                      <wp:inline>
+                        <wp:extent cx="2971800" cy="4754880"/>
+                        <wp:effectExtent b="0" l="0" r="0" t="0"/>
+                        <wp:docPr descr="" title="" id="87" name="Picture"/>
+                        <a:graphic>
+                          <a:graphicData uri="http://schemas.openxmlformats.org/drawingml/2006/picture">
+                            <pic:pic>
+                              <pic:nvPicPr>
+                                <pic:cNvPr descr="JM-WP-BM-01_files/figure-docx/fig-selectivity-sc-allowance-compare-1.png" id="88" name="Picture"/>
+                                <pic:cNvPicPr>
+                                  <a:picLocks noChangeArrowheads="1" noChangeAspect="1"/>
+                                </pic:cNvPicPr>
+                              </pic:nvPicPr>
+                              <pic:blipFill>
+                                <a:blip r:embed="rId86"/>
+                                <a:stretch>
+                                  <a:fillRect/>
+                                </a:stretch>
+                              </pic:blipFill>
+                              <pic:spPr bwMode="auto">
+                                <a:xfrm>
+                                  <a:off x="0" y="0"/>
+                                  <a:ext cx="2971800" cy="4754880"/>
+                                </a:xfrm>
+                                <a:prstGeom prst="rect">
+                                  <a:avLst/>
+                                </a:prstGeom>
+                                <a:noFill/>
+                                <a:ln w="9525">
+                                  <a:noFill/>
+                                  <a:headEnd/>
+                                  <a:tailEnd/>
+                                </a:ln>
+                              </pic:spPr>
+                            </pic:pic>
+                          </a:graphicData>
+                        </a:graphic>
+                      </wp:inline>
+                    </w:drawing>
+                  </w:r>
+                </w:p>
+                <w:p>
+                  <w:pPr>
+                    <w:jc w:val="center"/>
+                    <w:jc w:val="left"/>
+                  </w:pPr>
+                  <w:pPr>
+                    <w:jc w:val="left"/>
+                    <w:spacing w:before="200"/>
+                    <w:pStyle w:val="ImageCaption"/>
+                  </w:pPr>
+                  <w:r>
+                    <w:t xml:space="preserve">(a) Model</w:t>
+                  </w:r>
+                  <w:r>
+                    <w:t xml:space="preserve"> </w:t>
+                  </w:r>
+                  <w:r>
+                    <w:rPr>
+                      <w:rStyle w:val="VerbatimChar"/>
+                    </w:rPr>
+                    <w:t xml:space="preserve">h1_2.01</w:t>
+                  </w:r>
+                </w:p>
+                <w:bookmarkEnd w:id="89"/>
+              </w:tc>
+            </w:tr>
+          </w:tbl>
+          <w:p/>
+        </w:tc>
+        <w:tc>
+          <w:tcPr/>
+          <w:tbl>
+            <w:tblPr>
+              <w:tblStyle w:val="Table"/>
+              <w:tblW w:type="pct" w:w="4900"/>
+              <w:tblLayout w:type="fixed"/>
+              <w:tblLook w:firstRow="0" w:lastRow="0" w:firstColumn="0" w:lastColumn="0" w:noHBand="0" w:noVBand="0" w:val="0000"/>
+            </w:tblPr>
+            <w:tblGrid>
+              <w:gridCol w:w="7761"/>
+            </w:tblGrid>
+            <w:tr>
+              <w:tc>
+                <w:tcPr/>
+                <w:bookmarkStart w:id="93" w:name="fig-selectivity-sc-allowance-compare-2"/>
+                <w:p>
+                  <w:pPr>
+                    <w:pStyle w:val="Compact"/>
+                    <w:jc w:val="center"/>
+                    <w:jc w:val="left"/>
+                  </w:pPr>
+                  <w:r>
+                    <w:drawing>
+                      <wp:inline>
+                        <wp:extent cx="2971800" cy="4754880"/>
+                        <wp:effectExtent b="0" l="0" r="0" t="0"/>
+                        <wp:docPr descr="" title="" id="91" name="Picture"/>
+                        <a:graphic>
+                          <a:graphicData uri="http://schemas.openxmlformats.org/drawingml/2006/picture">
+                            <pic:pic>
+                              <pic:nvPicPr>
+                                <pic:cNvPr descr="JM-WP-BM-01_files/figure-docx/fig-selectivity-sc-allowance-compare-2.png" id="92" name="Picture"/>
+                                <pic:cNvPicPr>
+                                  <a:picLocks noChangeArrowheads="1" noChangeAspect="1"/>
+                                </pic:cNvPicPr>
+                              </pic:nvPicPr>
+                              <pic:blipFill>
+                                <a:blip r:embed="rId90"/>
+                                <a:stretch>
+                                  <a:fillRect/>
+                                </a:stretch>
+                              </pic:blipFill>
+                              <pic:spPr bwMode="auto">
+                                <a:xfrm>
+                                  <a:off x="0" y="0"/>
+                                  <a:ext cx="2971800" cy="4754880"/>
+                                </a:xfrm>
+                                <a:prstGeom prst="rect">
+                                  <a:avLst/>
+                                </a:prstGeom>
+                                <a:noFill/>
+                                <a:ln w="9525">
+                                  <a:noFill/>
+                                  <a:headEnd/>
+                                  <a:tailEnd/>
+                                </a:ln>
+                              </pic:spPr>
+                            </pic:pic>
+                          </a:graphicData>
+                        </a:graphic>
+                      </wp:inline>
+                    </w:drawing>
+                  </w:r>
+                </w:p>
+                <w:p>
+                  <w:pPr>
+                    <w:jc w:val="center"/>
+                    <w:jc w:val="left"/>
+                  </w:pPr>
+                  <w:pPr>
+                    <w:jc w:val="left"/>
+                    <w:spacing w:before="200"/>
+                    <w:pStyle w:val="ImageCaption"/>
+                  </w:pPr>
+                  <w:r>
+                    <w:t xml:space="preserve">(b) Model</w:t>
+                  </w:r>
+                  <w:r>
+                    <w:t xml:space="preserve"> </w:t>
+                  </w:r>
+                  <w:r>
+                    <w:rPr>
+                      <w:rStyle w:val="VerbatimChar"/>
+                    </w:rPr>
+                    <w:t xml:space="preserve">h1_2.01.1</w:t>
+                  </w:r>
+                </w:p>
+                <w:bookmarkEnd w:id="93"/>
+              </w:tc>
+            </w:tr>
+          </w:tbl>
+          <w:p/>
+        </w:tc>
+      </w:tr>
+    </w:tbl>
+    <w:p>
+      <w:pPr>
+        <w:pStyle w:val="BodyText"/>
+      </w:pPr>
+      <w:pPr>
+        <w:spacing w:before="200"/>
+        <w:pStyle w:val="ImageCaption"/>
+      </w:pPr>
+      <w:r>
+        <w:t xml:space="preserve">Figure 8: Estimates of selectivity by fishery over time for Models</w:t>
+      </w:r>
+      <w:r>
+        <w:t xml:space="preserve"> </w:t>
+      </w:r>
+      <w:r>
+        <w:rPr>
+          <w:rStyle w:val="VerbatimChar"/>
+        </w:rPr>
+        <w:t xml:space="preserve">h1_2.01</w:t>
+      </w:r>
+      <w:r>
+        <w:t xml:space="preserve"> </w:t>
+      </w:r>
+      <w:r>
+        <w:t xml:space="preserve">and</w:t>
+      </w:r>
+      <w:r>
+        <w:t xml:space="preserve"> </w:t>
+      </w:r>
+      <w:r>
+        <w:rPr>
+          <w:rStyle w:val="VerbatimChar"/>
+        </w:rPr>
+        <w:t xml:space="preserve">h1_2.01.1</w:t>
+      </w:r>
+      <w:r>
+        <w:t xml:space="preserve">, shown in the same style as Figure 37 of the SC13 Jack Mackerel Technical Annex</w:t>
+      </w:r>
+      <w:r>
+        <w:t xml:space="preserve"> </w:t>
+      </w:r>
+      <w:r>
+        <w:t xml:space="preserve">(SPRFMO Scientific Committee, 2025)</w:t>
+      </w:r>
+      <w:r>
+        <w:t xml:space="preserve">.</w:t>
+      </w:r>
+    </w:p>
+    <w:bookmarkEnd w:id="94"/>
+    <w:p>
+      <w:pPr>
+        <w:pStyle w:val="BodyText"/>
+      </w:pPr>
+      <w:r>
+        <w:t xml:space="preserve">The more detailed fit comparison is shown in</w:t>
+      </w:r>
+      <w:r>
+        <w:t xml:space="preserve"> </w:t>
+      </w:r>
+      <w:hyperlink w:anchor="tbl-selectivity-scflex-like-components">
+        <w:r>
+          <w:rPr>
+            <w:rStyle w:val="Hyperlink"/>
+          </w:rPr>
+          <w:t xml:space="preserve">Table 4</w:t>
+        </w:r>
+      </w:hyperlink>
+      <w:r>
+        <w:t xml:space="preserve">. Restoring annual flexibility for the South-Central Chile fishery reduces the total negative log likelihood from</w:t>
+      </w:r>
+      <w:r>
+        <w:t xml:space="preserve"> </w:t>
+      </w:r>
+      <w:r>
+        <w:rPr>
+          <w:rStyle w:val="VerbatimChar"/>
+        </w:rPr>
+        <w:t xml:space="preserve">1544.1</w:t>
+      </w:r>
+      <w:r>
+        <w:t xml:space="preserve"> </w:t>
+      </w:r>
+      <w:r>
+        <w:t xml:space="preserve">in</w:t>
+      </w:r>
+      <w:r>
+        <w:t xml:space="preserve"> </w:t>
+      </w:r>
+      <w:r>
+        <w:rPr>
+          <w:rStyle w:val="VerbatimChar"/>
+        </w:rPr>
+        <w:t xml:space="preserve">h1_2.01</w:t>
+      </w:r>
+      <w:r>
+        <w:t xml:space="preserve"> </w:t>
+      </w:r>
+      <w:r>
+        <w:t xml:space="preserve">to</w:t>
+      </w:r>
+      <w:r>
+        <w:t xml:space="preserve"> </w:t>
+      </w:r>
+      <w:r>
+        <w:rPr>
+          <w:rStyle w:val="VerbatimChar"/>
+        </w:rPr>
+        <w:t xml:space="preserve">1364.8</w:t>
+      </w:r>
+      <w:r>
+        <w:t xml:space="preserve"> </w:t>
+      </w:r>
+      <w:r>
+        <w:t xml:space="preserve">in</w:t>
+      </w:r>
+      <w:r>
+        <w:t xml:space="preserve"> </w:t>
+      </w:r>
+      <w:r>
+        <w:rPr>
+          <w:rStyle w:val="VerbatimChar"/>
+        </w:rPr>
+        <w:t xml:space="preserve">h1_2.01.1</w:t>
+      </w:r>
+      <w:r>
+        <w:t xml:space="preserve">, while increasing the parameter count from</w:t>
+      </w:r>
+      <w:r>
+        <w:t xml:space="preserve"> </w:t>
+      </w:r>
+      <w:r>
+        <w:rPr>
+          <w:rStyle w:val="VerbatimChar"/>
+        </w:rPr>
+        <w:t xml:space="preserve">480</w:t>
+      </w:r>
+      <w:r>
+        <w:t xml:space="preserve"> </w:t>
+      </w:r>
+      <w:r>
+        <w:t xml:space="preserve">to</w:t>
+      </w:r>
+      <w:r>
+        <w:t xml:space="preserve"> </w:t>
+      </w:r>
+      <w:r>
+        <w:rPr>
+          <w:rStyle w:val="VerbatimChar"/>
+        </w:rPr>
+        <w:t xml:space="preserve">870</w:t>
+      </w:r>
+      <w:r>
+        <w:t xml:space="preserve">. The largest direct improvement is in the South-Central Chile fishery age-composition term, which falls from about</w:t>
+      </w:r>
+      <w:r>
+        <w:t xml:space="preserve"> </w:t>
+      </w:r>
+      <w:r>
+        <w:rPr>
+          <w:rStyle w:val="VerbatimChar"/>
+        </w:rPr>
+        <w:t xml:space="preserve">307.3</w:t>
+      </w:r>
+      <w:r>
+        <w:t xml:space="preserve"> </w:t>
+      </w:r>
+      <w:r>
+        <w:t xml:space="preserve">to</w:t>
+      </w:r>
+      <w:r>
+        <w:t xml:space="preserve"> </w:t>
+      </w:r>
+      <w:r>
+        <w:rPr>
+          <w:rStyle w:val="VerbatimChar"/>
+        </w:rPr>
+        <w:t xml:space="preserve">139.2</w:t>
+      </w:r>
+      <w:r>
+        <w:t xml:space="preserve">, close to the</w:t>
+      </w:r>
+      <w:r>
+        <w:t xml:space="preserve"> </w:t>
+      </w:r>
+      <w:r>
+        <w:rPr>
+          <w:rStyle w:val="VerbatimChar"/>
+        </w:rPr>
+        <w:t xml:space="preserve">h1_2.00</w:t>
+      </w:r>
+      <w:r>
+        <w:t xml:space="preserve"> </w:t>
+      </w:r>
+      <w:r>
+        <w:t xml:space="preserve">value of</w:t>
+      </w:r>
+      <w:r>
+        <w:t xml:space="preserve"> </w:t>
+      </w:r>
+      <w:r>
+        <w:rPr>
+          <w:rStyle w:val="VerbatimChar"/>
+        </w:rPr>
+        <w:t xml:space="preserve">124.0</w:t>
+      </w:r>
+      <w:r>
+        <w:t xml:space="preserve">. Aggregate retained-index fit also improves materially, from about</w:t>
+      </w:r>
+      <w:r>
+        <w:t xml:space="preserve"> </w:t>
+      </w:r>
+      <w:r>
+        <w:rPr>
+          <w:rStyle w:val="VerbatimChar"/>
+        </w:rPr>
+        <w:t xml:space="preserve">258.0</w:t>
+      </w:r>
+      <w:r>
+        <w:t xml:space="preserve"> </w:t>
+      </w:r>
+      <w:r>
+        <w:t xml:space="preserve">to</w:t>
+      </w:r>
+      <w:r>
+        <w:t xml:space="preserve"> </w:t>
+      </w:r>
+      <w:r>
+        <w:rPr>
+          <w:rStyle w:val="VerbatimChar"/>
+        </w:rPr>
+        <w:t xml:space="preserve">185.9</w:t>
+      </w:r>
+      <w:r>
+        <w:t xml:space="preserve">, although fishery length compositions remain much worse than in</w:t>
+      </w:r>
+      <w:r>
+        <w:t xml:space="preserve"> </w:t>
+      </w:r>
+      <w:r>
+        <w:rPr>
+          <w:rStyle w:val="VerbatimChar"/>
+        </w:rPr>
+        <w:t xml:space="preserve">h1_2.00</w:t>
+      </w:r>
+      <w:r>
+        <w:t xml:space="preserve">. Taken together, the figure and table suggest that a substantial part of the penalty in</w:t>
+      </w:r>
+      <w:r>
+        <w:t xml:space="preserve"> </w:t>
+      </w:r>
+      <w:r>
+        <w:rPr>
+          <w:rStyle w:val="VerbatimChar"/>
+        </w:rPr>
+        <w:t xml:space="preserve">h1_2.01</w:t>
+      </w:r>
+      <w:r>
+        <w:t xml:space="preserve"> </w:t>
+      </w:r>
+      <w:r>
+        <w:t xml:space="preserve">comes from over-constraining the S-C Chile selectivity history, but not all of it.</w:t>
+      </w:r>
+    </w:p>
+    <w:tbl>
+      <w:tblPr>
+        <w:tblStyle w:val="Table"/>
+        <w:tblW w:type="pct" w:w="5000"/>
+        <w:tblLayout w:type="fixed"/>
+        <w:tblLook w:firstRow="0" w:lastRow="0" w:firstColumn="0" w:lastColumn="0" w:noHBand="0" w:noVBand="0" w:val="0000"/>
+      </w:tblPr>
+      <w:tblGrid>
+        <w:gridCol w:w="7920"/>
+      </w:tblGrid>
+      <w:tr>
+        <w:tc>
+          <w:tcPr/>
+          <w:bookmarkStart w:id="95" w:name="tbl-selectivity-scflex-like-components"/>
+          <w:p>
+            <w:pPr>
+              <w:jc w:val="center"/>
+            </w:pPr>
+            <w:pPr>
+              <w:jc w:val="left"/>
+              <w:spacing w:before="200"/>
+              <w:pStyle w:val="ImageCaption"/>
+            </w:pPr>
+            <w:r>
+              <w:t xml:space="preserve">Table 4: Negative-log-likelihood components and estimated parameter counts for the reduced-index sensitivity (</w:t>
+            </w:r>
+            <w:r>
+              <w:rPr>
+                <w:rStyle w:val="VerbatimChar"/>
+              </w:rPr>
+              <w:t xml:space="preserve">h1_2.00</w:t>
+            </w:r>
+            <w:r>
+              <w:t xml:space="preserve">), the reduced-index model with fishery selectivity blocks (</w:t>
+            </w:r>
+            <w:r>
+              <w:rPr>
+                <w:rStyle w:val="VerbatimChar"/>
+              </w:rPr>
+              <w:t xml:space="preserve">h1_2.01</w:t>
+            </w:r>
+            <w:r>
+              <w:t xml:space="preserve">), and the intermediate selectivity variant (</w:t>
+            </w:r>
+            <w:r>
+              <w:rPr>
+                <w:rStyle w:val="VerbatimChar"/>
+              </w:rPr>
+              <w:t xml:space="preserve">h1_2.01.1</w:t>
+            </w:r>
+            <w:r>
+              <w:t xml:space="preserve">) in which the South-Central Chile fishery retains the annual selectivity variability allowance. The aggregate and component index rows include only the retained comparable series: Acoustic North, Chile CPUE, Peru CPUE, and Offshore CPUE.</w:t>
+            </w:r>
+          </w:p>
+          <w:tbl xmlns:w="http://schemas.openxmlformats.org/wordprocessingml/2006/main" xmlns:wp="http://schemas.openxmlformats.org/drawingml/2006/wordprocessingDrawing" xmlns:r="http://schemas.openxmlformats.org/officeDocument/2006/relationships" xmlns:w14="http://schemas.microsoft.com/office/word/2010/wordml">
+            <w:tblPr>
+              <w:tblCellMar>
+                <w:top w:w="0" w:type="dxa"/>
+                <w:bottom w:w="0" w:type="dxa"/>
+                <w:start w:w="60" w:type="dxa"/>
+                <w:end w:w="60" w:type="dxa"/>
+              </w:tblCellMar>
+              <w:tblW w:type="auto" w:w="0"/>
+              <w:tblLook w:firstRow="0" w:lastRow="0" w:firstColumn="0" w:lastColumn="0" w:noHBand="0" w:noVBand="0"/>
+              <w:jc w:val="center"/>
+            </w:tblPr>
+            <w:tr>
+              <w:trPr>
+                <w:cantSplit/>
+                <w:tblHeader/>
+              </w:trPr>
+              <w:tc>
+                <w:tcPr>
+                  <w:tcBorders>
+                    <w:top w:val="single" w:sz="16" w:space="0" w:color="D3D3D3"/>
+                    <w:bottom w:val="single" w:sz="16" w:space="0" w:color="D3D3D3"/>
+                    <w:start w:val="single" w:space="0" w:color="D3D3D3"/>
+                  </w:tcBorders>
+                </w:tcPr>
+                <w:p>
+                  <w:pPr>
+                    <w:spacing w:before="0" w:after="60"/>
+                    <w:keepNext/>
+                    <w:jc w:val="start"/>
+                  </w:pPr>
+                  <w:r>
+                    <w:rPr>
+                      <w:rFonts w:ascii="Calibri" w:hAnsi="Calibri"/>
+                      <w:sz w:val="20"/>
+                    </w:rPr>
+                    <w:t xml:space="default">Component</w:t>
+                  </w:r>
+                </w:p>
+              </w:tc>
+              <w:tc>
+                <w:tcPr>
+                  <w:tcBorders>
+                    <w:top w:val="single" w:sz="16" w:space="0" w:color="D3D3D3"/>
+                    <w:bottom w:val="single" w:sz="16" w:space="0" w:color="D3D3D3"/>
+                  </w:tcBorders>
+                </w:tcPr>
+                <w:p>
+                  <w:pPr>
+                    <w:spacing w:before="0" w:after="60"/>
+                    <w:keepNext/>
+                    <w:jc w:val="end"/>
+                  </w:pPr>
+                  <w:r>
+                    <w:rPr>
+                      <w:rFonts w:ascii="Calibri" w:hAnsi="Calibri"/>
+                      <w:sz w:val="20"/>
+                    </w:rPr>
+                    <w:t xml:space="default">h1_2.00</w:t>
+                  </w:r>
+                </w:p>
+              </w:tc>
+              <w:tc>
+                <w:tcPr>
+                  <w:tcBorders>
+                    <w:top w:val="single" w:sz="16" w:space="0" w:color="D3D3D3"/>
+                    <w:bottom w:val="single" w:sz="16" w:space="0" w:color="D3D3D3"/>
+                  </w:tcBorders>
+                </w:tcPr>
+                <w:p>
+                  <w:pPr>
+                    <w:spacing w:before="0" w:after="60"/>
+                    <w:keepNext/>
+                    <w:jc w:val="end"/>
+                  </w:pPr>
+                  <w:r>
+                    <w:rPr>
+                      <w:rFonts w:ascii="Calibri" w:hAnsi="Calibri"/>
+                      <w:sz w:val="20"/>
+                    </w:rPr>
+                    <w:t xml:space="default">h1_2.01</w:t>
+                  </w:r>
+                </w:p>
+              </w:tc>
+              <w:tc>
+                <w:tcPr>
+                  <w:tcBorders>
+                    <w:top w:val="single" w:sz="16" w:space="0" w:color="D3D3D3"/>
+                    <w:bottom w:val="single" w:sz="16" w:space="0" w:color="D3D3D3"/>
+                    <w:end w:val="single" w:space="0" w:color="D3D3D3"/>
+                  </w:tcBorders>
+                </w:tcPr>
+                <w:p>
+                  <w:pPr>
+                    <w:spacing w:before="0" w:after="60"/>
+                    <w:keepNext/>
+                    <w:jc w:val="end"/>
+                  </w:pPr>
+                  <w:r>
+                    <w:rPr>
+                      <w:rFonts w:ascii="Calibri" w:hAnsi="Calibri"/>
+                      <w:sz w:val="20"/>
+                    </w:rPr>
+                    <w:t xml:space="default">h1_2.01.1</w:t>
+                  </w:r>
+                </w:p>
+              </w:tc>
+            </w:tr>
+            <w:tr>
+              <w:trPr>
+                <w:cantSplit/>
+              </w:trPr>
+              <w:tc>
+                <w:tcPr>
+                  <w:tcBorders>
+                    <w:top w:val="single" w:space="0" w:color="D3D3D3"/>
+                    <w:bottom w:val="single" w:space="0" w:color="D3D3D3"/>
+                    <w:start w:val="single" w:space="0" w:color="D3D3D3"/>
+                    <w:end w:val="single" w:space="0" w:color="D3D3D3"/>
+                  </w:tcBorders>
+                </w:tcPr>
+                <w:p>
+                  <w:pPr>
+                    <w:spacing w:before="0" w:after="60"/>
+                    <w:keepNext/>
+                    <w:jc w:val="start"/>
+                  </w:pPr>
+                  <w:r>
+                    <w:rPr>
+                      <w:rFonts w:ascii="Calibri" w:hAnsi="Calibri"/>
+                      <w:sz w:val="20"/>
+                    </w:rPr>
+                    <w:t xml:space="default">Catch likelihood</w:t>
+                  </w:r>
+                </w:p>
+              </w:tc>
+              <w:tc>
+                <w:tcPr>
+                  <w:tcBorders>
+                    <w:top w:val="single" w:space="0" w:color="D3D3D3"/>
+                    <w:bottom w:val="single" w:space="0" w:color="D3D3D3"/>
+                    <w:start w:val="single" w:space="0" w:color="D3D3D3"/>
+                    <w:end w:val="single" w:space="0" w:color="D3D3D3"/>
+                  </w:tcBorders>
+                  <w:shd w:val="clear" w:color="auto" w:fill="FCAE91"/>
+                </w:tcPr>
+                <w:p>
+                  <w:pPr>
+                    <w:spacing w:before="0" w:after="60"/>
+                    <w:keepNext/>
+                    <w:jc w:val="end"/>
+                  </w:pPr>
+                  <w:r>
+                    <w:rPr>
+                      <w:rFonts w:ascii="Calibri" w:hAnsi="Calibri"/>
+                      <w:sz w:val="20"/>
+                    </w:rPr>
+                    <w:t xml:space="default">0.8</w:t>
+                  </w:r>
+                </w:p>
+              </w:tc>
+              <w:tc>
+                <w:tcPr>
+                  <w:tcBorders>
+                    <w:top w:val="single" w:space="0" w:color="D3D3D3"/>
+                    <w:bottom w:val="single" w:space="0" w:color="D3D3D3"/>
+                    <w:start w:val="single" w:space="0" w:color="D3D3D3"/>
+                    <w:end w:val="single" w:space="0" w:color="D3D3D3"/>
+                  </w:tcBorders>
+                  <w:shd w:val="clear" w:color="auto" w:fill="FCAF92"/>
+                </w:tcPr>
+                <w:p>
+                  <w:pPr>
+                    <w:spacing w:before="0" w:after="60"/>
+                    <w:keepNext/>
+                    <w:jc w:val="end"/>
+                  </w:pPr>
+                  <w:r>
+                    <w:rPr>
+                      <w:rFonts w:ascii="Calibri" w:hAnsi="Calibri"/>
+                      <w:sz w:val="20"/>
+                    </w:rPr>
+                    <w:t xml:space="default">0.8</w:t>
+                  </w:r>
+                </w:p>
+              </w:tc>
+              <w:tc>
+                <w:tcPr>
+                  <w:tcBorders>
+                    <w:top w:val="single" w:space="0" w:color="D3D3D3"/>
+                    <w:bottom w:val="single" w:space="0" w:color="D3D3D3"/>
+                    <w:start w:val="single" w:space="0" w:color="D3D3D3"/>
+                    <w:end w:val="single" w:space="0" w:color="D3D3D3"/>
+                  </w:tcBorders>
+                  <w:shd w:val="clear" w:color="auto" w:fill="FFF5F0"/>
+                </w:tcPr>
+                <w:p>
+                  <w:pPr>
+                    <w:spacing w:before="0" w:after="60"/>
+                    <w:keepNext/>
+                    <w:jc w:val="end"/>
+                  </w:pPr>
+                  <w:r>
+                    <w:rPr>
+                      <w:rFonts w:ascii="Calibri" w:hAnsi="Calibri"/>
+                      <w:sz w:val="20"/>
+                    </w:rPr>
+                    <w:t xml:space="default">1.1</w:t>
+                  </w:r>
+                </w:p>
+              </w:tc>
+            </w:tr>
+            <w:tr>
+              <w:trPr>
+                <w:cantSplit/>
+              </w:trPr>
+              <w:tc>
+                <w:tcPr>
+                  <w:tcBorders>
+                    <w:top w:val="single" w:space="0" w:color="D3D3D3"/>
+                    <w:bottom w:val="single" w:space="0" w:color="D3D3D3"/>
+                    <w:start w:val="single" w:space="0" w:color="D3D3D3"/>
+                    <w:end w:val="single" w:space="0" w:color="D3D3D3"/>
+                  </w:tcBorders>
+                </w:tcPr>
+                <w:p>
+                  <w:pPr>
+                    <w:spacing w:before="0" w:after="60"/>
+                    <w:keepNext/>
+                    <w:jc w:val="start"/>
+                  </w:pPr>
+                  <w:r>
+                    <w:rPr>
+                      <w:rFonts w:ascii="Calibri" w:hAnsi="Calibri"/>
+                      <w:sz w:val="20"/>
+                    </w:rPr>
+                    <w:t xml:space="default">Fishery age compositions</w:t>
+                  </w:r>
+                </w:p>
+              </w:tc>
+              <w:tc>
+                <w:tcPr>
+                  <w:tcBorders>
+                    <w:top w:val="single" w:space="0" w:color="D3D3D3"/>
+                    <w:bottom w:val="single" w:space="0" w:color="D3D3D3"/>
+                    <w:start w:val="single" w:space="0" w:color="D3D3D3"/>
+                    <w:end w:val="single" w:space="0" w:color="D3D3D3"/>
+                  </w:tcBorders>
+                  <w:shd w:val="clear" w:color="auto" w:fill="FCAE91"/>
+                </w:tcPr>
+                <w:p>
+                  <w:pPr>
+                    <w:spacing w:before="0" w:after="60"/>
+                    <w:keepNext/>
+                    <w:jc w:val="end"/>
+                  </w:pPr>
+                  <w:r>
+                    <w:rPr>
+                      <w:rFonts w:ascii="Calibri" w:hAnsi="Calibri"/>
+                      <w:sz w:val="20"/>
+                    </w:rPr>
+                    <w:t xml:space="default">262.9</w:t>
+                  </w:r>
+                </w:p>
+              </w:tc>
+              <w:tc>
+                <w:tcPr>
+                  <w:tcBorders>
+                    <w:top w:val="single" w:space="0" w:color="D3D3D3"/>
+                    <w:bottom w:val="single" w:space="0" w:color="D3D3D3"/>
+                    <w:start w:val="single" w:space="0" w:color="D3D3D3"/>
+                    <w:end w:val="single" w:space="0" w:color="D3D3D3"/>
+                  </w:tcBorders>
+                  <w:shd w:val="clear" w:color="auto" w:fill="FFF5F0"/>
+                </w:tcPr>
+                <w:p>
+                  <w:pPr>
+                    <w:spacing w:before="0" w:after="60"/>
+                    <w:keepNext/>
+                    <w:jc w:val="end"/>
+                  </w:pPr>
+                  <w:r>
+                    <w:rPr>
+                      <w:rFonts w:ascii="Calibri" w:hAnsi="Calibri"/>
+                      <w:sz w:val="20"/>
+                    </w:rPr>
+                    <w:t xml:space="default">549.8</w:t>
+                  </w:r>
+                </w:p>
+              </w:tc>
+              <w:tc>
+                <w:tcPr>
+                  <w:tcBorders>
+                    <w:top w:val="single" w:space="0" w:color="D3D3D3"/>
+                    <w:bottom w:val="single" w:space="0" w:color="D3D3D3"/>
+                    <w:start w:val="single" w:space="0" w:color="D3D3D3"/>
+                    <w:end w:val="single" w:space="0" w:color="D3D3D3"/>
+                  </w:tcBorders>
+                  <w:shd w:val="clear" w:color="auto" w:fill="FDCAB6"/>
+                </w:tcPr>
+                <w:p>
+                  <w:pPr>
+                    <w:spacing w:before="0" w:after="60"/>
+                    <w:keepNext/>
+                    <w:jc w:val="end"/>
+                  </w:pPr>
+                  <w:r>
+                    <w:rPr>
+                      <w:rFonts w:ascii="Calibri" w:hAnsi="Calibri"/>
+                      <w:sz w:val="20"/>
+                    </w:rPr>
+                    <w:t xml:space="default">374.8</w:t>
+                  </w:r>
+                </w:p>
+              </w:tc>
+            </w:tr>
+            <w:tr>
+              <w:trPr>
+                <w:cantSplit/>
+              </w:trPr>
+              <w:tc>
+                <w:tcPr>
+                  <w:tcBorders>
+                    <w:top w:val="single" w:space="0" w:color="D3D3D3"/>
+                    <w:bottom w:val="single" w:space="0" w:color="D3D3D3"/>
+                    <w:start w:val="single" w:space="0" w:color="D3D3D3"/>
+                    <w:end w:val="single" w:space="0" w:color="D3D3D3"/>
+                  </w:tcBorders>
+                </w:tcPr>
+                <w:p>
+                  <w:pPr>
+                    <w:spacing w:before="0" w:after="60"/>
+                    <w:keepNext/>
+                    <w:jc w:val="start"/>
+                  </w:pPr>
+                  <w:r>
+                    <w:rPr>
+                      <w:rFonts w:ascii="Calibri" w:hAnsi="Calibri"/>
+                      <w:sz w:val="20"/>
+                    </w:rPr>
+                    <w:t xml:space="default"> North Chile fishery age comps</w:t>
+                  </w:r>
+                </w:p>
+              </w:tc>
+              <w:tc>
+                <w:tcPr>
+                  <w:tcBorders>
+                    <w:top w:val="single" w:space="0" w:color="D3D3D3"/>
+                    <w:bottom w:val="single" w:space="0" w:color="D3D3D3"/>
+                    <w:start w:val="single" w:space="0" w:color="D3D3D3"/>
+                    <w:end w:val="single" w:space="0" w:color="D3D3D3"/>
+                  </w:tcBorders>
+                  <w:shd w:val="clear" w:color="auto" w:fill="FCAE91"/>
+                </w:tcPr>
+                <w:p>
+                  <w:pPr>
+                    <w:spacing w:before="0" w:after="60"/>
+                    <w:keepNext/>
+                    <w:jc w:val="end"/>
+                  </w:pPr>
+                  <w:r>
+                    <w:rPr>
+                      <w:rFonts w:ascii="Calibri" w:hAnsi="Calibri"/>
+                      <w:sz w:val="20"/>
+                    </w:rPr>
+                    <w:t xml:space="default">113.2</w:t>
+                  </w:r>
+                </w:p>
+              </w:tc>
+              <w:tc>
+                <w:tcPr>
+                  <w:tcBorders>
+                    <w:top w:val="single" w:space="0" w:color="D3D3D3"/>
+                    <w:bottom w:val="single" w:space="0" w:color="D3D3D3"/>
+                    <w:start w:val="single" w:space="0" w:color="D3D3D3"/>
+                    <w:end w:val="single" w:space="0" w:color="D3D3D3"/>
+                  </w:tcBorders>
+                  <w:shd w:val="clear" w:color="auto" w:fill="FFF5F0"/>
+                </w:tcPr>
+                <w:p>
+                  <w:pPr>
+                    <w:spacing w:before="0" w:after="60"/>
+                    <w:keepNext/>
+                    <w:jc w:val="end"/>
+                  </w:pPr>
+                  <w:r>
+                    <w:rPr>
+                      <w:rFonts w:ascii="Calibri" w:hAnsi="Calibri"/>
+                      <w:sz w:val="20"/>
+                    </w:rPr>
+                    <w:t xml:space="default">202.8</w:t>
+                  </w:r>
+                </w:p>
+              </w:tc>
+              <w:tc>
+                <w:tcPr>
+                  <w:tcBorders>
+                    <w:top w:val="single" w:space="0" w:color="D3D3D3"/>
+                    <w:bottom w:val="single" w:space="0" w:color="D3D3D3"/>
+                    <w:start w:val="single" w:space="0" w:color="D3D3D3"/>
+                    <w:end w:val="single" w:space="0" w:color="D3D3D3"/>
+                  </w:tcBorders>
+                  <w:shd w:val="clear" w:color="auto" w:fill="FFF2EC"/>
+                </w:tcPr>
+                <w:p>
+                  <w:pPr>
+                    <w:spacing w:before="0" w:after="60"/>
+                    <w:keepNext/>
+                    <w:jc w:val="end"/>
+                  </w:pPr>
+                  <w:r>
+                    <w:rPr>
+                      <w:rFonts w:ascii="Calibri" w:hAnsi="Calibri"/>
+                      <w:sz w:val="20"/>
+                    </w:rPr>
+                    <w:t xml:space="default">199.0</w:t>
+                  </w:r>
+                </w:p>
+              </w:tc>
+            </w:tr>
+            <w:tr>
+              <w:trPr>
+                <w:cantSplit/>
+              </w:trPr>
+              <w:tc>
+                <w:tcPr>
+                  <w:tcBorders>
+                    <w:top w:val="single" w:space="0" w:color="D3D3D3"/>
+                    <w:bottom w:val="single" w:space="0" w:color="D3D3D3"/>
+                    <w:start w:val="single" w:space="0" w:color="D3D3D3"/>
+                    <w:end w:val="single" w:space="0" w:color="D3D3D3"/>
+                  </w:tcBorders>
+                </w:tcPr>
+                <w:p>
+                  <w:pPr>
+                    <w:spacing w:before="0" w:after="60"/>
+                    <w:keepNext/>
+                    <w:jc w:val="start"/>
+                  </w:pPr>
+                  <w:r>
+                    <w:rPr>
+                      <w:rFonts w:ascii="Calibri" w:hAnsi="Calibri"/>
+                      <w:sz w:val="20"/>
+                    </w:rPr>
+                    <w:t xml:space="default"> S-C Chile fishery age comps</w:t>
+                  </w:r>
+                </w:p>
+              </w:tc>
+              <w:tc>
+                <w:tcPr>
+                  <w:tcBorders>
+                    <w:top w:val="single" w:space="0" w:color="D3D3D3"/>
+                    <w:bottom w:val="single" w:space="0" w:color="D3D3D3"/>
+                    <w:start w:val="single" w:space="0" w:color="D3D3D3"/>
+                    <w:end w:val="single" w:space="0" w:color="D3D3D3"/>
+                  </w:tcBorders>
+                  <w:shd w:val="clear" w:color="auto" w:fill="FCAE91"/>
+                </w:tcPr>
+                <w:p>
+                  <w:pPr>
+                    <w:spacing w:before="0" w:after="60"/>
+                    <w:keepNext/>
+                    <w:jc w:val="end"/>
+                  </w:pPr>
+                  <w:r>
+                    <w:rPr>
+                      <w:rFonts w:ascii="Calibri" w:hAnsi="Calibri"/>
+                      <w:sz w:val="20"/>
+                    </w:rPr>
+                    <w:t xml:space="default">124.0</w:t>
+                  </w:r>
+                </w:p>
+              </w:tc>
+              <w:tc>
+                <w:tcPr>
+                  <w:tcBorders>
+                    <w:top w:val="single" w:space="0" w:color="D3D3D3"/>
+                    <w:bottom w:val="single" w:space="0" w:color="D3D3D3"/>
+                    <w:start w:val="single" w:space="0" w:color="D3D3D3"/>
+                    <w:end w:val="single" w:space="0" w:color="D3D3D3"/>
+                  </w:tcBorders>
+                  <w:shd w:val="clear" w:color="auto" w:fill="FFF5F0"/>
+                </w:tcPr>
+                <w:p>
+                  <w:pPr>
+                    <w:spacing w:before="0" w:after="60"/>
+                    <w:keepNext/>
+                    <w:jc w:val="end"/>
+                  </w:pPr>
+                  <w:r>
+                    <w:rPr>
+                      <w:rFonts w:ascii="Calibri" w:hAnsi="Calibri"/>
+                      <w:sz w:val="20"/>
+                    </w:rPr>
+                    <w:t xml:space="default">307.3</w:t>
+                  </w:r>
+                </w:p>
+              </w:tc>
+              <w:tc>
+                <w:tcPr>
+                  <w:tcBorders>
+                    <w:top w:val="single" w:space="0" w:color="D3D3D3"/>
+                    <w:bottom w:val="single" w:space="0" w:color="D3D3D3"/>
+                    <w:start w:val="single" w:space="0" w:color="D3D3D3"/>
+                    <w:end w:val="single" w:space="0" w:color="D3D3D3"/>
+                  </w:tcBorders>
+                  <w:shd w:val="clear" w:color="auto" w:fill="FCB499"/>
+                </w:tcPr>
+                <w:p>
+                  <w:pPr>
+                    <w:spacing w:before="0" w:after="60"/>
+                    <w:keepNext/>
+                    <w:jc w:val="end"/>
+                  </w:pPr>
+                  <w:r>
+                    <w:rPr>
+                      <w:rFonts w:ascii="Calibri" w:hAnsi="Calibri"/>
+                      <w:sz w:val="20"/>
+                    </w:rPr>
+                    <w:t xml:space="default">139.2</w:t>
+                  </w:r>
+                </w:p>
+              </w:tc>
+            </w:tr>
+            <w:tr>
+              <w:trPr>
+                <w:cantSplit/>
+              </w:trPr>
+              <w:tc>
+                <w:tcPr>
+                  <w:tcBorders>
+                    <w:top w:val="single" w:space="0" w:color="D3D3D3"/>
+                    <w:bottom w:val="single" w:space="0" w:color="D3D3D3"/>
+                    <w:start w:val="single" w:space="0" w:color="D3D3D3"/>
+                    <w:end w:val="single" w:space="0" w:color="D3D3D3"/>
+                  </w:tcBorders>
+                </w:tcPr>
+                <w:p>
+                  <w:pPr>
+                    <w:spacing w:before="0" w:after="60"/>
+                    <w:keepNext/>
+                    <w:jc w:val="start"/>
+                  </w:pPr>
+                  <w:r>
+                    <w:rPr>
+                      <w:rFonts w:ascii="Calibri" w:hAnsi="Calibri"/>
+                      <w:sz w:val="20"/>
+                    </w:rPr>
+                    <w:t xml:space="default"> Offshore trawl fishery age comps</w:t>
+                  </w:r>
+                </w:p>
+              </w:tc>
+              <w:tc>
+                <w:tcPr>
+                  <w:tcBorders>
+                    <w:top w:val="single" w:space="0" w:color="D3D3D3"/>
+                    <w:bottom w:val="single" w:space="0" w:color="D3D3D3"/>
+                    <w:start w:val="single" w:space="0" w:color="D3D3D3"/>
+                    <w:end w:val="single" w:space="0" w:color="D3D3D3"/>
+                  </w:tcBorders>
+                  <w:shd w:val="clear" w:color="auto" w:fill="FCAE91"/>
+                </w:tcPr>
+                <w:p>
+                  <w:pPr>
+                    <w:spacing w:before="0" w:after="60"/>
+                    <w:keepNext/>
+                    <w:jc w:val="end"/>
+                  </w:pPr>
+                  <w:r>
+                    <w:rPr>
+                      <w:rFonts w:ascii="Calibri" w:hAnsi="Calibri"/>
+                      <w:sz w:val="20"/>
+                    </w:rPr>
+                    <w:t xml:space="default">25.7</w:t>
+                  </w:r>
+                </w:p>
+              </w:tc>
+              <w:tc>
+                <w:tcPr>
+                  <w:tcBorders>
+                    <w:top w:val="single" w:space="0" w:color="D3D3D3"/>
+                    <w:bottom w:val="single" w:space="0" w:color="D3D3D3"/>
+                    <w:start w:val="single" w:space="0" w:color="D3D3D3"/>
+                    <w:end w:val="single" w:space="0" w:color="D3D3D3"/>
+                  </w:tcBorders>
+                  <w:shd w:val="clear" w:color="auto" w:fill="FFF5F0"/>
+                </w:tcPr>
+                <w:p>
+                  <w:pPr>
+                    <w:spacing w:before="0" w:after="60"/>
+                    <w:keepNext/>
+                    <w:jc w:val="end"/>
+                  </w:pPr>
+                  <w:r>
+                    <w:rPr>
+                      <w:rFonts w:ascii="Calibri" w:hAnsi="Calibri"/>
+                      <w:sz w:val="20"/>
+                    </w:rPr>
+                    <w:t xml:space="default">39.7</w:t>
+                  </w:r>
+                </w:p>
+              </w:tc>
+              <w:tc>
+                <w:tcPr>
+                  <w:tcBorders>
+                    <w:top w:val="single" w:space="0" w:color="D3D3D3"/>
+                    <w:bottom w:val="single" w:space="0" w:color="D3D3D3"/>
+                    <w:start w:val="single" w:space="0" w:color="D3D3D3"/>
+                    <w:end w:val="single" w:space="0" w:color="D3D3D3"/>
+                  </w:tcBorders>
+                  <w:shd w:val="clear" w:color="auto" w:fill="FEE5DA"/>
+                </w:tcPr>
+                <w:p>
+                  <w:pPr>
+                    <w:spacing w:before="0" w:after="60"/>
+                    <w:keepNext/>
+                    <w:jc w:val="end"/>
+                  </w:pPr>
+                  <w:r>
+                    <w:rPr>
+                      <w:rFonts w:ascii="Calibri" w:hAnsi="Calibri"/>
+                      <w:sz w:val="20"/>
+                    </w:rPr>
+                    <w:t xml:space="default">36.5</w:t>
+                  </w:r>
+                </w:p>
+              </w:tc>
+            </w:tr>
+            <w:tr>
+              <w:trPr>
+                <w:cantSplit/>
+              </w:trPr>
+              <w:tc>
+                <w:tcPr>
+                  <w:tcBorders>
+                    <w:top w:val="single" w:space="0" w:color="D3D3D3"/>
+                    <w:bottom w:val="single" w:space="0" w:color="D3D3D3"/>
+                    <w:start w:val="single" w:space="0" w:color="D3D3D3"/>
+                    <w:end w:val="single" w:space="0" w:color="D3D3D3"/>
+                  </w:tcBorders>
+                </w:tcPr>
+                <w:p>
+                  <w:pPr>
+                    <w:spacing w:before="0" w:after="60"/>
+                    <w:keepNext/>
+                    <w:jc w:val="start"/>
+                  </w:pPr>
+                  <w:r>
+                    <w:rPr>
+                      <w:rFonts w:ascii="Calibri" w:hAnsi="Calibri"/>
+                      <w:sz w:val="20"/>
+                    </w:rPr>
+                    <w:t xml:space="default">Fishery length compositions</w:t>
+                  </w:r>
+                </w:p>
+              </w:tc>
+              <w:tc>
+                <w:tcPr>
+                  <w:tcBorders>
+                    <w:top w:val="single" w:space="0" w:color="D3D3D3"/>
+                    <w:bottom w:val="single" w:space="0" w:color="D3D3D3"/>
+                    <w:start w:val="single" w:space="0" w:color="D3D3D3"/>
+                    <w:end w:val="single" w:space="0" w:color="D3D3D3"/>
+                  </w:tcBorders>
+                  <w:shd w:val="clear" w:color="auto" w:fill="FCAE91"/>
+                </w:tcPr>
+                <w:p>
+                  <w:pPr>
+                    <w:spacing w:before="0" w:after="60"/>
+                    <w:keepNext/>
+                    <w:jc w:val="end"/>
+                  </w:pPr>
+                  <w:r>
+                    <w:rPr>
+                      <w:rFonts w:ascii="Calibri" w:hAnsi="Calibri"/>
+                      <w:sz w:val="20"/>
+                    </w:rPr>
+                    <w:t xml:space="default">470.2</w:t>
+                  </w:r>
+                </w:p>
+              </w:tc>
+              <w:tc>
+                <w:tcPr>
+                  <w:tcBorders>
+                    <w:top w:val="single" w:space="0" w:color="D3D3D3"/>
+                    <w:bottom w:val="single" w:space="0" w:color="D3D3D3"/>
+                    <w:start w:val="single" w:space="0" w:color="D3D3D3"/>
+                    <w:end w:val="single" w:space="0" w:color="D3D3D3"/>
+                  </w:tcBorders>
+                  <w:shd w:val="clear" w:color="auto" w:fill="FFF5F0"/>
+                </w:tcPr>
+                <w:p>
+                  <w:pPr>
+                    <w:spacing w:before="0" w:after="60"/>
+                    <w:keepNext/>
+                    <w:jc w:val="end"/>
+                  </w:pPr>
+                  <w:r>
+                    <w:rPr>
+                      <w:rFonts w:ascii="Calibri" w:hAnsi="Calibri"/>
+                      <w:sz w:val="20"/>
+                    </w:rPr>
+                    <w:t xml:space="default">581.9</w:t>
+                  </w:r>
+                </w:p>
+              </w:tc>
+              <w:tc>
+                <w:tcPr>
+                  <w:tcBorders>
+                    <w:top w:val="single" w:space="0" w:color="D3D3D3"/>
+                    <w:bottom w:val="single" w:space="0" w:color="D3D3D3"/>
+                    <w:start w:val="single" w:space="0" w:color="D3D3D3"/>
+                    <w:end w:val="single" w:space="0" w:color="D3D3D3"/>
+                  </w:tcBorders>
+                  <w:shd w:val="clear" w:color="auto" w:fill="FFECE3"/>
+                </w:tcPr>
+                <w:p>
+                  <w:pPr>
+                    <w:spacing w:before="0" w:after="60"/>
+                    <w:keepNext/>
+                    <w:jc w:val="end"/>
+                  </w:pPr>
+                  <w:r>
+                    <w:rPr>
+                      <w:rFonts w:ascii="Calibri" w:hAnsi="Calibri"/>
+                      <w:sz w:val="20"/>
+                    </w:rPr>
+                    <w:t xml:space="default">567.0</w:t>
+                  </w:r>
+                </w:p>
+              </w:tc>
+            </w:tr>
+            <w:tr>
+              <w:trPr>
+                <w:cantSplit/>
+              </w:trPr>
+              <w:tc>
+                <w:tcPr>
+                  <w:tcBorders>
+                    <w:top w:val="single" w:space="0" w:color="D3D3D3"/>
+                    <w:bottom w:val="single" w:space="0" w:color="D3D3D3"/>
+                    <w:start w:val="single" w:space="0" w:color="D3D3D3"/>
+                    <w:end w:val="single" w:space="0" w:color="D3D3D3"/>
+                  </w:tcBorders>
+                </w:tcPr>
+                <w:p>
+                  <w:pPr>
+                    <w:spacing w:before="0" w:after="60"/>
+                    <w:keepNext/>
+                    <w:jc w:val="start"/>
+                  </w:pPr>
+                  <w:r>
+                    <w:rPr>
+                      <w:rFonts w:ascii="Calibri" w:hAnsi="Calibri"/>
+                      <w:sz w:val="20"/>
+                    </w:rPr>
+                    <w:t xml:space="default">Fishery selectivity penalties</w:t>
+                  </w:r>
+                </w:p>
+              </w:tc>
+              <w:tc>
+                <w:tcPr>
+                  <w:tcBorders>
+                    <w:top w:val="single" w:space="0" w:color="D3D3D3"/>
+                    <w:bottom w:val="single" w:space="0" w:color="D3D3D3"/>
+                    <w:start w:val="single" w:space="0" w:color="D3D3D3"/>
+                    <w:end w:val="single" w:space="0" w:color="D3D3D3"/>
+                  </w:tcBorders>
+                  <w:shd w:val="clear" w:color="auto" w:fill="FFF5F0"/>
+                </w:tcPr>
+                <w:p>
+                  <w:pPr>
+                    <w:spacing w:before="0" w:after="60"/>
+                    <w:keepNext/>
+                    <w:jc w:val="end"/>
+                  </w:pPr>
+                  <w:r>
+                    <w:rPr>
+                      <w:rFonts w:ascii="Calibri" w:hAnsi="Calibri"/>
+                      <w:sz w:val="20"/>
+                    </w:rPr>
+                    <w:t xml:space="default">329.7</w:t>
+                  </w:r>
+                </w:p>
+              </w:tc>
+              <w:tc>
+                <w:tcPr>
+                  <w:tcBorders>
+                    <w:top w:val="single" w:space="0" w:color="D3D3D3"/>
+                    <w:bottom w:val="single" w:space="0" w:color="D3D3D3"/>
+                    <w:start w:val="single" w:space="0" w:color="D3D3D3"/>
+                    <w:end w:val="single" w:space="0" w:color="D3D3D3"/>
+                  </w:tcBorders>
+                  <w:shd w:val="clear" w:color="auto" w:fill="FCAE91"/>
+                </w:tcPr>
+                <w:p>
+                  <w:pPr>
+                    <w:spacing w:before="0" w:after="60"/>
+                    <w:keepNext/>
+                    <w:jc w:val="end"/>
+                  </w:pPr>
+                  <w:r>
+                    <w:rPr>
+                      <w:rFonts w:ascii="Calibri" w:hAnsi="Calibri"/>
+                      <w:sz w:val="20"/>
+                    </w:rPr>
+                    <w:t xml:space="default">114.4</w:t>
+                  </w:r>
+                </w:p>
+              </w:tc>
+              <w:tc>
+                <w:tcPr>
+                  <w:tcBorders>
+                    <w:top w:val="single" w:space="0" w:color="D3D3D3"/>
+                    <w:bottom w:val="single" w:space="0" w:color="D3D3D3"/>
+                    <w:start w:val="single" w:space="0" w:color="D3D3D3"/>
+                    <w:end w:val="single" w:space="0" w:color="D3D3D3"/>
+                  </w:tcBorders>
+                  <w:shd w:val="clear" w:color="auto" w:fill="FDC9B5"/>
+                </w:tcPr>
+                <w:p>
+                  <w:pPr>
+                    <w:spacing w:before="0" w:after="60"/>
+                    <w:keepNext/>
+                    <w:jc w:val="end"/>
+                  </w:pPr>
+                  <w:r>
+                    <w:rPr>
+                      <w:rFonts w:ascii="Calibri" w:hAnsi="Calibri"/>
+                      <w:sz w:val="20"/>
+                    </w:rPr>
+                    <w:t xml:space="default">196.0</w:t>
+                  </w:r>
+                </w:p>
+              </w:tc>
+            </w:tr>
+            <w:tr>
+              <w:trPr>
+                <w:cantSplit/>
+              </w:trPr>
+              <w:tc>
+                <w:tcPr>
+                  <w:tcBorders>
+                    <w:top w:val="single" w:space="0" w:color="D3D3D3"/>
+                    <w:bottom w:val="single" w:space="0" w:color="D3D3D3"/>
+                    <w:start w:val="single" w:space="0" w:color="D3D3D3"/>
+                    <w:end w:val="single" w:space="0" w:color="D3D3D3"/>
+                  </w:tcBorders>
+                </w:tcPr>
+                <w:p>
+                  <w:pPr>
+                    <w:spacing w:before="0" w:after="60"/>
+                    <w:keepNext/>
+                    <w:jc w:val="start"/>
+                  </w:pPr>
+                  <w:r>
+                    <w:rPr>
+                      <w:rFonts w:ascii="Calibri" w:hAnsi="Calibri"/>
+                      <w:sz w:val="20"/>
+                    </w:rPr>
+                    <w:t xml:space="default">Index likelihood</w:t>
+                  </w:r>
+                </w:p>
+              </w:tc>
+              <w:tc>
+                <w:tcPr>
+                  <w:tcBorders>
+                    <w:top w:val="single" w:space="0" w:color="D3D3D3"/>
+                    <w:bottom w:val="single" w:space="0" w:color="D3D3D3"/>
+                    <w:start w:val="single" w:space="0" w:color="D3D3D3"/>
+                    <w:end w:val="single" w:space="0" w:color="D3D3D3"/>
+                  </w:tcBorders>
+                  <w:shd w:val="clear" w:color="auto" w:fill="FCAE91"/>
+                </w:tcPr>
+                <w:p>
+                  <w:pPr>
+                    <w:spacing w:before="0" w:after="60"/>
+                    <w:keepNext/>
+                    <w:jc w:val="end"/>
+                  </w:pPr>
+                  <w:r>
+                    <w:rPr>
+                      <w:rFonts w:ascii="Calibri" w:hAnsi="Calibri"/>
+                      <w:sz w:val="20"/>
+                    </w:rPr>
+                    <w:t xml:space="default">130.6</w:t>
+                  </w:r>
+                </w:p>
+              </w:tc>
+              <w:tc>
+                <w:tcPr>
+                  <w:tcBorders>
+                    <w:top w:val="single" w:space="0" w:color="D3D3D3"/>
+                    <w:bottom w:val="single" w:space="0" w:color="D3D3D3"/>
+                    <w:start w:val="single" w:space="0" w:color="D3D3D3"/>
+                    <w:end w:val="single" w:space="0" w:color="D3D3D3"/>
+                  </w:tcBorders>
+                  <w:shd w:val="clear" w:color="auto" w:fill="FFF5F0"/>
+                </w:tcPr>
+                <w:p>
+                  <w:pPr>
+                    <w:spacing w:before="0" w:after="60"/>
+                    <w:keepNext/>
+                    <w:jc w:val="end"/>
+                  </w:pPr>
+                  <w:r>
+                    <w:rPr>
+                      <w:rFonts w:ascii="Calibri" w:hAnsi="Calibri"/>
+                      <w:sz w:val="20"/>
+                    </w:rPr>
+                    <w:t xml:space="default">258.0</w:t>
+                  </w:r>
+                </w:p>
+              </w:tc>
+              <w:tc>
+                <w:tcPr>
+                  <w:tcBorders>
+                    <w:top w:val="single" w:space="0" w:color="D3D3D3"/>
+                    <w:bottom w:val="single" w:space="0" w:color="D3D3D3"/>
+                    <w:start w:val="single" w:space="0" w:color="D3D3D3"/>
+                    <w:end w:val="single" w:space="0" w:color="D3D3D3"/>
+                  </w:tcBorders>
+                  <w:shd w:val="clear" w:color="auto" w:fill="FDCDBA"/>
+                </w:tcPr>
+                <w:p>
+                  <w:pPr>
+                    <w:spacing w:before="0" w:after="60"/>
+                    <w:keepNext/>
+                    <w:jc w:val="end"/>
+                  </w:pPr>
+                  <w:r>
+                    <w:rPr>
+                      <w:rFonts w:ascii="Calibri" w:hAnsi="Calibri"/>
+                      <w:sz w:val="20"/>
+                    </w:rPr>
+                    <w:t xml:space="default">185.9</w:t>
+                  </w:r>
+                </w:p>
+              </w:tc>
+            </w:tr>
+            <w:tr>
+              <w:trPr>
+                <w:cantSplit/>
+              </w:trPr>
+              <w:tc>
+                <w:tcPr>
+                  <w:tcBorders>
+                    <w:top w:val="single" w:space="0" w:color="D3D3D3"/>
+                    <w:bottom w:val="single" w:space="0" w:color="D3D3D3"/>
+                    <w:start w:val="single" w:space="0" w:color="D3D3D3"/>
+                    <w:end w:val="single" w:space="0" w:color="D3D3D3"/>
+                  </w:tcBorders>
+                </w:tcPr>
+                <w:p>
+                  <w:pPr>
+                    <w:spacing w:before="0" w:after="60"/>
+                    <w:keepNext/>
+                    <w:jc w:val="start"/>
+                  </w:pPr>
+                  <w:r>
+                    <w:rPr>
+                      <w:rFonts w:ascii="Calibri" w:hAnsi="Calibri"/>
+                      <w:sz w:val="20"/>
+                    </w:rPr>
+                    <w:t xml:space="default"> Chile acoustic North index</w:t>
+                  </w:r>
+                </w:p>
+              </w:tc>
+              <w:tc>
+                <w:tcPr>
+                  <w:tcBorders>
+                    <w:top w:val="single" w:space="0" w:color="D3D3D3"/>
+                    <w:bottom w:val="single" w:space="0" w:color="D3D3D3"/>
+                    <w:start w:val="single" w:space="0" w:color="D3D3D3"/>
+                    <w:end w:val="single" w:space="0" w:color="D3D3D3"/>
+                  </w:tcBorders>
+                  <w:shd w:val="clear" w:color="auto" w:fill="FCAE91"/>
+                </w:tcPr>
+                <w:p>
+                  <w:pPr>
+                    <w:spacing w:before="0" w:after="60"/>
+                    <w:keepNext/>
+                    <w:jc w:val="end"/>
+                  </w:pPr>
+                  <w:r>
+                    <w:rPr>
+                      <w:rFonts w:ascii="Calibri" w:hAnsi="Calibri"/>
+                      <w:sz w:val="20"/>
+                    </w:rPr>
+                    <w:t xml:space="default">73.2</w:t>
+                  </w:r>
+                </w:p>
+              </w:tc>
+              <w:tc>
+                <w:tcPr>
+                  <w:tcBorders>
+                    <w:top w:val="single" w:space="0" w:color="D3D3D3"/>
+                    <w:bottom w:val="single" w:space="0" w:color="D3D3D3"/>
+                    <w:start w:val="single" w:space="0" w:color="D3D3D3"/>
+                    <w:end w:val="single" w:space="0" w:color="D3D3D3"/>
+                  </w:tcBorders>
+                  <w:shd w:val="clear" w:color="auto" w:fill="FFF5F0"/>
+                </w:tcPr>
+                <w:p>
+                  <w:pPr>
+                    <w:spacing w:before="0" w:after="60"/>
+                    <w:keepNext/>
+                    <w:jc w:val="end"/>
+                  </w:pPr>
+                  <w:r>
+                    <w:rPr>
+                      <w:rFonts w:ascii="Calibri" w:hAnsi="Calibri"/>
+                      <w:sz w:val="20"/>
+                    </w:rPr>
+                    <w:t xml:space="default">87.7</w:t>
+                  </w:r>
+                </w:p>
+              </w:tc>
+              <w:tc>
+                <w:tcPr>
+                  <w:tcBorders>
+                    <w:top w:val="single" w:space="0" w:color="D3D3D3"/>
+                    <w:bottom w:val="single" w:space="0" w:color="D3D3D3"/>
+                    <w:start w:val="single" w:space="0" w:color="D3D3D3"/>
+                    <w:end w:val="single" w:space="0" w:color="D3D3D3"/>
+                  </w:tcBorders>
+                  <w:shd w:val="clear" w:color="auto" w:fill="FDC1AA"/>
+                </w:tcPr>
+                <w:p>
+                  <w:pPr>
+                    <w:spacing w:before="0" w:after="60"/>
+                    <w:keepNext/>
+                    <w:jc w:val="end"/>
+                  </w:pPr>
+                  <w:r>
+                    <w:rPr>
+                      <w:rFonts w:ascii="Calibri" w:hAnsi="Calibri"/>
+                      <w:sz w:val="20"/>
+                    </w:rPr>
+                    <w:t xml:space="default">77.0</w:t>
+                  </w:r>
+                </w:p>
+              </w:tc>
+            </w:tr>
+            <w:tr>
+              <w:trPr>
+                <w:cantSplit/>
+              </w:trPr>
+              <w:tc>
+                <w:tcPr>
+                  <w:tcBorders>
+                    <w:top w:val="single" w:space="0" w:color="D3D3D3"/>
+                    <w:bottom w:val="single" w:space="0" w:color="D3D3D3"/>
+                    <w:start w:val="single" w:space="0" w:color="D3D3D3"/>
+                    <w:end w:val="single" w:space="0" w:color="D3D3D3"/>
+                  </w:tcBorders>
+                </w:tcPr>
+                <w:p>
+                  <w:pPr>
+                    <w:spacing w:before="0" w:after="60"/>
+                    <w:keepNext/>
+                    <w:jc w:val="start"/>
+                  </w:pPr>
+                  <w:r>
+                    <w:rPr>
+                      <w:rFonts w:ascii="Calibri" w:hAnsi="Calibri"/>
+                      <w:sz w:val="20"/>
+                    </w:rPr>
+                    <w:t xml:space="default"> Chile CPUE index</w:t>
+                  </w:r>
+                </w:p>
+              </w:tc>
+              <w:tc>
+                <w:tcPr>
+                  <w:tcBorders>
+                    <w:top w:val="single" w:space="0" w:color="D3D3D3"/>
+                    <w:bottom w:val="single" w:space="0" w:color="D3D3D3"/>
+                    <w:start w:val="single" w:space="0" w:color="D3D3D3"/>
+                    <w:end w:val="single" w:space="0" w:color="D3D3D3"/>
+                  </w:tcBorders>
+                  <w:shd w:val="clear" w:color="auto" w:fill="FCAE91"/>
+                </w:tcPr>
+                <w:p>
+                  <w:pPr>
+                    <w:spacing w:before="0" w:after="60"/>
+                    <w:keepNext/>
+                    <w:jc w:val="end"/>
+                  </w:pPr>
+                  <w:r>
+                    <w:rPr>
+                      <w:rFonts w:ascii="Calibri" w:hAnsi="Calibri"/>
+                      <w:sz w:val="20"/>
+                    </w:rPr>
+                    <w:t xml:space="default">17.0</w:t>
+                  </w:r>
+                </w:p>
+              </w:tc>
+              <w:tc>
+                <w:tcPr>
+                  <w:tcBorders>
+                    <w:top w:val="single" w:space="0" w:color="D3D3D3"/>
+                    <w:bottom w:val="single" w:space="0" w:color="D3D3D3"/>
+                    <w:start w:val="single" w:space="0" w:color="D3D3D3"/>
+                    <w:end w:val="single" w:space="0" w:color="D3D3D3"/>
+                  </w:tcBorders>
+                  <w:shd w:val="clear" w:color="auto" w:fill="FFF5F0"/>
+                </w:tcPr>
+                <w:p>
+                  <w:pPr>
+                    <w:spacing w:before="0" w:after="60"/>
+                    <w:keepNext/>
+                    <w:jc w:val="end"/>
+                  </w:pPr>
+                  <w:r>
+                    <w:rPr>
+                      <w:rFonts w:ascii="Calibri" w:hAnsi="Calibri"/>
+                      <w:sz w:val="20"/>
+                    </w:rPr>
+                    <w:t xml:space="default">73.5</w:t>
+                  </w:r>
+                </w:p>
+              </w:tc>
+              <w:tc>
+                <w:tcPr>
+                  <w:tcBorders>
+                    <w:top w:val="single" w:space="0" w:color="D3D3D3"/>
+                    <w:bottom w:val="single" w:space="0" w:color="D3D3D3"/>
+                    <w:start w:val="single" w:space="0" w:color="D3D3D3"/>
+                    <w:end w:val="single" w:space="0" w:color="D3D3D3"/>
+                  </w:tcBorders>
+                  <w:shd w:val="clear" w:color="auto" w:fill="FCB69C"/>
+                </w:tcPr>
+                <w:p>
+                  <w:pPr>
+                    <w:spacing w:before="0" w:after="60"/>
+                    <w:keepNext/>
+                    <w:jc w:val="end"/>
+                  </w:pPr>
+                  <w:r>
+                    <w:rPr>
+                      <w:rFonts w:ascii="Calibri" w:hAnsi="Calibri"/>
+                      <w:sz w:val="20"/>
+                    </w:rPr>
+                    <w:t xml:space="default">23.3</w:t>
+                  </w:r>
+                </w:p>
+              </w:tc>
+            </w:tr>
+            <w:tr>
+              <w:trPr>
+                <w:cantSplit/>
+              </w:trPr>
+              <w:tc>
+                <w:tcPr>
+                  <w:tcBorders>
+                    <w:top w:val="single" w:space="0" w:color="D3D3D3"/>
+                    <w:bottom w:val="single" w:space="0" w:color="D3D3D3"/>
+                    <w:start w:val="single" w:space="0" w:color="D3D3D3"/>
+                    <w:end w:val="single" w:space="0" w:color="D3D3D3"/>
+                  </w:tcBorders>
+                </w:tcPr>
+                <w:p>
+                  <w:pPr>
+                    <w:spacing w:before="0" w:after="60"/>
+                    <w:keepNext/>
+                    <w:jc w:val="start"/>
+                  </w:pPr>
+                  <w:r>
+                    <w:rPr>
+                      <w:rFonts w:ascii="Calibri" w:hAnsi="Calibri"/>
+                      <w:sz w:val="20"/>
+                    </w:rPr>
+                    <w:t xml:space="default"> Peru CPUE index</w:t>
+                  </w:r>
+                </w:p>
+              </w:tc>
+              <w:tc>
+                <w:tcPr>
+                  <w:tcBorders>
+                    <w:top w:val="single" w:space="0" w:color="D3D3D3"/>
+                    <w:bottom w:val="single" w:space="0" w:color="D3D3D3"/>
+                    <w:start w:val="single" w:space="0" w:color="D3D3D3"/>
+                    <w:end w:val="single" w:space="0" w:color="D3D3D3"/>
+                  </w:tcBorders>
+                  <w:shd w:val="clear" w:color="auto" w:fill="FCAE91"/>
+                </w:tcPr>
+                <w:p>
+                  <w:pPr>
+                    <w:spacing w:before="0" w:after="60"/>
+                    <w:keepNext/>
+                    <w:jc w:val="end"/>
+                  </w:pPr>
+                  <w:r>
+                    <w:rPr>
+                      <w:rFonts w:ascii="Calibri" w:hAnsi="Calibri"/>
+                      <w:sz w:val="20"/>
+                    </w:rPr>
+                    <w:t xml:space="default">29.5</w:t>
+                  </w:r>
+                </w:p>
+              </w:tc>
+              <w:tc>
+                <w:tcPr>
+                  <w:tcBorders>
+                    <w:top w:val="single" w:space="0" w:color="D3D3D3"/>
+                    <w:bottom w:val="single" w:space="0" w:color="D3D3D3"/>
+                    <w:start w:val="single" w:space="0" w:color="D3D3D3"/>
+                    <w:end w:val="single" w:space="0" w:color="D3D3D3"/>
+                  </w:tcBorders>
+                  <w:shd w:val="clear" w:color="auto" w:fill="FFF5F0"/>
+                </w:tcPr>
+                <w:p>
+                  <w:pPr>
+                    <w:spacing w:before="0" w:after="60"/>
+                    <w:keepNext/>
+                    <w:jc w:val="end"/>
+                  </w:pPr>
+                  <w:r>
+                    <w:rPr>
+                      <w:rFonts w:ascii="Calibri" w:hAnsi="Calibri"/>
+                      <w:sz w:val="20"/>
+                    </w:rPr>
+                    <w:t xml:space="default">65.3</w:t>
+                  </w:r>
+                </w:p>
+              </w:tc>
+              <w:tc>
+                <w:tcPr>
+                  <w:tcBorders>
+                    <w:top w:val="single" w:space="0" w:color="D3D3D3"/>
+                    <w:bottom w:val="single" w:space="0" w:color="D3D3D3"/>
+                    <w:start w:val="single" w:space="0" w:color="D3D3D3"/>
+                    <w:end w:val="single" w:space="0" w:color="D3D3D3"/>
+                  </w:tcBorders>
+                  <w:shd w:val="clear" w:color="auto" w:fill="FED9CB"/>
+                </w:tcPr>
+                <w:p>
+                  <w:pPr>
+                    <w:spacing w:before="0" w:after="60"/>
+                    <w:keepNext/>
+                    <w:jc w:val="end"/>
+                  </w:pPr>
+                  <w:r>
+                    <w:rPr>
+                      <w:rFonts w:ascii="Calibri" w:hAnsi="Calibri"/>
+                      <w:sz w:val="20"/>
+                    </w:rPr>
+                    <w:t xml:space="default">51.3</w:t>
+                  </w:r>
+                </w:p>
+              </w:tc>
+            </w:tr>
+            <w:tr>
+              <w:trPr>
+                <w:cantSplit/>
+              </w:trPr>
+              <w:tc>
+                <w:tcPr>
+                  <w:tcBorders>
+                    <w:top w:val="single" w:space="0" w:color="D3D3D3"/>
+                    <w:bottom w:val="single" w:space="0" w:color="D3D3D3"/>
+                    <w:start w:val="single" w:space="0" w:color="D3D3D3"/>
+                    <w:end w:val="single" w:space="0" w:color="D3D3D3"/>
+                  </w:tcBorders>
+                </w:tcPr>
+                <w:p>
+                  <w:pPr>
+                    <w:spacing w:before="0" w:after="60"/>
+                    <w:keepNext/>
+                    <w:jc w:val="start"/>
+                  </w:pPr>
+                  <w:r>
+                    <w:rPr>
+                      <w:rFonts w:ascii="Calibri" w:hAnsi="Calibri"/>
+                      <w:sz w:val="20"/>
+                    </w:rPr>
+                    <w:t xml:space="default"> Offshore CPUE index</w:t>
+                  </w:r>
+                </w:p>
+              </w:tc>
+              <w:tc>
+                <w:tcPr>
+                  <w:tcBorders>
+                    <w:top w:val="single" w:space="0" w:color="D3D3D3"/>
+                    <w:bottom w:val="single" w:space="0" w:color="D3D3D3"/>
+                    <w:start w:val="single" w:space="0" w:color="D3D3D3"/>
+                    <w:end w:val="single" w:space="0" w:color="D3D3D3"/>
+                  </w:tcBorders>
+                  <w:shd w:val="clear" w:color="auto" w:fill="FCAE91"/>
+                </w:tcPr>
+                <w:p>
+                  <w:pPr>
+                    <w:spacing w:before="0" w:after="60"/>
+                    <w:keepNext/>
+                    <w:jc w:val="end"/>
+                  </w:pPr>
+                  <w:r>
+                    <w:rPr>
+                      <w:rFonts w:ascii="Calibri" w:hAnsi="Calibri"/>
+                      <w:sz w:val="20"/>
+                    </w:rPr>
+                    <w:t xml:space="default">10.9</w:t>
+                  </w:r>
+                </w:p>
+              </w:tc>
+              <w:tc>
+                <w:tcPr>
+                  <w:tcBorders>
+                    <w:top w:val="single" w:space="0" w:color="D3D3D3"/>
+                    <w:bottom w:val="single" w:space="0" w:color="D3D3D3"/>
+                    <w:start w:val="single" w:space="0" w:color="D3D3D3"/>
+                    <w:end w:val="single" w:space="0" w:color="D3D3D3"/>
+                  </w:tcBorders>
+                  <w:shd w:val="clear" w:color="auto" w:fill="FFECE4"/>
+                </w:tcPr>
+                <w:p>
+                  <w:pPr>
+                    <w:spacing w:before="0" w:after="60"/>
+                    <w:keepNext/>
+                    <w:jc w:val="end"/>
+                  </w:pPr>
+                  <w:r>
+                    <w:rPr>
+                      <w:rFonts w:ascii="Calibri" w:hAnsi="Calibri"/>
+                      <w:sz w:val="20"/>
+                    </w:rPr>
+                    <w:t xml:space="default">31.4</w:t>
+                  </w:r>
+                </w:p>
+              </w:tc>
+              <w:tc>
+                <w:tcPr>
+                  <w:tcBorders>
+                    <w:top w:val="single" w:space="0" w:color="D3D3D3"/>
+                    <w:bottom w:val="single" w:space="0" w:color="D3D3D3"/>
+                    <w:start w:val="single" w:space="0" w:color="D3D3D3"/>
+                    <w:end w:val="single" w:space="0" w:color="D3D3D3"/>
+                  </w:tcBorders>
+                  <w:shd w:val="clear" w:color="auto" w:fill="FFF5F0"/>
+                </w:tcPr>
+                <w:p>
+                  <w:pPr>
+                    <w:spacing w:before="0" w:after="60"/>
+                    <w:keepNext/>
+                    <w:jc w:val="end"/>
+                  </w:pPr>
+                  <w:r>
+                    <w:rPr>
+                      <w:rFonts w:ascii="Calibri" w:hAnsi="Calibri"/>
+                      <w:sz w:val="20"/>
+                    </w:rPr>
+                    <w:t xml:space="default">34.3</w:t>
+                  </w:r>
+                </w:p>
+              </w:tc>
+            </w:tr>
+            <w:tr>
+              <w:trPr>
+                <w:cantSplit/>
+              </w:trPr>
+              <w:tc>
+                <w:tcPr>
+                  <w:tcBorders>
+                    <w:top w:val="single" w:space="0" w:color="D3D3D3"/>
+                    <w:bottom w:val="single" w:space="0" w:color="D3D3D3"/>
+                    <w:start w:val="single" w:space="0" w:color="D3D3D3"/>
+                    <w:end w:val="single" w:space="0" w:color="D3D3D3"/>
+                  </w:tcBorders>
+                </w:tcPr>
+                <w:p>
+                  <w:pPr>
+                    <w:spacing w:before="0" w:after="60"/>
+                    <w:keepNext/>
+                    <w:jc w:val="start"/>
+                  </w:pPr>
+                  <w:r>
+                    <w:rPr>
+                      <w:rFonts w:ascii="Calibri" w:hAnsi="Calibri"/>
+                      <w:sz w:val="20"/>
+                    </w:rPr>
+                    <w:t xml:space="default">Index age compositions</w:t>
+                  </w:r>
+                </w:p>
+              </w:tc>
+              <w:tc>
+                <w:tcPr>
+                  <w:tcBorders>
+                    <w:top w:val="single" w:space="0" w:color="D3D3D3"/>
+                    <w:bottom w:val="single" w:space="0" w:color="D3D3D3"/>
+                    <w:start w:val="single" w:space="0" w:color="D3D3D3"/>
+                    <w:end w:val="single" w:space="0" w:color="D3D3D3"/>
+                  </w:tcBorders>
+                  <w:shd w:val="clear" w:color="auto" w:fill="FFF5F0"/>
+                </w:tcPr>
+                <w:p>
+                  <w:pPr>
+                    <w:spacing w:before="0" w:after="60"/>
+                    <w:keepNext/>
+                    <w:jc w:val="end"/>
+                  </w:pPr>
+                  <w:r>
+                    <w:rPr>
+                      <w:rFonts w:ascii="Calibri" w:hAnsi="Calibri"/>
+                      <w:sz w:val="20"/>
+                    </w:rPr>
+                    <w:t xml:space="default">38.1</w:t>
+                  </w:r>
+                </w:p>
+              </w:tc>
+              <w:tc>
+                <w:tcPr>
+                  <w:tcBorders>
+                    <w:top w:val="single" w:space="0" w:color="D3D3D3"/>
+                    <w:bottom w:val="single" w:space="0" w:color="D3D3D3"/>
+                    <w:start w:val="single" w:space="0" w:color="D3D3D3"/>
+                    <w:end w:val="single" w:space="0" w:color="D3D3D3"/>
+                  </w:tcBorders>
+                  <w:shd w:val="clear" w:color="auto" w:fill="FFEBE3"/>
+                </w:tcPr>
+                <w:p>
+                  <w:pPr>
+                    <w:spacing w:before="0" w:after="60"/>
+                    <w:keepNext/>
+                    <w:jc w:val="end"/>
+                  </w:pPr>
+                  <w:r>
+                    <w:rPr>
+                      <w:rFonts w:ascii="Calibri" w:hAnsi="Calibri"/>
+                      <w:sz w:val="20"/>
+                    </w:rPr>
+                    <w:t xml:space="default">37.8</w:t>
+                  </w:r>
+                </w:p>
+              </w:tc>
+              <w:tc>
+                <w:tcPr>
+                  <w:tcBorders>
+                    <w:top w:val="single" w:space="0" w:color="D3D3D3"/>
+                    <w:bottom w:val="single" w:space="0" w:color="D3D3D3"/>
+                    <w:start w:val="single" w:space="0" w:color="D3D3D3"/>
+                    <w:end w:val="single" w:space="0" w:color="D3D3D3"/>
+                  </w:tcBorders>
+                  <w:shd w:val="clear" w:color="auto" w:fill="FCAE91"/>
+                </w:tcPr>
+                <w:p>
+                  <w:pPr>
+                    <w:spacing w:before="0" w:after="60"/>
+                    <w:keepNext/>
+                    <w:jc w:val="end"/>
+                  </w:pPr>
+                  <w:r>
+                    <w:rPr>
+                      <w:rFonts w:ascii="Calibri" w:hAnsi="Calibri"/>
+                      <w:sz w:val="20"/>
+                    </w:rPr>
+                    <w:t xml:space="default">35.8</w:t>
+                  </w:r>
+                </w:p>
+              </w:tc>
+            </w:tr>
+            <w:tr>
+              <w:trPr>
+                <w:cantSplit/>
+              </w:trPr>
+              <w:tc>
+                <w:tcPr>
+                  <w:tcBorders>
+                    <w:top w:val="single" w:space="0" w:color="D3D3D3"/>
+                    <w:bottom w:val="single" w:space="0" w:color="D3D3D3"/>
+                    <w:start w:val="single" w:space="0" w:color="D3D3D3"/>
+                    <w:end w:val="single" w:space="0" w:color="D3D3D3"/>
+                  </w:tcBorders>
+                </w:tcPr>
+                <w:p>
+                  <w:pPr>
+                    <w:spacing w:before="0" w:after="60"/>
+                    <w:keepNext/>
+                    <w:jc w:val="start"/>
+                  </w:pPr>
+                  <w:r>
+                    <w:rPr>
+                      <w:rFonts w:ascii="Calibri" w:hAnsi="Calibri"/>
+                      <w:sz w:val="20"/>
+                    </w:rPr>
+                    <w:t xml:space="default">Index selectivity penalties</w:t>
+                  </w:r>
+                </w:p>
+              </w:tc>
+              <w:tc>
+                <w:tcPr>
+                  <w:tcBorders>
+                    <w:top w:val="single" w:space="0" w:color="D3D3D3"/>
+                    <w:bottom w:val="single" w:space="0" w:color="D3D3D3"/>
+                    <w:start w:val="single" w:space="0" w:color="D3D3D3"/>
+                    <w:end w:val="single" w:space="0" w:color="D3D3D3"/>
+                  </w:tcBorders>
+                  <w:shd w:val="clear" w:color="auto" w:fill="FFF5F0"/>
+                </w:tcPr>
+                <w:p>
+                  <w:pPr>
+                    <w:spacing w:before="0" w:after="60"/>
+                    <w:keepNext/>
+                    <w:jc w:val="end"/>
+                  </w:pPr>
+                  <w:r>
+                    <w:rPr>
+                      <w:rFonts w:ascii="Calibri" w:hAnsi="Calibri"/>
+                      <w:sz w:val="20"/>
+                    </w:rPr>
+                    <w:t xml:space="default">6.1</w:t>
+                  </w:r>
+                </w:p>
+              </w:tc>
+              <w:tc>
+                <w:tcPr>
+                  <w:tcBorders>
+                    <w:top w:val="single" w:space="0" w:color="D3D3D3"/>
+                    <w:bottom w:val="single" w:space="0" w:color="D3D3D3"/>
+                    <w:start w:val="single" w:space="0" w:color="D3D3D3"/>
+                    <w:end w:val="single" w:space="0" w:color="D3D3D3"/>
+                  </w:tcBorders>
+                  <w:shd w:val="clear" w:color="auto" w:fill="FCAE91"/>
+                </w:tcPr>
+                <w:p>
+                  <w:pPr>
+                    <w:spacing w:before="0" w:after="60"/>
+                    <w:keepNext/>
+                    <w:jc w:val="end"/>
+                  </w:pPr>
+                  <w:r>
+                    <w:rPr>
+                      <w:rFonts w:ascii="Calibri" w:hAnsi="Calibri"/>
+                      <w:sz w:val="20"/>
+                    </w:rPr>
+                    <w:t xml:space="default">3.9</w:t>
+                  </w:r>
+                </w:p>
+              </w:tc>
+              <w:tc>
+                <w:tcPr>
+                  <w:tcBorders>
+                    <w:top w:val="single" w:space="0" w:color="D3D3D3"/>
+                    <w:bottom w:val="single" w:space="0" w:color="D3D3D3"/>
+                    <w:start w:val="single" w:space="0" w:color="D3D3D3"/>
+                    <w:end w:val="single" w:space="0" w:color="D3D3D3"/>
+                  </w:tcBorders>
+                  <w:shd w:val="clear" w:color="auto" w:fill="FDD0BE"/>
+                </w:tcPr>
+                <w:p>
+                  <w:pPr>
+                    <w:spacing w:before="0" w:after="60"/>
+                    <w:keepNext/>
+                    <w:jc w:val="end"/>
+                  </w:pPr>
+                  <w:r>
+                    <w:rPr>
+                      <w:rFonts w:ascii="Calibri" w:hAnsi="Calibri"/>
+                      <w:sz w:val="20"/>
+                    </w:rPr>
+                    <w:t xml:space="default">5.0</w:t>
+                  </w:r>
+                </w:p>
+              </w:tc>
+            </w:tr>
+            <w:tr>
+              <w:trPr>
+                <w:cantSplit/>
+              </w:trPr>
+              <w:tc>
+                <w:tcPr>
+                  <w:tcBorders>
+                    <w:top w:val="single" w:space="0" w:color="D3D3D3"/>
+                    <w:bottom w:val="single" w:space="0" w:color="D3D3D3"/>
+                    <w:start w:val="single" w:space="0" w:color="D3D3D3"/>
+                    <w:end w:val="single" w:space="0" w:color="D3D3D3"/>
+                  </w:tcBorders>
+                </w:tcPr>
+                <w:p>
+                  <w:pPr>
+                    <w:spacing w:before="0" w:after="60"/>
+                    <w:keepNext/>
+                    <w:jc w:val="start"/>
+                  </w:pPr>
+                  <w:r>
+                    <w:rPr>
+                      <w:rFonts w:ascii="Calibri" w:hAnsi="Calibri"/>
+                      <w:sz w:val="20"/>
+                    </w:rPr>
+                    <w:t xml:space="default">Recruitment term</w:t>
+                  </w:r>
+                </w:p>
+              </w:tc>
+              <w:tc>
+                <w:tcPr>
+                  <w:tcBorders>
+                    <w:top w:val="single" w:space="0" w:color="D3D3D3"/>
+                    <w:bottom w:val="single" w:space="0" w:color="D3D3D3"/>
+                    <w:start w:val="single" w:space="0" w:color="D3D3D3"/>
+                    <w:end w:val="single" w:space="0" w:color="D3D3D3"/>
+                  </w:tcBorders>
+                  <w:shd w:val="clear" w:color="auto" w:fill="FCAE91"/>
+                </w:tcPr>
+                <w:p>
+                  <w:pPr>
+                    <w:spacing w:before="0" w:after="60"/>
+                    <w:keepNext/>
+                    <w:jc w:val="end"/>
+                  </w:pPr>
+                  <w:r>
+                    <w:rPr>
+                      <w:rFonts w:ascii="Calibri" w:hAnsi="Calibri"/>
+                      <w:sz w:val="20"/>
+                    </w:rPr>
+                    <w:t xml:space="default">-3.9</w:t>
+                  </w:r>
+                </w:p>
+              </w:tc>
+              <w:tc>
+                <w:tcPr>
+                  <w:tcBorders>
+                    <w:top w:val="single" w:space="0" w:color="D3D3D3"/>
+                    <w:bottom w:val="single" w:space="0" w:color="D3D3D3"/>
+                    <w:start w:val="single" w:space="0" w:color="D3D3D3"/>
+                    <w:end w:val="single" w:space="0" w:color="D3D3D3"/>
+                  </w:tcBorders>
+                  <w:shd w:val="clear" w:color="auto" w:fill="FDCDBB"/>
+                </w:tcPr>
+                <w:p>
+                  <w:pPr>
+                    <w:spacing w:before="0" w:after="60"/>
+                    <w:keepNext/>
+                    <w:jc w:val="end"/>
+                  </w:pPr>
+                  <w:r>
+                    <w:rPr>
+                      <w:rFonts w:ascii="Calibri" w:hAnsi="Calibri"/>
+                      <w:sz w:val="20"/>
+                    </w:rPr>
+                    <w:t xml:space="default">-2.6</w:t>
+                  </w:r>
+                </w:p>
+              </w:tc>
+              <w:tc>
+                <w:tcPr>
+                  <w:tcBorders>
+                    <w:top w:val="single" w:space="0" w:color="D3D3D3"/>
+                    <w:bottom w:val="single" w:space="0" w:color="D3D3D3"/>
+                    <w:start w:val="single" w:space="0" w:color="D3D3D3"/>
+                    <w:end w:val="single" w:space="0" w:color="D3D3D3"/>
+                  </w:tcBorders>
+                  <w:shd w:val="clear" w:color="auto" w:fill="FFF5F0"/>
+                </w:tcPr>
+                <w:p>
+                  <w:pPr>
+                    <w:spacing w:before="0" w:after="60"/>
+                    <w:keepNext/>
+                    <w:jc w:val="end"/>
+                  </w:pPr>
+                  <w:r>
+                    <w:rPr>
+                      <w:rFonts w:ascii="Calibri" w:hAnsi="Calibri"/>
+                      <w:sz w:val="20"/>
+                    </w:rPr>
+                    <w:t xml:space="default">-0.9</w:t>
+                  </w:r>
+                </w:p>
+              </w:tc>
+            </w:tr>
+            <w:tr>
+              <w:trPr>
+                <w:cantSplit/>
+              </w:trPr>
+              <w:tc>
+                <w:tcPr>
+                  <w:tcBorders>
+                    <w:top w:val="single" w:space="0" w:color="D3D3D3"/>
+                    <w:bottom w:val="single" w:space="0" w:color="D3D3D3"/>
+                    <w:start w:val="single" w:space="0" w:color="D3D3D3"/>
+                    <w:end w:val="single" w:space="0" w:color="D3D3D3"/>
+                  </w:tcBorders>
+                </w:tcPr>
+                <w:p>
+                  <w:pPr>
+                    <w:spacing w:before="0" w:after="60"/>
+                    <w:keepNext/>
+                    <w:jc w:val="start"/>
+                  </w:pPr>
+                  <w:r>
+                    <w:rPr>
+                      <w:rFonts w:ascii="Calibri" w:hAnsi="Calibri"/>
+                      <w:sz w:val="20"/>
+                    </w:rPr>
+                    <w:t xml:space="default">Fishing mortality penalty</w:t>
+                  </w:r>
+                </w:p>
+              </w:tc>
+              <w:tc>
+                <w:tcPr>
+                  <w:tcBorders>
+                    <w:top w:val="single" w:space="0" w:color="D3D3D3"/>
+                    <w:bottom w:val="single" w:space="0" w:color="D3D3D3"/>
+                    <w:start w:val="single" w:space="0" w:color="D3D3D3"/>
+                    <w:end w:val="single" w:space="0" w:color="D3D3D3"/>
+                  </w:tcBorders>
+                  <w:shd w:val="clear" w:color="auto" w:fill="FFF5F0"/>
+                </w:tcPr>
+                <w:p>
+                  <w:pPr>
+                    <w:spacing w:before="0" w:after="60"/>
+                    <w:keepNext/>
+                    <w:jc w:val="end"/>
+                  </w:pPr>
+                  <w:r>
+                    <w:rPr>
+                      <w:rFonts w:ascii="Calibri" w:hAnsi="Calibri"/>
+                      <w:sz w:val="20"/>
+                    </w:rPr>
+                    <w:t xml:space="default">0.0</w:t>
+                  </w:r>
+                </w:p>
+              </w:tc>
+              <w:tc>
+                <w:tcPr>
+                  <w:tcBorders>
+                    <w:top w:val="single" w:space="0" w:color="D3D3D3"/>
+                    <w:bottom w:val="single" w:space="0" w:color="D3D3D3"/>
+                    <w:start w:val="single" w:space="0" w:color="D3D3D3"/>
+                    <w:end w:val="single" w:space="0" w:color="D3D3D3"/>
+                  </w:tcBorders>
+                  <w:shd w:val="clear" w:color="auto" w:fill="FCAE91"/>
+                </w:tcPr>
+                <w:p>
+                  <w:pPr>
+                    <w:spacing w:before="0" w:after="60"/>
+                    <w:keepNext/>
+                    <w:jc w:val="end"/>
+                  </w:pPr>
+                  <w:r>
+                    <w:rPr>
+                      <w:rFonts w:ascii="Calibri" w:hAnsi="Calibri"/>
+                      <w:sz w:val="20"/>
+                    </w:rPr>
+                    <w:t xml:space="default">0.0</w:t>
+                  </w:r>
+                </w:p>
+              </w:tc>
+              <w:tc>
+                <w:tcPr>
+                  <w:tcBorders>
+                    <w:top w:val="single" w:space="0" w:color="D3D3D3"/>
+                    <w:bottom w:val="single" w:space="0" w:color="D3D3D3"/>
+                    <w:start w:val="single" w:space="0" w:color="D3D3D3"/>
+                    <w:end w:val="single" w:space="0" w:color="D3D3D3"/>
+                  </w:tcBorders>
+                  <w:shd w:val="clear" w:color="auto" w:fill="FCB79D"/>
+                </w:tcPr>
+                <w:p>
+                  <w:pPr>
+                    <w:spacing w:before="0" w:after="60"/>
+                    <w:keepNext/>
+                    <w:jc w:val="end"/>
+                  </w:pPr>
+                  <w:r>
+                    <w:rPr>
+                      <w:rFonts w:ascii="Calibri" w:hAnsi="Calibri"/>
+                      <w:sz w:val="20"/>
+                    </w:rPr>
+                    <w:t xml:space="default">0.0</w:t>
+                  </w:r>
+                </w:p>
+              </w:tc>
+            </w:tr>
+            <w:tr>
+              <w:trPr>
+                <w:cantSplit/>
+              </w:trPr>
+              <w:tc>
+                <w:tcPr>
+                  <w:tcBorders>
+                    <w:top w:val="single" w:space="0" w:color="D3D3D3"/>
+                    <w:bottom w:val="single" w:space="0" w:color="D3D3D3"/>
+                    <w:start w:val="single" w:space="0" w:color="D3D3D3"/>
+                    <w:end w:val="single" w:space="0" w:color="D3D3D3"/>
+                  </w:tcBorders>
+                </w:tcPr>
+                <w:p>
+                  <w:pPr>
+                    <w:spacing w:before="0" w:after="60"/>
+                    <w:keepNext/>
+                    <w:jc w:val="start"/>
+                  </w:pPr>
+                  <w:r>
+                    <w:rPr>
+                      <w:rFonts w:ascii="Calibri" w:hAnsi="Calibri"/>
+                      <w:sz w:val="20"/>
+                    </w:rPr>
+                    <w:t xml:space="default">Index q priors</w:t>
+                  </w:r>
+                </w:p>
+              </w:tc>
+              <w:tc>
+                <w:tcPr>
+                  <w:tcBorders>
+                    <w:top w:val="single" w:space="0" w:color="D3D3D3"/>
+                    <w:bottom w:val="single" w:space="0" w:color="D3D3D3"/>
+                    <w:start w:val="single" w:space="0" w:color="D3D3D3"/>
+                    <w:end w:val="single" w:space="0" w:color="D3D3D3"/>
+                  </w:tcBorders>
+                  <w:shd w:val="clear" w:color="auto" w:fill="FCAE91"/>
+                </w:tcPr>
+                <w:p>
+                  <w:pPr>
+                    <w:spacing w:before="0" w:after="60"/>
+                    <w:keepNext/>
+                    <w:jc w:val="end"/>
+                  </w:pPr>
+                  <w:r>
+                    <w:rPr>
+                      <w:rFonts w:ascii="Calibri" w:hAnsi="Calibri"/>
+                      <w:sz w:val="20"/>
+                    </w:rPr>
+                    <w:t xml:space="default">0.1</w:t>
+                  </w:r>
+                </w:p>
+              </w:tc>
+              <w:tc>
+                <w:tcPr>
+                  <w:tcBorders>
+                    <w:top w:val="single" w:space="0" w:color="D3D3D3"/>
+                    <w:bottom w:val="single" w:space="0" w:color="D3D3D3"/>
+                    <w:start w:val="single" w:space="0" w:color="D3D3D3"/>
+                    <w:end w:val="single" w:space="0" w:color="D3D3D3"/>
+                  </w:tcBorders>
+                  <w:shd w:val="clear" w:color="auto" w:fill="FED3C3"/>
+                </w:tcPr>
+                <w:p>
+                  <w:pPr>
+                    <w:spacing w:before="0" w:after="60"/>
+                    <w:keepNext/>
+                    <w:jc w:val="end"/>
+                  </w:pPr>
+                  <w:r>
+                    <w:rPr>
+                      <w:rFonts w:ascii="Calibri" w:hAnsi="Calibri"/>
+                      <w:sz w:val="20"/>
+                    </w:rPr>
+                    <w:t xml:space="default">0.1</w:t>
+                  </w:r>
+                </w:p>
+              </w:tc>
+              <w:tc>
+                <w:tcPr>
+                  <w:tcBorders>
+                    <w:top w:val="single" w:space="0" w:color="D3D3D3"/>
+                    <w:bottom w:val="single" w:space="0" w:color="D3D3D3"/>
+                    <w:start w:val="single" w:space="0" w:color="D3D3D3"/>
+                    <w:end w:val="single" w:space="0" w:color="D3D3D3"/>
+                  </w:tcBorders>
+                  <w:shd w:val="clear" w:color="auto" w:fill="FFF5F0"/>
+                </w:tcPr>
+                <w:p>
+                  <w:pPr>
+                    <w:spacing w:before="0" w:after="60"/>
+                    <w:keepNext/>
+                    <w:jc w:val="end"/>
+                  </w:pPr>
+                  <w:r>
+                    <w:rPr>
+                      <w:rFonts w:ascii="Calibri" w:hAnsi="Calibri"/>
+                      <w:sz w:val="20"/>
+                    </w:rPr>
+                    <w:t xml:space="default">0.1</w:t>
+                  </w:r>
+                </w:p>
+              </w:tc>
+            </w:tr>
+            <w:tr>
+              <w:trPr>
+                <w:cantSplit/>
+              </w:trPr>
+              <w:tc>
+                <w:tcPr>
+                  <w:tcBorders>
+                    <w:top w:val="single" w:space="0" w:color="D3D3D3"/>
+                    <w:bottom w:val="single" w:space="0" w:color="D3D3D3"/>
+                    <w:start w:val="single" w:space="0" w:color="D3D3D3"/>
+                    <w:end w:val="single" w:space="0" w:color="D3D3D3"/>
+                  </w:tcBorders>
+                </w:tcPr>
+                <w:p>
+                  <w:pPr>
+                    <w:spacing w:before="0" w:after="60"/>
+                    <w:keepNext/>
+                    <w:jc w:val="start"/>
+                  </w:pPr>
+                  <w:r>
+                    <w:rPr>
+                      <w:rFonts w:ascii="Calibri" w:hAnsi="Calibri"/>
+                      <w:sz w:val="20"/>
+                    </w:rPr>
+                    <w:t xml:space="default">Residual term</w:t>
+                  </w:r>
+                </w:p>
+              </w:tc>
+              <w:tc>
+                <w:tcPr>
+                  <w:tcBorders>
+                    <w:top w:val="single" w:space="0" w:color="D3D3D3"/>
+                    <w:bottom w:val="single" w:space="0" w:color="D3D3D3"/>
+                    <w:start w:val="single" w:space="0" w:color="D3D3D3"/>
+                    <w:end w:val="single" w:space="0" w:color="D3D3D3"/>
+                  </w:tcBorders>
+                  <w:shd w:val="clear" w:color="auto" w:fill="FFF5F0"/>
+                </w:tcPr>
+                <w:p>
+                  <w:pPr>
+                    <w:spacing w:before="0" w:after="60"/>
+                    <w:keepNext/>
+                    <w:jc w:val="end"/>
+                  </w:pPr>
+                  <w:r>
+                    <w:rPr>
+                      <w:rFonts w:ascii="Calibri" w:hAnsi="Calibri"/>
+                      <w:sz w:val="20"/>
+                    </w:rPr>
+                    <w:t xml:space="default">0.1</w:t>
+                  </w:r>
+                </w:p>
+              </w:tc>
+              <w:tc>
+                <w:tcPr>
+                  <w:tcBorders>
+                    <w:top w:val="single" w:space="0" w:color="D3D3D3"/>
+                    <w:bottom w:val="single" w:space="0" w:color="D3D3D3"/>
+                    <w:start w:val="single" w:space="0" w:color="D3D3D3"/>
+                    <w:end w:val="single" w:space="0" w:color="D3D3D3"/>
+                  </w:tcBorders>
+                  <w:shd w:val="clear" w:color="auto" w:fill="FCAE91"/>
+                </w:tcPr>
+                <w:p>
+                  <w:pPr>
+                    <w:spacing w:before="0" w:after="60"/>
+                    <w:keepNext/>
+                    <w:jc w:val="end"/>
+                  </w:pPr>
+                  <w:r>
+                    <w:rPr>
+                      <w:rFonts w:ascii="Calibri" w:hAnsi="Calibri"/>
+                      <w:sz w:val="20"/>
+                    </w:rPr>
+                    <w:t xml:space="default">0.0</w:t>
+                  </w:r>
+                </w:p>
+              </w:tc>
+              <w:tc>
+                <w:tcPr>
+                  <w:tcBorders>
+                    <w:top w:val="single" w:space="0" w:color="D3D3D3"/>
+                    <w:bottom w:val="single" w:space="0" w:color="D3D3D3"/>
+                    <w:start w:val="single" w:space="0" w:color="D3D3D3"/>
+                    <w:end w:val="single" w:space="0" w:color="D3D3D3"/>
+                  </w:tcBorders>
+                  <w:shd w:val="clear" w:color="auto" w:fill="FCB69C"/>
+                </w:tcPr>
+                <w:p>
+                  <w:pPr>
+                    <w:spacing w:before="0" w:after="60"/>
+                    <w:keepNext/>
+                    <w:jc w:val="end"/>
+                  </w:pPr>
+                  <w:r>
+                    <w:rPr>
+                      <w:rFonts w:ascii="Calibri" w:hAnsi="Calibri"/>
+                      <w:sz w:val="20"/>
+                    </w:rPr>
+                    <w:t xml:space="default">0.0</w:t>
+                  </w:r>
+                </w:p>
+              </w:tc>
+            </w:tr>
+            <w:tr>
+              <w:trPr>
+                <w:cantSplit/>
+              </w:trPr>
+              <w:tc>
+                <w:tcPr>
+                  <w:tcBorders>
+                    <w:top w:val="single" w:space="0" w:color="D3D3D3"/>
+                    <w:bottom w:val="single" w:space="0" w:color="D3D3D3"/>
+                    <w:start w:val="single" w:space="0" w:color="D3D3D3"/>
+                    <w:end w:val="single" w:space="0" w:color="D3D3D3"/>
+                  </w:tcBorders>
+                </w:tcPr>
+                <w:p>
+                  <w:pPr>
+                    <w:spacing w:before="0" w:after="60"/>
+                    <w:keepNext/>
+                    <w:jc w:val="start"/>
+                  </w:pPr>
+                  <w:r>
+                    <w:rPr>
+                      <w:rFonts w:ascii="Calibri" w:hAnsi="Calibri"/>
+                      <w:sz w:val="20"/>
+                    </w:rPr>
+                    <w:t xml:space="default">Total negative log likelihood</w:t>
+                  </w:r>
+                </w:p>
+              </w:tc>
+              <w:tc>
+                <w:tcPr>
+                  <w:tcBorders>
+                    <w:top w:val="single" w:space="0" w:color="D3D3D3"/>
+                    <w:bottom w:val="single" w:space="0" w:color="D3D3D3"/>
+                    <w:start w:val="single" w:space="0" w:color="D3D3D3"/>
+                    <w:end w:val="single" w:space="0" w:color="D3D3D3"/>
+                  </w:tcBorders>
+                  <w:shd w:val="clear" w:color="auto" w:fill="FCAE91"/>
+                </w:tcPr>
+                <w:p>
+                  <w:pPr>
+                    <w:spacing w:before="0" w:after="60"/>
+                    <w:keepNext/>
+                    <w:jc w:val="end"/>
+                  </w:pPr>
+                  <w:r>
+                    <w:rPr>
+                      <w:rFonts w:ascii="Calibri" w:hAnsi="Calibri"/>
+                      <w:sz w:val="20"/>
+                    </w:rPr>
+                    <w:t xml:space="default">1,234.7</w:t>
+                  </w:r>
+                </w:p>
+              </w:tc>
+              <w:tc>
+                <w:tcPr>
+                  <w:tcBorders>
+                    <w:top w:val="single" w:space="0" w:color="D3D3D3"/>
+                    <w:bottom w:val="single" w:space="0" w:color="D3D3D3"/>
+                    <w:start w:val="single" w:space="0" w:color="D3D3D3"/>
+                    <w:end w:val="single" w:space="0" w:color="D3D3D3"/>
+                  </w:tcBorders>
+                  <w:shd w:val="clear" w:color="auto" w:fill="FFF5F0"/>
+                </w:tcPr>
+                <w:p>
+                  <w:pPr>
+                    <w:spacing w:before="0" w:after="60"/>
+                    <w:keepNext/>
+                    <w:jc w:val="end"/>
+                  </w:pPr>
+                  <w:r>
+                    <w:rPr>
+                      <w:rFonts w:ascii="Calibri" w:hAnsi="Calibri"/>
+                      <w:sz w:val="20"/>
+                    </w:rPr>
+                    <w:t xml:space="default">1,544.1</w:t>
+                  </w:r>
+                </w:p>
+              </w:tc>
+              <w:tc>
+                <w:tcPr>
+                  <w:tcBorders>
+                    <w:top w:val="single" w:space="0" w:color="D3D3D3"/>
+                    <w:bottom w:val="single" w:space="0" w:color="D3D3D3"/>
+                    <w:start w:val="single" w:space="0" w:color="D3D3D3"/>
+                    <w:end w:val="single" w:space="0" w:color="D3D3D3"/>
+                  </w:tcBorders>
+                  <w:shd w:val="clear" w:color="auto" w:fill="FDCCB9"/>
+                </w:tcPr>
+                <w:p>
+                  <w:pPr>
+                    <w:spacing w:before="0" w:after="60"/>
+                    <w:keepNext/>
+                    <w:jc w:val="end"/>
+                  </w:pPr>
+                  <w:r>
+                    <w:rPr>
+                      <w:rFonts w:ascii="Calibri" w:hAnsi="Calibri"/>
+                      <w:sz w:val="20"/>
+                    </w:rPr>
+                    <w:t xml:space="default">1,364.8</w:t>
+                  </w:r>
+                </w:p>
+              </w:tc>
+            </w:tr>
+            <w:tr>
+              <w:trPr>
+                <w:cantSplit/>
+              </w:trPr>
+              <w:tc>
+                <w:tcPr>
+                  <w:tcBorders>
+                    <w:top w:val="single" w:space="0" w:color="D3D3D3"/>
+                    <w:bottom w:val="single" w:space="0" w:color="D3D3D3"/>
+                    <w:start w:val="single" w:space="0" w:color="D3D3D3"/>
+                    <w:end w:val="single" w:space="0" w:color="D3D3D3"/>
+                  </w:tcBorders>
+                </w:tcPr>
+                <w:p>
+                  <w:pPr>
+                    <w:spacing w:before="0" w:after="60"/>
+                    <w:keepNext/>
+                    <w:jc w:val="start"/>
+                  </w:pPr>
+                  <w:r>
+                    <w:rPr>
+                      <w:rFonts w:ascii="Calibri" w:hAnsi="Calibri"/>
+                      <w:sz w:val="20"/>
+                    </w:rPr>
+                    <w:t xml:space="default">Estimated parameters (count)</w:t>
+                  </w:r>
+                </w:p>
+              </w:tc>
+              <w:tc>
+                <w:tcPr>
+                  <w:tcBorders>
+                    <w:top w:val="single" w:space="0" w:color="D3D3D3"/>
+                    <w:bottom w:val="single" w:space="0" w:color="D3D3D3"/>
+                    <w:start w:val="single" w:space="0" w:color="D3D3D3"/>
+                    <w:end w:val="single" w:space="0" w:color="D3D3D3"/>
+                  </w:tcBorders>
+                  <w:shd w:val="clear" w:color="auto" w:fill="FFF5F0"/>
+                </w:tcPr>
+                <w:p>
+                  <w:pPr>
+                    <w:spacing w:before="0" w:after="60"/>
+                    <w:keepNext/>
+                    <w:jc w:val="end"/>
+                  </w:pPr>
+                  <w:r>
+                    <w:rPr>
+                      <w:rFonts w:ascii="Calibri" w:hAnsi="Calibri"/>
+                      <w:sz w:val="20"/>
+                    </w:rPr>
+                    <w:t xml:space="default">1,821</w:t>
+                  </w:r>
+                </w:p>
+              </w:tc>
+              <w:tc>
+                <w:tcPr>
+                  <w:tcBorders>
+                    <w:top w:val="single" w:space="0" w:color="D3D3D3"/>
+                    <w:bottom w:val="single" w:space="0" w:color="D3D3D3"/>
+                    <w:start w:val="single" w:space="0" w:color="D3D3D3"/>
+                    <w:end w:val="single" w:space="0" w:color="D3D3D3"/>
+                  </w:tcBorders>
+                  <w:shd w:val="clear" w:color="auto" w:fill="FCAE91"/>
+                </w:tcPr>
+                <w:p>
+                  <w:pPr>
+                    <w:spacing w:before="0" w:after="60"/>
+                    <w:keepNext/>
+                    <w:jc w:val="end"/>
+                  </w:pPr>
+                  <w:r>
+                    <w:rPr>
+                      <w:rFonts w:ascii="Calibri" w:hAnsi="Calibri"/>
+                      <w:sz w:val="20"/>
+                    </w:rPr>
+                    <w:t xml:space="default">480</w:t>
+                  </w:r>
+                </w:p>
+              </w:tc>
+              <w:tc>
+                <w:tcPr>
+                  <w:tcBorders>
+                    <w:top w:val="single" w:space="0" w:color="D3D3D3"/>
+                    <w:bottom w:val="single" w:space="0" w:color="D3D3D3"/>
+                    <w:start w:val="single" w:space="0" w:color="D3D3D3"/>
+                    <w:end w:val="single" w:space="0" w:color="D3D3D3"/>
+                  </w:tcBorders>
+                  <w:shd w:val="clear" w:color="auto" w:fill="FDC3AD"/>
+                </w:tcPr>
+                <w:p>
+                  <w:pPr>
+                    <w:spacing w:before="0" w:after="60"/>
+                    <w:keepNext/>
+                    <w:jc w:val="end"/>
+                  </w:pPr>
+                  <w:r>
+                    <w:rPr>
+                      <w:rFonts w:ascii="Calibri" w:hAnsi="Calibri"/>
+                      <w:sz w:val="20"/>
+                    </w:rPr>
+                    <w:t xml:space="default">870</w:t>
+                  </w:r>
+                </w:p>
+              </w:tc>
+            </w:tr>
+          </w:tbl>
+          <w:bookmarkEnd w:id="95"/>
+        </w:tc>
+      </w:tr>
+    </w:tbl>
+    <w:bookmarkEnd w:id="96"/>
+    <w:bookmarkEnd w:id="97"/>
+    <w:bookmarkEnd w:id="98"/>
+    <w:bookmarkStart w:id="106" w:name="harmonized-northern-treatment"/>
     <w:p>
       <w:pPr>
         <w:pStyle w:val="Heading2"/>
@@ -8047,12 +10919,12 @@
                 <wp:inline>
                   <wp:extent cx="152400" cy="152400"/>
                   <wp:effectExtent b="0" l="0" r="0" t="0"/>
-                  <wp:docPr descr="" title="" id="89" name="Picture"/>
+                  <wp:docPr descr="" title="" id="99" name="Picture"/>
                   <a:graphic>
                     <a:graphicData uri="http://schemas.openxmlformats.org/drawingml/2006/picture">
                       <pic:pic>
                         <pic:nvPicPr>
-                          <pic:cNvPr descr="/Applications/quarto/share/formats/docx/note.png" id="90" name="Picture"/>
+                          <pic:cNvPr descr="/Applications/quarto/share/formats/docx/note.png" id="100" name="Picture"/>
                           <pic:cNvPicPr>
                             <a:picLocks noChangeArrowheads="1" noChangeAspect="1"/>
                           </pic:cNvPicPr>
@@ -8377,7 +11249,7 @@
           <w:rPr>
             <w:rStyle w:val="Hyperlink"/>
           </w:rPr>
-          <w:t xml:space="preserve">Table 4</w:t>
+          <w:t xml:space="preserve">Table 5</w:t>
         </w:r>
       </w:hyperlink>
       <w:r>
@@ -8391,7 +11263,7 @@
           <w:rPr>
             <w:rStyle w:val="Hyperlink"/>
           </w:rPr>
-          <w:t xml:space="preserve">Figure 8</w:t>
+          <w:t xml:space="preserve">Figure 9</w:t>
         </w:r>
       </w:hyperlink>
       <w:r>
@@ -8411,7 +11283,7 @@
       <w:tr>
         <w:tc>
           <w:tcPr/>
-          <w:bookmarkStart w:id="91" w:name="tbl-north-harmonized-like-components"/>
+          <w:bookmarkStart w:id="101" w:name="tbl-north-harmonized-like-components"/>
           <w:p>
             <w:pPr>
               <w:jc w:val="center"/>
@@ -8422,7 +11294,7 @@
               <w:pStyle w:val="ImageCaption"/>
             </w:pPr>
             <w:r>
-              <w:t xml:space="preserve">Table 4: Negative-log-likelihood components and estimated parameter counts for the reduced-index single-stock model (</w:t>
+              <w:t xml:space="preserve">Table 5: Negative-log-likelihood components and estimated parameter counts for the reduced-index single-stock model (</w:t>
             </w:r>
             <w:r>
               <w:rPr>
@@ -10641,7 +13513,7 @@
               </w:tc>
             </w:tr>
           </w:tbl>
-          <w:bookmarkEnd w:id="91"/>
+          <w:bookmarkEnd w:id="101"/>
         </w:tc>
       </w:tr>
     </w:tbl>
@@ -10660,7 +13532,7 @@
           <w:rPr>
             <w:rStyle w:val="Hyperlink"/>
           </w:rPr>
-          <w:t xml:space="preserve">Figure 8</w:t>
+          <w:t xml:space="preserve">Figure 9</w:t>
         </w:r>
       </w:hyperlink>
       <w:r>
@@ -10722,7 +13594,7 @@
       <w:tr>
         <w:tc>
           <w:tcPr/>
-          <w:bookmarkStart w:id="95" w:name="fig-harmonized-index-fits"/>
+          <w:bookmarkStart w:id="105" w:name="fig-harmonized-index-fits"/>
           <w:p>
             <w:pPr>
               <w:pStyle w:val="Compact"/>
@@ -10733,18 +13605,18 @@
                 <wp:inline>
                   <wp:extent cx="5334000" cy="4333875"/>
                   <wp:effectExtent b="0" l="0" r="0" t="0"/>
-                  <wp:docPr descr="" title="" id="93" name="Picture"/>
+                  <wp:docPr descr="" title="" id="103" name="Picture"/>
                   <a:graphic>
                     <a:graphicData uri="http://schemas.openxmlformats.org/drawingml/2006/picture">
                       <pic:pic>
                         <pic:nvPicPr>
-                          <pic:cNvPr descr="JM-WP-BM-01_files/figure-docx/fig-harmonized-index-fits-1.png" id="94" name="Picture"/>
+                          <pic:cNvPr descr="JM-WP-BM-01_files/figure-docx/fig-harmonized-index-fits-1.png" id="104" name="Picture"/>
                           <pic:cNvPicPr>
                             <a:picLocks noChangeArrowheads="1" noChangeAspect="1"/>
                           </pic:cNvPicPr>
                         </pic:nvPicPr>
                         <pic:blipFill>
-                          <a:blip r:embed="rId92"/>
+                          <a:blip r:embed="rId102"/>
                           <a:stretch>
                             <a:fillRect/>
                           </a:stretch>
@@ -10781,7 +13653,7 @@
               <w:pStyle w:val="ImageCaption"/>
             </w:pPr>
             <w:r>
-              <w:t xml:space="preserve">Figure 8: Observed and fitted index trajectories for</w:t>
+              <w:t xml:space="preserve">Figure 9: Observed and fitted index trajectories for</w:t>
             </w:r>
             <w:r>
               <w:t xml:space="preserve"> </w:t>
@@ -10820,12 +13692,12 @@
               <w:t xml:space="preserve">. Panels show the retained comparable index series: South-Central Chile CPUE, Acoustic North, Peruvian CPUE, and Offshore CPUE.</w:t>
             </w:r>
           </w:p>
-          <w:bookmarkEnd w:id="95"/>
+          <w:bookmarkEnd w:id="105"/>
         </w:tc>
       </w:tr>
     </w:tbl>
-    <w:bookmarkEnd w:id="96"/>
-    <w:bookmarkStart w:id="107" w:name="simplified-recruitment-alternatives"/>
+    <w:bookmarkEnd w:id="106"/>
+    <w:bookmarkStart w:id="117" w:name="simplified-recruitment-alternatives"/>
     <w:p>
       <w:pPr>
         <w:pStyle w:val="Heading2"/>
@@ -10913,12 +13785,12 @@
                 <wp:inline>
                   <wp:extent cx="152400" cy="152400"/>
                   <wp:effectExtent b="0" l="0" r="0" t="0"/>
-                  <wp:docPr descr="" title="" id="97" name="Picture"/>
+                  <wp:docPr descr="" title="" id="107" name="Picture"/>
                   <a:graphic>
                     <a:graphicData uri="http://schemas.openxmlformats.org/drawingml/2006/picture">
                       <pic:pic>
                         <pic:nvPicPr>
-                          <pic:cNvPr descr="/Applications/quarto/share/formats/docx/note.png" id="98" name="Picture"/>
+                          <pic:cNvPr descr="/Applications/quarto/share/formats/docx/note.png" id="108" name="Picture"/>
                           <pic:cNvPicPr>
                             <a:picLocks noChangeArrowheads="1" noChangeAspect="1"/>
                           </pic:cNvPicPr>
@@ -11095,7 +13967,7 @@
           <w:rPr>
             <w:rStyle w:val="Hyperlink"/>
           </w:rPr>
-          <w:t xml:space="preserve">Figure 9</w:t>
+          <w:t xml:space="preserve">Figure 10</w:t>
         </w:r>
       </w:hyperlink>
       <w:r>
@@ -11115,7 +13987,7 @@
       <w:tr>
         <w:tc>
           <w:tcPr/>
-          <w:bookmarkStart w:id="102" w:name="fig-h2-sr-compare"/>
+          <w:bookmarkStart w:id="112" w:name="fig-h2-sr-compare"/>
           <w:p>
             <w:pPr>
               <w:pStyle w:val="Compact"/>
@@ -11126,18 +13998,18 @@
                 <wp:inline>
                   <wp:extent cx="5334000" cy="3194843"/>
                   <wp:effectExtent b="0" l="0" r="0" t="0"/>
-                  <wp:docPr descr="" title="" id="100" name="Picture"/>
+                  <wp:docPr descr="" title="" id="110" name="Picture"/>
                   <a:graphic>
                     <a:graphicData uri="http://schemas.openxmlformats.org/drawingml/2006/picture">
                       <pic:pic>
                         <pic:nvPicPr>
-                          <pic:cNvPr descr="JM-WP-BM-01_files/figure-docx/fig-h2-sr-compare-1.png" id="101" name="Picture"/>
+                          <pic:cNvPr descr="JM-WP-BM-01_files/figure-docx/fig-h2-sr-compare-1.png" id="111" name="Picture"/>
                           <pic:cNvPicPr>
                             <a:picLocks noChangeArrowheads="1" noChangeAspect="1"/>
                           </pic:cNvPicPr>
                         </pic:nvPicPr>
                         <pic:blipFill>
-                          <a:blip r:embed="rId99"/>
+                          <a:blip r:embed="rId109"/>
                           <a:stretch>
                             <a:fillRect/>
                           </a:stretch>
@@ -11174,7 +14046,7 @@
               <w:pStyle w:val="ImageCaption"/>
             </w:pPr>
             <w:r>
-              <w:t xml:space="preserve">Figure 9: Stock-2 Beverton-Holt stock-recruitment curves for</w:t>
+              <w:t xml:space="preserve">Figure 10: Stock-2 Beverton-Holt stock-recruitment curves for</w:t>
             </w:r>
             <w:r>
               <w:t xml:space="preserve"> </w:t>
@@ -11228,7 +14100,7 @@
               <w:t xml:space="preserve">.</w:t>
             </w:r>
           </w:p>
-          <w:bookmarkEnd w:id="102"/>
+          <w:bookmarkEnd w:id="112"/>
         </w:tc>
       </w:tr>
     </w:tbl>
@@ -11247,7 +14119,7 @@
           <w:rPr>
             <w:rStyle w:val="Hyperlink"/>
           </w:rPr>
-          <w:t xml:space="preserve">Figure 10</w:t>
+          <w:t xml:space="preserve">Figure 11</w:t>
         </w:r>
       </w:hyperlink>
       <w:r>
@@ -11267,7 +14139,7 @@
       <w:tr>
         <w:tc>
           <w:tcPr/>
-          <w:bookmarkStart w:id="106" w:name="fig-h2-stock2-rec"/>
+          <w:bookmarkStart w:id="116" w:name="fig-h2-stock2-rec"/>
           <w:p>
             <w:pPr>
               <w:pStyle w:val="Compact"/>
@@ -11278,18 +14150,18 @@
                 <wp:inline>
                   <wp:extent cx="5334000" cy="3062882"/>
                   <wp:effectExtent b="0" l="0" r="0" t="0"/>
-                  <wp:docPr descr="" title="" id="104" name="Picture"/>
+                  <wp:docPr descr="" title="" id="114" name="Picture"/>
                   <a:graphic>
                     <a:graphicData uri="http://schemas.openxmlformats.org/drawingml/2006/picture">
                       <pic:pic>
                         <pic:nvPicPr>
-                          <pic:cNvPr descr="JM-WP-BM-01_files/figure-docx/fig-h2-stock2-rec-1.png" id="105" name="Picture"/>
+                          <pic:cNvPr descr="JM-WP-BM-01_files/figure-docx/fig-h2-stock2-rec-1.png" id="115" name="Picture"/>
                           <pic:cNvPicPr>
                             <a:picLocks noChangeArrowheads="1" noChangeAspect="1"/>
                           </pic:cNvPicPr>
                         </pic:nvPicPr>
                         <pic:blipFill>
-                          <a:blip r:embed="rId103"/>
+                          <a:blip r:embed="rId113"/>
                           <a:stretch>
                             <a:fillRect/>
                           </a:stretch>
@@ -11326,7 +14198,7 @@
               <w:pStyle w:val="ImageCaption"/>
             </w:pPr>
             <w:r>
-              <w:t xml:space="preserve">Figure 10: Estimated stock-2 recruitment trajectories for</w:t>
+              <w:t xml:space="preserve">Figure 11: Estimated stock-2 recruitment trajectories for</w:t>
             </w:r>
             <w:r>
               <w:t xml:space="preserve"> </w:t>
@@ -11356,12 +14228,12 @@
               <w:t xml:space="preserve">.</w:t>
             </w:r>
           </w:p>
-          <w:bookmarkEnd w:id="106"/>
+          <w:bookmarkEnd w:id="116"/>
         </w:tc>
       </w:tr>
     </w:tbl>
-    <w:bookmarkEnd w:id="107"/>
-    <w:bookmarkStart w:id="110" w:name="fixed-reference-point-alternatives"/>
+    <w:bookmarkEnd w:id="117"/>
+    <w:bookmarkStart w:id="120" w:name="fixed-reference-point-alternatives"/>
     <w:p>
       <w:pPr>
         <w:pStyle w:val="Heading2"/>
@@ -11505,12 +14377,12 @@
                 <wp:inline>
                   <wp:extent cx="152400" cy="152400"/>
                   <wp:effectExtent b="0" l="0" r="0" t="0"/>
-                  <wp:docPr descr="" title="" id="108" name="Picture"/>
+                  <wp:docPr descr="" title="" id="118" name="Picture"/>
                   <a:graphic>
                     <a:graphicData uri="http://schemas.openxmlformats.org/drawingml/2006/picture">
                       <pic:pic>
                         <pic:nvPicPr>
-                          <pic:cNvPr descr="/Applications/quarto/share/formats/docx/note.png" id="109" name="Picture"/>
+                          <pic:cNvPr descr="/Applications/quarto/share/formats/docx/note.png" id="119" name="Picture"/>
                           <pic:cNvPicPr>
                             <a:picLocks noChangeArrowheads="1" noChangeAspect="1"/>
                           </pic:cNvPicPr>
@@ -11634,9 +14506,9 @@
         <w:t xml:space="preserve">The recommended approach is therefore to calculate reference points once, using the terminal selectivity block and the current biological schedules, and use those fixed values as management benchmarks throughout the MSE simulation. Sensitivity to the choice of reference period can be examined as part of robustness testing.</w:t>
       </w:r>
     </w:p>
-    <w:bookmarkEnd w:id="110"/>
-    <w:bookmarkEnd w:id="111"/>
-    <w:bookmarkStart w:id="112" w:name="summary"/>
+    <w:bookmarkEnd w:id="120"/>
+    <w:bookmarkEnd w:id="121"/>
+    <w:bookmarkStart w:id="122" w:name="summary"/>
     <w:p>
       <w:pPr>
         <w:pStyle w:val="Heading1"/>
@@ -11911,8 +14783,8 @@
         <w:t xml:space="preserve">improvements to the standardization of indices.</w:t>
       </w:r>
     </w:p>
-    <w:bookmarkEnd w:id="112"/>
-    <w:bookmarkStart w:id="122" w:name="appendix-compact-equation-summary"/>
+    <w:bookmarkEnd w:id="122"/>
+    <w:bookmarkStart w:id="132" w:name="appendix-compact-equation-summary"/>
     <w:p>
       <w:pPr>
         <w:pStyle w:val="Heading1"/>
@@ -11929,7 +14801,7 @@
         <w:t xml:space="preserve">This appendix gives a compact schematic description of the equations underlying the SC13 Joint Jack Mackerel Model. It is intended to summarize the structure used in this working paper rather than to reproduce every implementation detail of the ADMB code or every option described in the technical annex and user guide.</w:t>
       </w:r>
     </w:p>
-    <w:bookmarkStart w:id="113" w:name="notation"/>
+    <w:bookmarkStart w:id="123" w:name="notation"/>
     <w:p>
       <w:pPr>
         <w:pStyle w:val="Heading2"/>
@@ -12519,8 +15391,8 @@
         <w:t xml:space="preserve">.</w:t>
       </w:r>
     </w:p>
-    <w:bookmarkEnd w:id="113"/>
-    <w:bookmarkStart w:id="114" w:name="population-update"/>
+    <w:bookmarkEnd w:id="123"/>
+    <w:bookmarkStart w:id="124" w:name="population-update"/>
     <w:p>
       <w:pPr>
         <w:pStyle w:val="Heading2"/>
@@ -13528,8 +16400,8 @@
         <w:t xml:space="preserve">is the fraction of annual mortality occurring before spawning.</w:t>
       </w:r>
     </w:p>
-    <w:bookmarkEnd w:id="114"/>
-    <w:bookmarkStart w:id="115" w:name="stock-recruitment-relationship"/>
+    <w:bookmarkEnd w:id="124"/>
+    <w:bookmarkStart w:id="125" w:name="stock-recruitment-relationship"/>
     <w:p>
       <w:pPr>
         <w:pStyle w:val="Heading2"/>
@@ -14054,8 +16926,8 @@
         <w:t xml:space="preserve">, recruitment is assigned across two stocks with a more complex regime structure, including the 1999 shift described in the control file.</w:t>
       </w:r>
     </w:p>
-    <w:bookmarkEnd w:id="115"/>
-    <w:bookmarkStart w:id="116" w:name="fishing-mortality-and-catch"/>
+    <w:bookmarkEnd w:id="125"/>
+    <w:bookmarkStart w:id="126" w:name="fishing-mortality-and-catch"/>
     <w:p>
       <w:pPr>
         <w:pStyle w:val="Heading2"/>
@@ -14731,8 +17603,8 @@
         </m:oMath>
       </m:oMathPara>
     </w:p>
-    <w:bookmarkEnd w:id="116"/>
-    <w:bookmarkStart w:id="117" w:name="abundance-indices"/>
+    <w:bookmarkEnd w:id="126"/>
+    <w:bookmarkStart w:id="127" w:name="abundance-indices"/>
     <w:p>
       <w:pPr>
         <w:pStyle w:val="Heading2"/>
@@ -15139,8 +18011,8 @@
         <w:t xml:space="preserve">places the survey or CPUE observation within the year. This expression is schematic because some indices are closer to numbers-at-age and others to biomass, but it captures the model logic used across the SC13 index components.</w:t>
       </w:r>
     </w:p>
-    <w:bookmarkEnd w:id="117"/>
-    <w:bookmarkStart w:id="118" w:name="age-and-length-compositions"/>
+    <w:bookmarkEnd w:id="127"/>
+    <w:bookmarkStart w:id="128" w:name="age-and-length-compositions"/>
     <w:p>
       <w:pPr>
         <w:pStyle w:val="Heading2"/>
@@ -15653,8 +18525,8 @@
         <w:t xml:space="preserve">, derived from the von Bertalanffy growth specification used by the model.</w:t>
       </w:r>
     </w:p>
-    <w:bookmarkEnd w:id="118"/>
-    <w:bookmarkStart w:id="119" w:name="observation-likelihoods"/>
+    <w:bookmarkEnd w:id="128"/>
+    <w:bookmarkStart w:id="129" w:name="observation-likelihoods"/>
     <w:p>
       <w:pPr>
         <w:pStyle w:val="Heading2"/>
@@ -16263,8 +19135,8 @@
         <w:t xml:space="preserve">The SC13 model uses Francis weighting for age-composition effective sample sizes, so the composition likelihood is strongly affected by those externally specified weights.</w:t>
       </w:r>
     </w:p>
-    <w:bookmarkEnd w:id="119"/>
-    <w:bookmarkStart w:id="120" w:name="objective-function"/>
+    <w:bookmarkEnd w:id="129"/>
+    <w:bookmarkStart w:id="130" w:name="objective-function"/>
     <w:p>
       <w:pPr>
         <w:pStyle w:val="Heading2"/>
@@ -16610,8 +19482,8 @@
         <w:t xml:space="preserve">, is especially important in SC13 because the model includes extensive penalties on fishery and survey selectivity trajectories to regularize the time-varying non-parametric selectivity schedules.</w:t>
       </w:r>
     </w:p>
-    <w:bookmarkEnd w:id="120"/>
-    <w:bookmarkStart w:id="121" w:name="dynamic-reference-points"/>
+    <w:bookmarkEnd w:id="130"/>
+    <w:bookmarkStart w:id="131" w:name="dynamic-reference-points"/>
     <w:p>
       <w:pPr>
         <w:pStyle w:val="Heading2"/>
@@ -17035,9 +19907,9 @@
         <w:t xml:space="preserve">vary through time in the SC13 assessment rather than remaining fixed constants.</w:t>
       </w:r>
     </w:p>
-    <w:bookmarkEnd w:id="121"/>
-    <w:bookmarkEnd w:id="122"/>
-    <w:bookmarkStart w:id="156" w:name="references"/>
+    <w:bookmarkEnd w:id="131"/>
+    <w:bookmarkEnd w:id="132"/>
+    <w:bookmarkStart w:id="166" w:name="references"/>
     <w:p>
       <w:pPr>
         <w:pStyle w:val="Heading1"/>
@@ -17046,8 +19918,8 @@
         <w:t xml:space="preserve">References</w:t>
       </w:r>
     </w:p>
-    <w:bookmarkStart w:id="155" w:name="refs"/>
-    <w:bookmarkStart w:id="124" w:name="ref-vonbertalanffy1957growth"/>
+    <w:bookmarkStart w:id="165" w:name="refs"/>
+    <w:bookmarkStart w:id="134" w:name="ref-vonbertalanffy1957growth"/>
     <w:p>
       <w:pPr>
         <w:pStyle w:val="Bibliography"/>
@@ -17084,7 +19956,7 @@
       <w:r>
         <w:t xml:space="preserve"> </w:t>
       </w:r>
-      <w:hyperlink r:id="rId123">
+      <w:hyperlink r:id="rId133">
         <w:r>
           <w:rPr>
             <w:rStyle w:val="Hyperlink"/>
@@ -17093,8 +19965,8 @@
         </w:r>
       </w:hyperlink>
     </w:p>
-    <w:bookmarkEnd w:id="124"/>
-    <w:bookmarkStart w:id="125" w:name="ref-beverton1957dynamics"/>
+    <w:bookmarkEnd w:id="134"/>
+    <w:bookmarkStart w:id="135" w:name="ref-beverton1957dynamics"/>
     <w:p>
       <w:pPr>
         <w:pStyle w:val="Bibliography"/>
@@ -17119,8 +19991,8 @@
         <w:t xml:space="preserve">(Vol. 19, p. 533). H. M. Stationery Office.</w:t>
       </w:r>
     </w:p>
-    <w:bookmarkEnd w:id="125"/>
-    <w:bookmarkStart w:id="127" w:name="ref-butterworth1999procedures"/>
+    <w:bookmarkEnd w:id="135"/>
+    <w:bookmarkStart w:id="137" w:name="ref-butterworth1999procedures"/>
     <w:p>
       <w:pPr>
         <w:pStyle w:val="Bibliography"/>
@@ -17157,7 +20029,7 @@
       <w:r>
         <w:t xml:space="preserve"> </w:t>
       </w:r>
-      <w:hyperlink r:id="rId126">
+      <w:hyperlink r:id="rId136">
         <w:r>
           <w:rPr>
             <w:rStyle w:val="Hyperlink"/>
@@ -17166,8 +20038,8 @@
         </w:r>
       </w:hyperlink>
     </w:p>
-    <w:bookmarkEnd w:id="127"/>
-    <w:bookmarkStart w:id="129" w:name="ref-carruthers2024roadmap"/>
+    <w:bookmarkEnd w:id="137"/>
+    <w:bookmarkStart w:id="139" w:name="ref-carruthers2024roadmap"/>
     <w:p>
       <w:pPr>
         <w:pStyle w:val="Bibliography"/>
@@ -17230,7 +20102,7 @@
       <w:r>
         <w:t xml:space="preserve"> </w:t>
       </w:r>
-      <w:hyperlink r:id="rId128">
+      <w:hyperlink r:id="rId138">
         <w:r>
           <w:rPr>
             <w:rStyle w:val="Hyperlink"/>
@@ -17239,8 +20111,8 @@
         </w:r>
       </w:hyperlink>
     </w:p>
-    <w:bookmarkEnd w:id="129"/>
-    <w:bookmarkStart w:id="131" w:name="ref-fournier2012admb"/>
+    <w:bookmarkEnd w:id="139"/>
+    <w:bookmarkStart w:id="141" w:name="ref-fournier2012admb"/>
     <w:p>
       <w:pPr>
         <w:pStyle w:val="Bibliography"/>
@@ -17277,7 +20149,7 @@
       <w:r>
         <w:t xml:space="preserve"> </w:t>
       </w:r>
-      <w:hyperlink r:id="rId130">
+      <w:hyperlink r:id="rId140">
         <w:r>
           <w:rPr>
             <w:rStyle w:val="Hyperlink"/>
@@ -17286,8 +20158,8 @@
         </w:r>
       </w:hyperlink>
     </w:p>
-    <w:bookmarkEnd w:id="131"/>
-    <w:bookmarkStart w:id="133" w:name="ref-fournier1982catchage"/>
+    <w:bookmarkEnd w:id="141"/>
+    <w:bookmarkStart w:id="143" w:name="ref-fournier1982catchage"/>
     <w:p>
       <w:pPr>
         <w:pStyle w:val="Bibliography"/>
@@ -17324,7 +20196,7 @@
       <w:r>
         <w:t xml:space="preserve"> </w:t>
       </w:r>
-      <w:hyperlink r:id="rId132">
+      <w:hyperlink r:id="rId142">
         <w:r>
           <w:rPr>
             <w:rStyle w:val="Hyperlink"/>
@@ -17333,8 +20205,8 @@
         </w:r>
       </w:hyperlink>
     </w:p>
-    <w:bookmarkEnd w:id="133"/>
-    <w:bookmarkStart w:id="135" w:name="ref-francis2011weighting"/>
+    <w:bookmarkEnd w:id="143"/>
+    <w:bookmarkStart w:id="145" w:name="ref-francis2011weighting"/>
     <w:p>
       <w:pPr>
         <w:pStyle w:val="Bibliography"/>
@@ -17371,7 +20243,7 @@
       <w:r>
         <w:t xml:space="preserve"> </w:t>
       </w:r>
-      <w:hyperlink r:id="rId134">
+      <w:hyperlink r:id="rId144">
         <w:r>
           <w:rPr>
             <w:rStyle w:val="Hyperlink"/>
@@ -17380,8 +20252,8 @@
         </w:r>
       </w:hyperlink>
     </w:p>
-    <w:bookmarkEnd w:id="135"/>
-    <w:bookmarkStart w:id="137" w:name="ref-hilborn1992quantitative"/>
+    <w:bookmarkEnd w:id="145"/>
+    <w:bookmarkStart w:id="147" w:name="ref-hilborn1992quantitative"/>
     <w:p>
       <w:pPr>
         <w:pStyle w:val="Bibliography"/>
@@ -17405,7 +20277,7 @@
       <w:r>
         <w:t xml:space="preserve"> </w:t>
       </w:r>
-      <w:hyperlink r:id="rId136">
+      <w:hyperlink r:id="rId146">
         <w:r>
           <w:rPr>
             <w:rStyle w:val="Hyperlink"/>
@@ -17414,8 +20286,8 @@
         </w:r>
       </w:hyperlink>
     </w:p>
-    <w:bookmarkEnd w:id="137"/>
-    <w:bookmarkStart w:id="139" w:name="ref-linton2011selectivity"/>
+    <w:bookmarkEnd w:id="147"/>
+    <w:bookmarkStart w:id="149" w:name="ref-linton2011selectivity"/>
     <w:p>
       <w:pPr>
         <w:pStyle w:val="Bibliography"/>
@@ -17452,7 +20324,7 @@
       <w:r>
         <w:t xml:space="preserve"> </w:t>
       </w:r>
-      <w:hyperlink r:id="rId138">
+      <w:hyperlink r:id="rId148">
         <w:r>
           <w:rPr>
             <w:rStyle w:val="Hyperlink"/>
@@ -17461,8 +20333,8 @@
         </w:r>
       </w:hyperlink>
     </w:p>
-    <w:bookmarkEnd w:id="139"/>
-    <w:bookmarkStart w:id="140" w:name="ref-mccullagh1989glm"/>
+    <w:bookmarkEnd w:id="149"/>
+    <w:bookmarkStart w:id="150" w:name="ref-mccullagh1989glm"/>
     <w:p>
       <w:pPr>
         <w:pStyle w:val="Bibliography"/>
@@ -17487,8 +20359,8 @@
         <w:t xml:space="preserve">(2nd ed.). Chapman; Hall.</w:t>
       </w:r>
     </w:p>
-    <w:bookmarkEnd w:id="140"/>
-    <w:bookmarkStart w:id="142" w:name="ref-nelder1972glm"/>
+    <w:bookmarkEnd w:id="150"/>
+    <w:bookmarkStart w:id="152" w:name="ref-nelder1972glm"/>
     <w:p>
       <w:pPr>
         <w:pStyle w:val="Bibliography"/>
@@ -17525,7 +20397,7 @@
       <w:r>
         <w:t xml:space="preserve"> </w:t>
       </w:r>
-      <w:hyperlink r:id="rId141">
+      <w:hyperlink r:id="rId151">
         <w:r>
           <w:rPr>
             <w:rStyle w:val="Hyperlink"/>
@@ -17534,8 +20406,8 @@
         </w:r>
       </w:hyperlink>
     </w:p>
-    <w:bookmarkEnd w:id="142"/>
-    <w:bookmarkStart w:id="144" w:name="ref-punt2016bestpractices"/>
+    <w:bookmarkEnd w:id="152"/>
+    <w:bookmarkStart w:id="154" w:name="ref-punt2016bestpractices"/>
     <w:p>
       <w:pPr>
         <w:pStyle w:val="Bibliography"/>
@@ -17572,7 +20444,7 @@
       <w:r>
         <w:t xml:space="preserve"> </w:t>
       </w:r>
-      <w:hyperlink r:id="rId143">
+      <w:hyperlink r:id="rId153">
         <w:r>
           <w:rPr>
             <w:rStyle w:val="Hyperlink"/>
@@ -17581,8 +20453,8 @@
         </w:r>
       </w:hyperlink>
     </w:p>
-    <w:bookmarkEnd w:id="144"/>
-    <w:bookmarkStart w:id="146" w:name="ref-rousseau2019fleets"/>
+    <w:bookmarkEnd w:id="154"/>
+    <w:bookmarkStart w:id="156" w:name="ref-rousseau2019fleets"/>
     <w:p>
       <w:pPr>
         <w:pStyle w:val="Bibliography"/>
@@ -17619,7 +20491,7 @@
       <w:r>
         <w:t xml:space="preserve"> </w:t>
       </w:r>
-      <w:hyperlink r:id="rId145">
+      <w:hyperlink r:id="rId155">
         <w:r>
           <w:rPr>
             <w:rStyle w:val="Hyperlink"/>
@@ -17628,8 +20500,8 @@
         </w:r>
       </w:hyperlink>
     </w:p>
-    <w:bookmarkEnd w:id="146"/>
-    <w:bookmarkStart w:id="148" w:name="ref-schnute1995error"/>
+    <w:bookmarkEnd w:id="156"/>
+    <w:bookmarkStart w:id="158" w:name="ref-schnute1995error"/>
     <w:p>
       <w:pPr>
         <w:pStyle w:val="Bibliography"/>
@@ -17666,7 +20538,7 @@
       <w:r>
         <w:t xml:space="preserve"> </w:t>
       </w:r>
-      <w:hyperlink r:id="rId147">
+      <w:hyperlink r:id="rId157">
         <w:r>
           <w:rPr>
             <w:rStyle w:val="Hyperlink"/>
@@ -17675,8 +20547,8 @@
         </w:r>
       </w:hyperlink>
     </w:p>
-    <w:bookmarkEnd w:id="148"/>
-    <w:bookmarkStart w:id="150" w:name="ref-siple2021smallpelagics"/>
+    <w:bookmarkEnd w:id="158"/>
+    <w:bookmarkStart w:id="160" w:name="ref-siple2021smallpelagics"/>
     <w:p>
       <w:pPr>
         <w:pStyle w:val="Bibliography"/>
@@ -17713,7 +20585,7 @@
       <w:r>
         <w:t xml:space="preserve"> </w:t>
       </w:r>
-      <w:hyperlink r:id="rId149">
+      <w:hyperlink r:id="rId159">
         <w:r>
           <w:rPr>
             <w:rStyle w:val="Hyperlink"/>
@@ -17722,8 +20594,8 @@
         </w:r>
       </w:hyperlink>
     </w:p>
-    <w:bookmarkEnd w:id="150"/>
-    <w:bookmarkStart w:id="152" w:name="ref-sprfmo2025mseworkshop"/>
+    <w:bookmarkEnd w:id="160"/>
+    <w:bookmarkStart w:id="162" w:name="ref-sprfmo2025mseworkshop"/>
     <w:p>
       <w:pPr>
         <w:pStyle w:val="Bibliography"/>
@@ -17792,7 +20664,7 @@
       <w:r>
         <w:t xml:space="preserve"> </w:t>
       </w:r>
-      <w:hyperlink r:id="rId151">
+      <w:hyperlink r:id="rId161">
         <w:r>
           <w:rPr>
             <w:rStyle w:val="Hyperlink"/>
@@ -17801,8 +20673,8 @@
         </w:r>
       </w:hyperlink>
     </w:p>
-    <w:bookmarkEnd w:id="152"/>
-    <w:bookmarkStart w:id="154" w:name="ref-sprfmo2025annex11"/>
+    <w:bookmarkEnd w:id="162"/>
+    <w:bookmarkStart w:id="164" w:name="ref-sprfmo2025annex11"/>
     <w:p>
       <w:pPr>
         <w:pStyle w:val="Bibliography"/>
@@ -17826,7 +20698,7 @@
       <w:r>
         <w:t xml:space="preserve"> </w:t>
       </w:r>
-      <w:hyperlink r:id="rId153">
+      <w:hyperlink r:id="rId163">
         <w:r>
           <w:rPr>
             <w:rStyle w:val="Hyperlink"/>
@@ -17835,9 +20707,9 @@
         </w:r>
       </w:hyperlink>
     </w:p>
-    <w:bookmarkEnd w:id="154"/>
-    <w:bookmarkEnd w:id="155"/>
-    <w:bookmarkEnd w:id="156"/>
+    <w:bookmarkEnd w:id="164"/>
+    <w:bookmarkEnd w:id="165"/>
+    <w:bookmarkEnd w:id="166"/>
     <w:sectPr>
       <w:footnotePr>
         <w:numRestart w:val="eachSect"/>

</xml_diff>

<commit_message>
Fix Section 6 figure order
</commit_message>
<xml_diff>
--- a/docs/JM-WP-BM-01.docx
+++ b/docs/JM-WP-BM-01.docx
@@ -5576,7 +5576,7 @@
       <w:tr>
         <w:tc>
           <w:tcPr/>
-          <w:bookmarkStart w:id="69" w:name="fig-selectivity-blocks-rec"/>
+          <w:bookmarkStart w:id="69" w:name="fig-selectivity-blocks-ssb"/>
           <w:p>
             <w:pPr>
               <w:pStyle w:val="Compact"/>
@@ -5592,7 +5592,7 @@
                     <a:graphicData uri="http://schemas.openxmlformats.org/drawingml/2006/picture">
                       <pic:pic>
                         <pic:nvPicPr>
-                          <pic:cNvPr descr="JM-WP-BM-01_files/figure-docx/fig-selectivity-blocks-rec-1.png" id="68" name="Picture"/>
+                          <pic:cNvPr descr="JM-WP-BM-01_files/figure-docx/fig-selectivity-blocks-ssb-1.png" id="68" name="Picture"/>
                           <pic:cNvPicPr>
                             <a:picLocks noChangeArrowheads="1" noChangeAspect="1"/>
                           </pic:cNvPicPr>
@@ -5635,7 +5635,7 @@
               <w:pStyle w:val="ImageCaption"/>
             </w:pPr>
             <w:r>
-              <w:t xml:space="preserve">Figure 4: Comparison of recruitment trajectories from the reduced-index sensitivity (</w:t>
+              <w:t xml:space="preserve">Figure 4: Comparison of spawning biomass trajectories from the reduced-index sensitivity (</w:t>
             </w:r>
             <w:r>
               <w:rPr>
@@ -5673,7 +5673,7 @@
       <w:tr>
         <w:tc>
           <w:tcPr/>
-          <w:bookmarkStart w:id="73" w:name="fig-selectivity-sc-allowance-ssb"/>
+          <w:bookmarkStart w:id="73" w:name="fig-selectivity-blocks-rec"/>
           <w:p>
             <w:pPr>
               <w:pStyle w:val="Compact"/>
@@ -5689,7 +5689,7 @@
                     <a:graphicData uri="http://schemas.openxmlformats.org/drawingml/2006/picture">
                       <pic:pic>
                         <pic:nvPicPr>
-                          <pic:cNvPr descr="JM-WP-BM-01_files/figure-docx/fig-selectivity-sc-allowance-ssb-1.png" id="72" name="Picture"/>
+                          <pic:cNvPr descr="JM-WP-BM-01_files/figure-docx/fig-selectivity-blocks-rec-1.png" id="72" name="Picture"/>
                           <pic:cNvPicPr>
                             <a:picLocks noChangeArrowheads="1" noChangeAspect="1"/>
                           </pic:cNvPicPr>
@@ -5732,7 +5732,104 @@
               <w:pStyle w:val="ImageCaption"/>
             </w:pPr>
             <w:r>
-              <w:t xml:space="preserve">Figure 5: Comparison of spawning biomass trajectories from the reduced-index sensitivity (</w:t>
+              <w:t xml:space="preserve">Figure 5: Comparison of recruitment trajectories from the reduced-index sensitivity (</w:t>
+            </w:r>
+            <w:r>
+              <w:rPr>
+                <w:rStyle w:val="VerbatimChar"/>
+              </w:rPr>
+              <w:t xml:space="preserve">h1_2.00</w:t>
+            </w:r>
+            <w:r>
+              <w:t xml:space="preserve">) and the reduced-index model with fleet-specific selectivity blocks (</w:t>
+            </w:r>
+            <w:r>
+              <w:rPr>
+                <w:rStyle w:val="VerbatimChar"/>
+              </w:rPr>
+              <w:t xml:space="preserve">h1_2.01</w:t>
+            </w:r>
+            <w:r>
+              <w:t xml:space="preserve">).</w:t>
+            </w:r>
+          </w:p>
+          <w:bookmarkEnd w:id="73"/>
+        </w:tc>
+      </w:tr>
+    </w:tbl>
+    <w:tbl>
+      <w:tblPr>
+        <w:tblStyle w:val="Table"/>
+        <w:tblW w:type="pct" w:w="5000"/>
+        <w:tblLayout w:type="fixed"/>
+        <w:tblLook w:firstRow="0" w:lastRow="0" w:firstColumn="0" w:lastColumn="0" w:noHBand="0" w:noVBand="0" w:val="0000"/>
+      </w:tblPr>
+      <w:tblGrid>
+        <w:gridCol w:w="7920"/>
+      </w:tblGrid>
+      <w:tr>
+        <w:tc>
+          <w:tcPr/>
+          <w:bookmarkStart w:id="77" w:name="fig-selectivity-sc-allowance-ssb"/>
+          <w:p>
+            <w:pPr>
+              <w:pStyle w:val="Compact"/>
+              <w:jc w:val="center"/>
+            </w:pPr>
+            <w:r>
+              <w:drawing>
+                <wp:inline>
+                  <wp:extent cx="5334000" cy="3194843"/>
+                  <wp:effectExtent b="0" l="0" r="0" t="0"/>
+                  <wp:docPr descr="" title="" id="75" name="Picture"/>
+                  <a:graphic>
+                    <a:graphicData uri="http://schemas.openxmlformats.org/drawingml/2006/picture">
+                      <pic:pic>
+                        <pic:nvPicPr>
+                          <pic:cNvPr descr="JM-WP-BM-01_files/figure-docx/fig-selectivity-sc-allowance-ssb-1.png" id="76" name="Picture"/>
+                          <pic:cNvPicPr>
+                            <a:picLocks noChangeArrowheads="1" noChangeAspect="1"/>
+                          </pic:cNvPicPr>
+                        </pic:nvPicPr>
+                        <pic:blipFill>
+                          <a:blip r:embed="rId74"/>
+                          <a:stretch>
+                            <a:fillRect/>
+                          </a:stretch>
+                        </pic:blipFill>
+                        <pic:spPr bwMode="auto">
+                          <a:xfrm>
+                            <a:off x="0" y="0"/>
+                            <a:ext cx="5334000" cy="3194843"/>
+                          </a:xfrm>
+                          <a:prstGeom prst="rect">
+                            <a:avLst/>
+                          </a:prstGeom>
+                          <a:noFill/>
+                          <a:ln w="9525">
+                            <a:noFill/>
+                            <a:headEnd/>
+                            <a:tailEnd/>
+                          </a:ln>
+                        </pic:spPr>
+                      </pic:pic>
+                    </a:graphicData>
+                  </a:graphic>
+                </wp:inline>
+              </w:drawing>
+            </w:r>
+          </w:p>
+          <w:p>
+            <w:pPr>
+              <w:jc w:val="center"/>
+            </w:pPr>
+            <w:pPr>
+              <w:jc w:val="left"/>
+              <w:spacing w:before="200"/>
+              <w:pStyle w:val="ImageCaption"/>
+            </w:pPr>
+            <w:r>
+              <w:t xml:space="preserve">Figure 6: Comparison of spawning biomass trajectories from the reduced-index sensitivity (</w:t>
             </w:r>
             <w:r>
               <w:rPr>
@@ -5765,7 +5862,7 @@
               <w:t xml:space="preserve">.</w:t>
             </w:r>
           </w:p>
-          <w:bookmarkEnd w:id="73"/>
+          <w:bookmarkEnd w:id="77"/>
         </w:tc>
       </w:tr>
     </w:tbl>
@@ -5860,7 +5957,7 @@
           <w:rPr>
             <w:rStyle w:val="Hyperlink"/>
           </w:rPr>
-          <w:t xml:space="preserve">Figure 7</w:t>
+          <w:t xml:space="preserve">Figure 4</w:t>
         </w:r>
       </w:hyperlink>
       <w:r>
@@ -5877,7 +5974,7 @@
           <w:rPr>
             <w:rStyle w:val="Hyperlink"/>
           </w:rPr>
-          <w:t xml:space="preserve">Figure 4</w:t>
+          <w:t xml:space="preserve">Figure 5</w:t>
         </w:r>
       </w:hyperlink>
       <w:r>
@@ -5941,7 +6038,7 @@
       <w:tr>
         <w:tc>
           <w:tcPr/>
-          <w:bookmarkStart w:id="74" w:name="tbl-h1-like-components"/>
+          <w:bookmarkStart w:id="78" w:name="tbl-h1-like-components"/>
           <w:p>
             <w:pPr>
               <w:jc w:val="center"/>
@@ -8273,7 +8370,7 @@
               </w:tc>
             </w:tr>
           </w:tbl>
-          <w:bookmarkEnd w:id="74"/>
+          <w:bookmarkEnd w:id="78"/>
         </w:tc>
       </w:tr>
     </w:tbl>
@@ -8410,7 +8507,7 @@
           <w:rPr>
             <w:rStyle w:val="Hyperlink"/>
           </w:rPr>
-          <w:t xml:space="preserve">Figure 6</w:t>
+          <w:t xml:space="preserve">Figure 7</w:t>
         </w:r>
       </w:hyperlink>
       <w:r>
@@ -8475,7 +8572,7 @@
       <w:tr>
         <w:tc>
           <w:tcPr/>
-          <w:bookmarkStart w:id="78" w:name="fig-h1-index-fits"/>
+          <w:bookmarkStart w:id="82" w:name="fig-h1-index-fits"/>
           <w:p>
             <w:pPr>
               <w:pStyle w:val="Compact"/>
@@ -8486,18 +8583,18 @@
                 <wp:inline>
                   <wp:extent cx="5334000" cy="4333875"/>
                   <wp:effectExtent b="0" l="0" r="0" t="0"/>
-                  <wp:docPr descr="" title="" id="76" name="Picture"/>
+                  <wp:docPr descr="" title="" id="80" name="Picture"/>
                   <a:graphic>
                     <a:graphicData uri="http://schemas.openxmlformats.org/drawingml/2006/picture">
                       <pic:pic>
                         <pic:nvPicPr>
-                          <pic:cNvPr descr="JM-WP-BM-01_files/figure-docx/fig-h1-index-fits-1.png" id="77" name="Picture"/>
+                          <pic:cNvPr descr="JM-WP-BM-01_files/figure-docx/fig-h1-index-fits-1.png" id="81" name="Picture"/>
                           <pic:cNvPicPr>
                             <a:picLocks noChangeArrowheads="1" noChangeAspect="1"/>
                           </pic:cNvPicPr>
                         </pic:nvPicPr>
                         <pic:blipFill>
-                          <a:blip r:embed="rId75"/>
+                          <a:blip r:embed="rId79"/>
                           <a:stretch>
                             <a:fillRect/>
                           </a:stretch>
@@ -8534,7 +8631,7 @@
               <w:pStyle w:val="ImageCaption"/>
             </w:pPr>
             <w:r>
-              <w:t xml:space="preserve">Figure 6: Observed and fitted index trajectories for</w:t>
+              <w:t xml:space="preserve">Figure 7: Observed and fitted index trajectories for</w:t>
             </w:r>
             <w:r>
               <w:t xml:space="preserve"> </w:t>
@@ -8573,7 +8670,7 @@
               <w:t xml:space="preserve">. Panels show the retained comparable index series: South-Central Chile CPUE, Acoustic North, Peruvian CPUE, and Offshore CPUE.</w:t>
             </w:r>
           </w:p>
-          <w:bookmarkEnd w:id="78"/>
+          <w:bookmarkEnd w:id="82"/>
         </w:tc>
       </w:tr>
     </w:tbl>
@@ -8646,12 +8743,12 @@
                 <wp:inline>
                   <wp:extent cx="152400" cy="152400"/>
                   <wp:effectExtent b="0" l="0" r="0" t="0"/>
-                  <wp:docPr descr="" title="" id="79" name="Picture"/>
+                  <wp:docPr descr="" title="" id="83" name="Picture"/>
                   <a:graphic>
                     <a:graphicData uri="http://schemas.openxmlformats.org/drawingml/2006/picture">
                       <pic:pic>
                         <pic:nvPicPr>
-                          <pic:cNvPr descr="/Applications/quarto/share/formats/docx/note.png" id="80" name="Picture"/>
+                          <pic:cNvPr descr="/Applications/quarto/share/formats/docx/note.png" id="84" name="Picture"/>
                           <pic:cNvPicPr>
                             <a:picLocks noChangeArrowheads="1" noChangeAspect="1"/>
                           </pic:cNvPicPr>
@@ -8823,103 +8920,6 @@
         <w:t xml:space="preserve">, which separates operating-model specification work from robustness testing and management-procedure refinement. It is also consistent with CCSBT practice in the Bali Procedure review cycle.</w:t>
       </w:r>
     </w:p>
-    <w:tbl>
-      <w:tblPr>
-        <w:tblStyle w:val="Table"/>
-        <w:tblW w:type="pct" w:w="5000"/>
-        <w:tblLayout w:type="fixed"/>
-        <w:tblLook w:firstRow="0" w:lastRow="0" w:firstColumn="0" w:lastColumn="0" w:noHBand="0" w:noVBand="0" w:val="0000"/>
-      </w:tblPr>
-      <w:tblGrid>
-        <w:gridCol w:w="7920"/>
-      </w:tblGrid>
-      <w:tr>
-        <w:tc>
-          <w:tcPr/>
-          <w:bookmarkStart w:id="84" w:name="fig-selectivity-blocks-ssb"/>
-          <w:p>
-            <w:pPr>
-              <w:pStyle w:val="Compact"/>
-              <w:jc w:val="center"/>
-            </w:pPr>
-            <w:r>
-              <w:drawing>
-                <wp:inline>
-                  <wp:extent cx="5334000" cy="3194843"/>
-                  <wp:effectExtent b="0" l="0" r="0" t="0"/>
-                  <wp:docPr descr="" title="" id="82" name="Picture"/>
-                  <a:graphic>
-                    <a:graphicData uri="http://schemas.openxmlformats.org/drawingml/2006/picture">
-                      <pic:pic>
-                        <pic:nvPicPr>
-                          <pic:cNvPr descr="JM-WP-BM-01_files/figure-docx/fig-selectivity-blocks-ssb-1.png" id="83" name="Picture"/>
-                          <pic:cNvPicPr>
-                            <a:picLocks noChangeArrowheads="1" noChangeAspect="1"/>
-                          </pic:cNvPicPr>
-                        </pic:nvPicPr>
-                        <pic:blipFill>
-                          <a:blip r:embed="rId81"/>
-                          <a:stretch>
-                            <a:fillRect/>
-                          </a:stretch>
-                        </pic:blipFill>
-                        <pic:spPr bwMode="auto">
-                          <a:xfrm>
-                            <a:off x="0" y="0"/>
-                            <a:ext cx="5334000" cy="3194843"/>
-                          </a:xfrm>
-                          <a:prstGeom prst="rect">
-                            <a:avLst/>
-                          </a:prstGeom>
-                          <a:noFill/>
-                          <a:ln w="9525">
-                            <a:noFill/>
-                            <a:headEnd/>
-                            <a:tailEnd/>
-                          </a:ln>
-                        </pic:spPr>
-                      </pic:pic>
-                    </a:graphicData>
-                  </a:graphic>
-                </wp:inline>
-              </w:drawing>
-            </w:r>
-          </w:p>
-          <w:p>
-            <w:pPr>
-              <w:jc w:val="center"/>
-            </w:pPr>
-            <w:pPr>
-              <w:jc w:val="left"/>
-              <w:spacing w:before="200"/>
-              <w:pStyle w:val="ImageCaption"/>
-            </w:pPr>
-            <w:r>
-              <w:t xml:space="preserve">Figure 7: Comparison of spawning biomass trajectories from the reduced-index sensitivity (</w:t>
-            </w:r>
-            <w:r>
-              <w:rPr>
-                <w:rStyle w:val="VerbatimChar"/>
-              </w:rPr>
-              <w:t xml:space="preserve">h1_2.00</w:t>
-            </w:r>
-            <w:r>
-              <w:t xml:space="preserve">) and the reduced-index model with fleet-specific selectivity blocks (</w:t>
-            </w:r>
-            <w:r>
-              <w:rPr>
-                <w:rStyle w:val="VerbatimChar"/>
-              </w:rPr>
-              <w:t xml:space="preserve">h1_2.01</w:t>
-            </w:r>
-            <w:r>
-              <w:t xml:space="preserve">).</w:t>
-            </w:r>
-          </w:p>
-          <w:bookmarkEnd w:id="84"/>
-        </w:tc>
-      </w:tr>
-    </w:tbl>
     <w:p>
       <w:pPr>
         <w:pStyle w:val="BodyText"/>
@@ -9035,7 +9035,7 @@
           <w:rPr>
             <w:rStyle w:val="Hyperlink"/>
           </w:rPr>
-          <w:t xml:space="preserve">Figure 5</w:t>
+          <w:t xml:space="preserve">Figure 6</w:t>
         </w:r>
       </w:hyperlink>
       <w:r>
@@ -9082,7 +9082,7 @@
           <w:rPr>
             <w:rStyle w:val="Hyperlink"/>
           </w:rPr>
-          <w:t xml:space="preserve">Figure 9</w:t>
+          <w:t xml:space="preserve">Figure 8</w:t>
         </w:r>
       </w:hyperlink>
       <w:r>
@@ -9131,113 +9131,7 @@
         <w:t xml:space="preserve">are being driven primarily by S-C Chile selectivity regularization.</w:t>
       </w:r>
     </w:p>
-    <w:tbl>
-      <w:tblPr>
-        <w:tblStyle w:val="Table"/>
-        <w:tblW w:type="pct" w:w="5000"/>
-        <w:tblLayout w:type="fixed"/>
-        <w:tblLook w:firstRow="0" w:lastRow="0" w:firstColumn="0" w:lastColumn="0" w:noHBand="0" w:noVBand="0" w:val="0000"/>
-      </w:tblPr>
-      <w:tblGrid>
-        <w:gridCol w:w="7920"/>
-      </w:tblGrid>
-      <w:tr>
-        <w:tc>
-          <w:tcPr/>
-          <w:bookmarkStart w:id="88" w:name="fig-selectivity-sc5-ssb"/>
-          <w:p>
-            <w:pPr>
-              <w:pStyle w:val="Compact"/>
-              <w:jc w:val="center"/>
-            </w:pPr>
-            <w:r>
-              <w:drawing>
-                <wp:inline>
-                  <wp:extent cx="5334000" cy="3194843"/>
-                  <wp:effectExtent b="0" l="0" r="0" t="0"/>
-                  <wp:docPr descr="" title="" id="86" name="Picture"/>
-                  <a:graphic>
-                    <a:graphicData uri="http://schemas.openxmlformats.org/drawingml/2006/picture">
-                      <pic:pic>
-                        <pic:nvPicPr>
-                          <pic:cNvPr descr="JM-WP-BM-01_files/figure-docx/fig-selectivity-sc5-ssb-1.png" id="87" name="Picture"/>
-                          <pic:cNvPicPr>
-                            <a:picLocks noChangeArrowheads="1" noChangeAspect="1"/>
-                          </pic:cNvPicPr>
-                        </pic:nvPicPr>
-                        <pic:blipFill>
-                          <a:blip r:embed="rId85"/>
-                          <a:stretch>
-                            <a:fillRect/>
-                          </a:stretch>
-                        </pic:blipFill>
-                        <pic:spPr bwMode="auto">
-                          <a:xfrm>
-                            <a:off x="0" y="0"/>
-                            <a:ext cx="5334000" cy="3194843"/>
-                          </a:xfrm>
-                          <a:prstGeom prst="rect">
-                            <a:avLst/>
-                          </a:prstGeom>
-                          <a:noFill/>
-                          <a:ln w="9525">
-                            <a:noFill/>
-                            <a:headEnd/>
-                            <a:tailEnd/>
-                          </a:ln>
-                        </pic:spPr>
-                      </pic:pic>
-                    </a:graphicData>
-                  </a:graphic>
-                </wp:inline>
-              </w:drawing>
-            </w:r>
-          </w:p>
-          <w:p>
-            <w:pPr>
-              <w:jc w:val="center"/>
-            </w:pPr>
-            <w:pPr>
-              <w:jc w:val="left"/>
-              <w:spacing w:before="200"/>
-              <w:pStyle w:val="ImageCaption"/>
-            </w:pPr>
-            <w:r>
-              <w:t xml:space="preserve">Figure 8: Comparison of spawning biomass trajectories for the original fishery-block model (</w:t>
-            </w:r>
-            <w:r>
-              <w:rPr>
-                <w:rStyle w:val="VerbatimChar"/>
-              </w:rPr>
-              <w:t xml:space="preserve">h1_2.01</w:t>
-            </w:r>
-            <w:r>
-              <w:t xml:space="preserve">), the annual S-C Chile variant (</w:t>
-            </w:r>
-            <w:r>
-              <w:rPr>
-                <w:rStyle w:val="VerbatimChar"/>
-              </w:rPr>
-              <w:t xml:space="preserve">h1_2.01.1</w:t>
-            </w:r>
-            <w:r>
-              <w:t xml:space="preserve">), and the five-block S-C Chile variant (</w:t>
-            </w:r>
-            <w:r>
-              <w:rPr>
-                <w:rStyle w:val="VerbatimChar"/>
-              </w:rPr>
-              <w:t xml:space="preserve">h1_2.01.2</w:t>
-            </w:r>
-            <w:r>
-              <w:t xml:space="preserve">).</w:t>
-            </w:r>
-          </w:p>
-          <w:bookmarkEnd w:id="88"/>
-        </w:tc>
-      </w:tr>
-    </w:tbl>
-    <w:bookmarkStart w:id="97" w:name="fig-selectivity-sc-allowance-compare"/>
+    <w:bookmarkStart w:id="93" w:name="fig-selectivity-sc-allowance-compare"/>
     <w:tbl>
       <w:tblPr>
         <w:tblStyle w:val="Table"/>
@@ -9265,7 +9159,101 @@
             <w:tr>
               <w:tc>
                 <w:tcPr/>
-                <w:bookmarkStart w:id="92" w:name="fig-selectivity-sc-allowance-compare-1"/>
+                <w:bookmarkStart w:id="88" w:name="fig-selectivity-sc-allowance-compare-1"/>
+                <w:p>
+                  <w:pPr>
+                    <w:pStyle w:val="Compact"/>
+                    <w:jc w:val="center"/>
+                    <w:jc w:val="left"/>
+                  </w:pPr>
+                  <w:r>
+                    <w:drawing>
+                      <wp:inline>
+                        <wp:extent cx="2971800" cy="4754880"/>
+                        <wp:effectExtent b="0" l="0" r="0" t="0"/>
+                        <wp:docPr descr="" title="" id="86" name="Picture"/>
+                        <a:graphic>
+                          <a:graphicData uri="http://schemas.openxmlformats.org/drawingml/2006/picture">
+                            <pic:pic>
+                              <pic:nvPicPr>
+                                <pic:cNvPr descr="JM-WP-BM-01_files/figure-docx/fig-selectivity-sc-allowance-compare-1.png" id="87" name="Picture"/>
+                                <pic:cNvPicPr>
+                                  <a:picLocks noChangeArrowheads="1" noChangeAspect="1"/>
+                                </pic:cNvPicPr>
+                              </pic:nvPicPr>
+                              <pic:blipFill>
+                                <a:blip r:embed="rId85"/>
+                                <a:stretch>
+                                  <a:fillRect/>
+                                </a:stretch>
+                              </pic:blipFill>
+                              <pic:spPr bwMode="auto">
+                                <a:xfrm>
+                                  <a:off x="0" y="0"/>
+                                  <a:ext cx="2971800" cy="4754880"/>
+                                </a:xfrm>
+                                <a:prstGeom prst="rect">
+                                  <a:avLst/>
+                                </a:prstGeom>
+                                <a:noFill/>
+                                <a:ln w="9525">
+                                  <a:noFill/>
+                                  <a:headEnd/>
+                                  <a:tailEnd/>
+                                </a:ln>
+                              </pic:spPr>
+                            </pic:pic>
+                          </a:graphicData>
+                        </a:graphic>
+                      </wp:inline>
+                    </w:drawing>
+                  </w:r>
+                </w:p>
+                <w:p>
+                  <w:pPr>
+                    <w:jc w:val="center"/>
+                    <w:jc w:val="left"/>
+                  </w:pPr>
+                  <w:pPr>
+                    <w:jc w:val="left"/>
+                    <w:spacing w:before="200"/>
+                    <w:pStyle w:val="ImageCaption"/>
+                  </w:pPr>
+                  <w:r>
+                    <w:t xml:space="preserve">(a) Model</w:t>
+                  </w:r>
+                  <w:r>
+                    <w:t xml:space="preserve"> </w:t>
+                  </w:r>
+                  <w:r>
+                    <w:rPr>
+                      <w:rStyle w:val="VerbatimChar"/>
+                    </w:rPr>
+                    <w:t xml:space="preserve">h1_2.01</w:t>
+                  </w:r>
+                </w:p>
+                <w:bookmarkEnd w:id="88"/>
+              </w:tc>
+            </w:tr>
+          </w:tbl>
+          <w:p/>
+        </w:tc>
+        <w:tc>
+          <w:tcPr/>
+          <w:tbl>
+            <w:tblPr>
+              <w:tblStyle w:val="Table"/>
+              <w:tblW w:type="pct" w:w="4900"/>
+              <w:tblLayout w:type="fixed"/>
+              <w:tblLook w:firstRow="0" w:lastRow="0" w:firstColumn="0" w:lastColumn="0" w:noHBand="0" w:noVBand="0" w:val="0000"/>
+            </w:tblPr>
+            <w:tblGrid>
+              <w:gridCol w:w="7761"/>
+            </w:tblGrid>
+            <w:tr>
+              <w:tc>
+                <w:tcPr/>
+                <w:bookmarkStart w:id="92" w:name="fig-selectivity-sc-allowance-compare-2"/>
                 <w:p>
                   <w:pPr>
                     <w:pStyle w:val="Compact"/>
@@ -9282,7 +9270,7 @@
                           <a:graphicData uri="http://schemas.openxmlformats.org/drawingml/2006/picture">
                             <pic:pic>
                               <pic:nvPicPr>
-                                <pic:cNvPr descr="JM-WP-BM-01_files/figure-docx/fig-selectivity-sc-allowance-compare-1.png" id="91" name="Picture"/>
+                                <pic:cNvPr descr="JM-WP-BM-01_files/figure-docx/fig-selectivity-sc-allowance-compare-2.png" id="91" name="Picture"/>
                                 <pic:cNvPicPr>
                                   <a:picLocks noChangeArrowheads="1" noChangeAspect="1"/>
                                 </pic:cNvPicPr>
@@ -9326,7 +9314,7 @@
                     <w:pStyle w:val="ImageCaption"/>
                   </w:pPr>
                   <w:r>
-                    <w:t xml:space="preserve">(a) Model</w:t>
+                    <w:t xml:space="preserve">(b) Model</w:t>
                   </w:r>
                   <w:r>
                     <w:t xml:space="preserve"> </w:t>
@@ -9335,104 +9323,10 @@
                     <w:rPr>
                       <w:rStyle w:val="VerbatimChar"/>
                     </w:rPr>
-                    <w:t xml:space="preserve">h1_2.01</w:t>
+                    <w:t xml:space="preserve">h1_2.01.1</w:t>
                   </w:r>
                 </w:p>
                 <w:bookmarkEnd w:id="92"/>
-              </w:tc>
-            </w:tr>
-          </w:tbl>
-          <w:p/>
-        </w:tc>
-        <w:tc>
-          <w:tcPr/>
-          <w:tbl>
-            <w:tblPr>
-              <w:tblStyle w:val="Table"/>
-              <w:tblW w:type="pct" w:w="4900"/>
-              <w:tblLayout w:type="fixed"/>
-              <w:tblLook w:firstRow="0" w:lastRow="0" w:firstColumn="0" w:lastColumn="0" w:noHBand="0" w:noVBand="0" w:val="0000"/>
-            </w:tblPr>
-            <w:tblGrid>
-              <w:gridCol w:w="7761"/>
-            </w:tblGrid>
-            <w:tr>
-              <w:tc>
-                <w:tcPr/>
-                <w:bookmarkStart w:id="96" w:name="fig-selectivity-sc-allowance-compare-2"/>
-                <w:p>
-                  <w:pPr>
-                    <w:pStyle w:val="Compact"/>
-                    <w:jc w:val="center"/>
-                    <w:jc w:val="left"/>
-                  </w:pPr>
-                  <w:r>
-                    <w:drawing>
-                      <wp:inline>
-                        <wp:extent cx="2971800" cy="4754880"/>
-                        <wp:effectExtent b="0" l="0" r="0" t="0"/>
-                        <wp:docPr descr="" title="" id="94" name="Picture"/>
-                        <a:graphic>
-                          <a:graphicData uri="http://schemas.openxmlformats.org/drawingml/2006/picture">
-                            <pic:pic>
-                              <pic:nvPicPr>
-                                <pic:cNvPr descr="JM-WP-BM-01_files/figure-docx/fig-selectivity-sc-allowance-compare-2.png" id="95" name="Picture"/>
-                                <pic:cNvPicPr>
-                                  <a:picLocks noChangeArrowheads="1" noChangeAspect="1"/>
-                                </pic:cNvPicPr>
-                              </pic:nvPicPr>
-                              <pic:blipFill>
-                                <a:blip r:embed="rId93"/>
-                                <a:stretch>
-                                  <a:fillRect/>
-                                </a:stretch>
-                              </pic:blipFill>
-                              <pic:spPr bwMode="auto">
-                                <a:xfrm>
-                                  <a:off x="0" y="0"/>
-                                  <a:ext cx="2971800" cy="4754880"/>
-                                </a:xfrm>
-                                <a:prstGeom prst="rect">
-                                  <a:avLst/>
-                                </a:prstGeom>
-                                <a:noFill/>
-                                <a:ln w="9525">
-                                  <a:noFill/>
-                                  <a:headEnd/>
-                                  <a:tailEnd/>
-                                </a:ln>
-                              </pic:spPr>
-                            </pic:pic>
-                          </a:graphicData>
-                        </a:graphic>
-                      </wp:inline>
-                    </w:drawing>
-                  </w:r>
-                </w:p>
-                <w:p>
-                  <w:pPr>
-                    <w:jc w:val="center"/>
-                    <w:jc w:val="left"/>
-                  </w:pPr>
-                  <w:pPr>
-                    <w:jc w:val="left"/>
-                    <w:spacing w:before="200"/>
-                    <w:pStyle w:val="ImageCaption"/>
-                  </w:pPr>
-                  <w:r>
-                    <w:t xml:space="preserve">(b) Model</w:t>
-                  </w:r>
-                  <w:r>
-                    <w:t xml:space="preserve"> </w:t>
-                  </w:r>
-                  <w:r>
-                    <w:rPr>
-                      <w:rStyle w:val="VerbatimChar"/>
-                    </w:rPr>
-                    <w:t xml:space="preserve">h1_2.01.1</w:t>
-                  </w:r>
-                </w:p>
-                <w:bookmarkEnd w:id="96"/>
               </w:tc>
             </w:tr>
           </w:tbl>
@@ -9449,7 +9343,7 @@
         <w:pStyle w:val="ImageCaption"/>
       </w:pPr>
       <w:r>
-        <w:t xml:space="preserve">Figure 9: Estimates of selectivity by fishery over time for Models</w:t>
+        <w:t xml:space="preserve">Figure 8: Estimates of selectivity by fishery over time for Models</w:t>
       </w:r>
       <w:r>
         <w:t xml:space="preserve"> </w:t>
@@ -9488,7 +9382,7 @@
         <w:t xml:space="preserve">.</w:t>
       </w:r>
     </w:p>
-    <w:bookmarkEnd w:id="97"/>
+    <w:bookmarkEnd w:id="93"/>
     <w:p>
       <w:pPr>
         <w:pStyle w:val="BodyText"/>
@@ -9726,7 +9620,7 @@
       <w:tr>
         <w:tc>
           <w:tcPr/>
-          <w:bookmarkStart w:id="98" w:name="tbl-selectivity-scflex-like-components"/>
+          <w:bookmarkStart w:id="94" w:name="tbl-selectivity-scflex-like-components"/>
           <w:p>
             <w:pPr>
               <w:jc w:val="center"/>
@@ -11956,7 +11850,7 @@
               </w:tc>
             </w:tr>
           </w:tbl>
-          <w:bookmarkEnd w:id="98"/>
+          <w:bookmarkEnd w:id="94"/>
         </w:tc>
       </w:tr>
     </w:tbl>
@@ -12063,7 +11957,7 @@
           <w:rPr>
             <w:rStyle w:val="Hyperlink"/>
           </w:rPr>
-          <w:t xml:space="preserve">Figure 8</w:t>
+          <w:t xml:space="preserve">Figure 12</w:t>
         </w:r>
       </w:hyperlink>
       <w:r>
@@ -12408,7 +12302,7 @@
       <w:tr>
         <w:tc>
           <w:tcPr/>
-          <w:bookmarkStart w:id="102" w:name="fig-selectivity-sc5-index-fits"/>
+          <w:bookmarkStart w:id="98" w:name="fig-selectivity-sc5-index-fits"/>
           <w:p>
             <w:pPr>
               <w:pStyle w:val="Compact"/>
@@ -12419,18 +12313,18 @@
                 <wp:inline>
                   <wp:extent cx="5334000" cy="4333875"/>
                   <wp:effectExtent b="0" l="0" r="0" t="0"/>
-                  <wp:docPr descr="" title="" id="100" name="Picture"/>
+                  <wp:docPr descr="" title="" id="96" name="Picture"/>
                   <a:graphic>
                     <a:graphicData uri="http://schemas.openxmlformats.org/drawingml/2006/picture">
                       <pic:pic>
                         <pic:nvPicPr>
-                          <pic:cNvPr descr="JM-WP-BM-01_files/figure-docx/fig-selectivity-sc5-index-fits-1.png" id="101" name="Picture"/>
+                          <pic:cNvPr descr="JM-WP-BM-01_files/figure-docx/fig-selectivity-sc5-index-fits-1.png" id="97" name="Picture"/>
                           <pic:cNvPicPr>
                             <a:picLocks noChangeArrowheads="1" noChangeAspect="1"/>
                           </pic:cNvPicPr>
                         </pic:nvPicPr>
                         <pic:blipFill>
-                          <a:blip r:embed="rId99"/>
+                          <a:blip r:embed="rId95"/>
                           <a:stretch>
                             <a:fillRect/>
                           </a:stretch>
@@ -12467,7 +12361,7 @@
               <w:pStyle w:val="ImageCaption"/>
             </w:pPr>
             <w:r>
-              <w:t xml:space="preserve">Figure 10: Observed and fitted index trajectories for</w:t>
+              <w:t xml:space="preserve">Figure 9: Observed and fitted index trajectories for</w:t>
             </w:r>
             <w:r>
               <w:t xml:space="preserve"> </w:t>
@@ -12518,262 +12412,10 @@
               <w:t xml:space="preserve">. Panels show the retained comparable index series: South-Central Chile CPUE, Acoustic North, Peruvian CPUE, and Offshore CPUE.</w:t>
             </w:r>
           </w:p>
-          <w:bookmarkEnd w:id="102"/>
+          <w:bookmarkEnd w:id="98"/>
         </w:tc>
       </w:tr>
     </w:tbl>
-    <w:bookmarkStart w:id="111" w:name="fig-selectivity-sc5-compare"/>
-    <w:tbl>
-      <w:tblPr>
-        <w:tblStyle w:val="Table"/>
-        <w:tblW w:type="pct" w:w="4900"/>
-        <w:tblLayout w:type="fixed"/>
-        <w:tblLook w:firstRow="0" w:lastRow="0" w:firstColumn="0" w:lastColumn="0" w:noHBand="0" w:noVBand="0" w:val="0000"/>
-      </w:tblPr>
-      <w:tblGrid>
-        <w:gridCol w:w="3880"/>
-        <w:gridCol w:w="3880"/>
-      </w:tblGrid>
-      <w:tr>
-        <w:tc>
-          <w:tcPr/>
-          <w:tbl>
-            <w:tblPr>
-              <w:tblStyle w:val="Table"/>
-              <w:tblW w:type="pct" w:w="4900"/>
-              <w:tblLayout w:type="fixed"/>
-              <w:tblLook w:firstRow="0" w:lastRow="0" w:firstColumn="0" w:lastColumn="0" w:noHBand="0" w:noVBand="0" w:val="0000"/>
-            </w:tblPr>
-            <w:tblGrid>
-              <w:gridCol w:w="7761"/>
-            </w:tblGrid>
-            <w:tr>
-              <w:tc>
-                <w:tcPr/>
-                <w:bookmarkStart w:id="106" w:name="fig-selectivity-sc5-compare-1"/>
-                <w:p>
-                  <w:pPr>
-                    <w:pStyle w:val="Compact"/>
-                    <w:jc w:val="center"/>
-                    <w:jc w:val="left"/>
-                  </w:pPr>
-                  <w:r>
-                    <w:drawing>
-                      <wp:inline>
-                        <wp:extent cx="2971800" cy="4754880"/>
-                        <wp:effectExtent b="0" l="0" r="0" t="0"/>
-                        <wp:docPr descr="" title="" id="104" name="Picture"/>
-                        <a:graphic>
-                          <a:graphicData uri="http://schemas.openxmlformats.org/drawingml/2006/picture">
-                            <pic:pic>
-                              <pic:nvPicPr>
-                                <pic:cNvPr descr="JM-WP-BM-01_files/figure-docx/fig-selectivity-sc5-compare-1.png" id="105" name="Picture"/>
-                                <pic:cNvPicPr>
-                                  <a:picLocks noChangeArrowheads="1" noChangeAspect="1"/>
-                                </pic:cNvPicPr>
-                              </pic:nvPicPr>
-                              <pic:blipFill>
-                                <a:blip r:embed="rId103"/>
-                                <a:stretch>
-                                  <a:fillRect/>
-                                </a:stretch>
-                              </pic:blipFill>
-                              <pic:spPr bwMode="auto">
-                                <a:xfrm>
-                                  <a:off x="0" y="0"/>
-                                  <a:ext cx="2971800" cy="4754880"/>
-                                </a:xfrm>
-                                <a:prstGeom prst="rect">
-                                  <a:avLst/>
-                                </a:prstGeom>
-                                <a:noFill/>
-                                <a:ln w="9525">
-                                  <a:noFill/>
-                                  <a:headEnd/>
-                                  <a:tailEnd/>
-                                </a:ln>
-                              </pic:spPr>
-                            </pic:pic>
-                          </a:graphicData>
-                        </a:graphic>
-                      </wp:inline>
-                    </w:drawing>
-                  </w:r>
-                </w:p>
-                <w:p>
-                  <w:pPr>
-                    <w:jc w:val="center"/>
-                    <w:jc w:val="left"/>
-                  </w:pPr>
-                  <w:pPr>
-                    <w:jc w:val="left"/>
-                    <w:spacing w:before="200"/>
-                    <w:pStyle w:val="ImageCaption"/>
-                  </w:pPr>
-                  <w:r>
-                    <w:t xml:space="preserve">(a) Model</w:t>
-                  </w:r>
-                  <w:r>
-                    <w:t xml:space="preserve"> </w:t>
-                  </w:r>
-                  <w:r>
-                    <w:rPr>
-                      <w:rStyle w:val="VerbatimChar"/>
-                    </w:rPr>
-                    <w:t xml:space="preserve">h1_2.01.1</w:t>
-                  </w:r>
-                </w:p>
-                <w:bookmarkEnd w:id="106"/>
-              </w:tc>
-            </w:tr>
-          </w:tbl>
-          <w:p/>
-        </w:tc>
-        <w:tc>
-          <w:tcPr/>
-          <w:tbl>
-            <w:tblPr>
-              <w:tblStyle w:val="Table"/>
-              <w:tblW w:type="pct" w:w="4900"/>
-              <w:tblLayout w:type="fixed"/>
-              <w:tblLook w:firstRow="0" w:lastRow="0" w:firstColumn="0" w:lastColumn="0" w:noHBand="0" w:noVBand="0" w:val="0000"/>
-            </w:tblPr>
-            <w:tblGrid>
-              <w:gridCol w:w="7761"/>
-            </w:tblGrid>
-            <w:tr>
-              <w:tc>
-                <w:tcPr/>
-                <w:bookmarkStart w:id="110" w:name="fig-selectivity-sc5-compare-2"/>
-                <w:p>
-                  <w:pPr>
-                    <w:pStyle w:val="Compact"/>
-                    <w:jc w:val="center"/>
-                    <w:jc w:val="left"/>
-                  </w:pPr>
-                  <w:r>
-                    <w:drawing>
-                      <wp:inline>
-                        <wp:extent cx="2971800" cy="4754880"/>
-                        <wp:effectExtent b="0" l="0" r="0" t="0"/>
-                        <wp:docPr descr="" title="" id="108" name="Picture"/>
-                        <a:graphic>
-                          <a:graphicData uri="http://schemas.openxmlformats.org/drawingml/2006/picture">
-                            <pic:pic>
-                              <pic:nvPicPr>
-                                <pic:cNvPr descr="JM-WP-BM-01_files/figure-docx/fig-selectivity-sc5-compare-2.png" id="109" name="Picture"/>
-                                <pic:cNvPicPr>
-                                  <a:picLocks noChangeArrowheads="1" noChangeAspect="1"/>
-                                </pic:cNvPicPr>
-                              </pic:nvPicPr>
-                              <pic:blipFill>
-                                <a:blip r:embed="rId107"/>
-                                <a:stretch>
-                                  <a:fillRect/>
-                                </a:stretch>
-                              </pic:blipFill>
-                              <pic:spPr bwMode="auto">
-                                <a:xfrm>
-                                  <a:off x="0" y="0"/>
-                                  <a:ext cx="2971800" cy="4754880"/>
-                                </a:xfrm>
-                                <a:prstGeom prst="rect">
-                                  <a:avLst/>
-                                </a:prstGeom>
-                                <a:noFill/>
-                                <a:ln w="9525">
-                                  <a:noFill/>
-                                  <a:headEnd/>
-                                  <a:tailEnd/>
-                                </a:ln>
-                              </pic:spPr>
-                            </pic:pic>
-                          </a:graphicData>
-                        </a:graphic>
-                      </wp:inline>
-                    </w:drawing>
-                  </w:r>
-                </w:p>
-                <w:p>
-                  <w:pPr>
-                    <w:jc w:val="center"/>
-                    <w:jc w:val="left"/>
-                  </w:pPr>
-                  <w:pPr>
-                    <w:jc w:val="left"/>
-                    <w:spacing w:before="200"/>
-                    <w:pStyle w:val="ImageCaption"/>
-                  </w:pPr>
-                  <w:r>
-                    <w:t xml:space="preserve">(b) Model</w:t>
-                  </w:r>
-                  <w:r>
-                    <w:t xml:space="preserve"> </w:t>
-                  </w:r>
-                  <w:r>
-                    <w:rPr>
-                      <w:rStyle w:val="VerbatimChar"/>
-                    </w:rPr>
-                    <w:t xml:space="preserve">h1_2.01.2</w:t>
-                  </w:r>
-                </w:p>
-                <w:bookmarkEnd w:id="110"/>
-              </w:tc>
-            </w:tr>
-          </w:tbl>
-          <w:p/>
-        </w:tc>
-      </w:tr>
-    </w:tbl>
-    <w:p>
-      <w:pPr>
-        <w:pStyle w:val="BodyText"/>
-      </w:pPr>
-      <w:pPr>
-        <w:spacing w:before="200"/>
-        <w:pStyle w:val="ImageCaption"/>
-      </w:pPr>
-      <w:r>
-        <w:t xml:space="preserve">Figure 11: Estimates of selectivity by fishery over time for Models</w:t>
-      </w:r>
-      <w:r>
-        <w:t xml:space="preserve"> </w:t>
-      </w:r>
-      <w:r>
-        <w:rPr>
-          <w:rStyle w:val="VerbatimChar"/>
-        </w:rPr>
-        <w:t xml:space="preserve">h1_2.01.1</w:t>
-      </w:r>
-      <w:r>
-        <w:t xml:space="preserve"> </w:t>
-      </w:r>
-      <w:r>
-        <w:t xml:space="preserve">and</w:t>
-      </w:r>
-      <w:r>
-        <w:t xml:space="preserve"> </w:t>
-      </w:r>
-      <w:r>
-        <w:rPr>
-          <w:rStyle w:val="VerbatimChar"/>
-        </w:rPr>
-        <w:t xml:space="preserve">h1_2.01.2</w:t>
-      </w:r>
-      <w:r>
-        <w:t xml:space="preserve">, shown in the same style as Figure 37 of the SC13 Jack Mackerel Technical Annex</w:t>
-      </w:r>
-      <w:r>
-        <w:t xml:space="preserve"> </w:t>
-      </w:r>
-      <w:r>
-        <w:t xml:space="preserve">(SPRFMO Scientific Committee, 2025)</w:t>
-      </w:r>
-      <w:r>
-        <w:t xml:space="preserve">.</w:t>
-      </w:r>
-    </w:p>
-    <w:bookmarkEnd w:id="111"/>
     <w:p>
       <w:pPr>
         <w:pStyle w:val="BodyText"/>
@@ -13071,7 +12713,7 @@
           <w:rPr>
             <w:rStyle w:val="Hyperlink"/>
           </w:rPr>
-          <w:t xml:space="preserve">Figure 10</w:t>
+          <w:t xml:space="preserve">Figure 9</w:t>
         </w:r>
       </w:hyperlink>
       <w:r>
@@ -13091,7 +12733,7 @@
       <w:tr>
         <w:tc>
           <w:tcPr/>
-          <w:bookmarkStart w:id="112" w:name="tbl-selectivity-sc5-like-components"/>
+          <w:bookmarkStart w:id="99" w:name="tbl-selectivity-sc5-like-components"/>
           <w:p>
             <w:pPr>
               <w:jc w:val="center"/>
@@ -15723,7 +15365,7 @@
               </w:tc>
             </w:tr>
           </w:tbl>
-          <w:bookmarkEnd w:id="112"/>
+          <w:bookmarkEnd w:id="99"/>
         </w:tc>
       </w:tr>
     </w:tbl>
@@ -15767,7 +15409,7 @@
           <w:rPr>
             <w:rStyle w:val="Hyperlink"/>
           </w:rPr>
-          <w:t xml:space="preserve">Figure 12</w:t>
+          <w:t xml:space="preserve">Figure 10</w:t>
         </w:r>
       </w:hyperlink>
       <w:r>
@@ -15787,7 +15429,350 @@
       <w:tr>
         <w:tc>
           <w:tcPr/>
-          <w:bookmarkStart w:id="116" w:name="fig-selectivity-sc5-qtrend"/>
+          <w:bookmarkStart w:id="103" w:name="fig-selectivity-sc5-qtrend"/>
+          <w:p>
+            <w:pPr>
+              <w:pStyle w:val="Compact"/>
+              <w:jc w:val="center"/>
+            </w:pPr>
+            <w:r>
+              <w:drawing>
+                <wp:inline>
+                  <wp:extent cx="5334000" cy="3194843"/>
+                  <wp:effectExtent b="0" l="0" r="0" t="0"/>
+                  <wp:docPr descr="" title="" id="101" name="Picture"/>
+                  <a:graphic>
+                    <a:graphicData uri="http://schemas.openxmlformats.org/drawingml/2006/picture">
+                      <pic:pic>
+                        <pic:nvPicPr>
+                          <pic:cNvPr descr="JM-WP-BM-01_files/figure-docx/fig-selectivity-sc5-qtrend-1.png" id="102" name="Picture"/>
+                          <pic:cNvPicPr>
+                            <a:picLocks noChangeArrowheads="1" noChangeAspect="1"/>
+                          </pic:cNvPicPr>
+                        </pic:nvPicPr>
+                        <pic:blipFill>
+                          <a:blip r:embed="rId100"/>
+                          <a:stretch>
+                            <a:fillRect/>
+                          </a:stretch>
+                        </pic:blipFill>
+                        <pic:spPr bwMode="auto">
+                          <a:xfrm>
+                            <a:off x="0" y="0"/>
+                            <a:ext cx="5334000" cy="3194843"/>
+                          </a:xfrm>
+                          <a:prstGeom prst="rect">
+                            <a:avLst/>
+                          </a:prstGeom>
+                          <a:noFill/>
+                          <a:ln w="9525">
+                            <a:noFill/>
+                            <a:headEnd/>
+                            <a:tailEnd/>
+                          </a:ln>
+                        </pic:spPr>
+                      </pic:pic>
+                    </a:graphicData>
+                  </a:graphic>
+                </wp:inline>
+              </w:drawing>
+            </w:r>
+          </w:p>
+          <w:p>
+            <w:pPr>
+              <w:jc w:val="center"/>
+            </w:pPr>
+            <w:pPr>
+              <w:jc w:val="left"/>
+              <w:spacing w:before="200"/>
+              <w:pStyle w:val="ImageCaption"/>
+            </w:pPr>
+            <w:r>
+              <w:t xml:space="preserve">Figure 10: Time trend in fitted catchability for the retained comparable indices in</w:t>
+            </w:r>
+            <w:r>
+              <w:t xml:space="preserve"> </w:t>
+            </w:r>
+            <w:r>
+              <w:rPr>
+                <w:rStyle w:val="VerbatimChar"/>
+              </w:rPr>
+              <w:t xml:space="preserve">h1_2.01.3</w:t>
+            </w:r>
+            <w:r>
+              <w:t xml:space="preserve">, rescaled so each series has mean 1 over 2009-2024, the shortest fitted random-walk window shared across the four series.</w:t>
+            </w:r>
+          </w:p>
+          <w:bookmarkEnd w:id="103"/>
+        </w:tc>
+      </w:tr>
+    </w:tbl>
+    <w:bookmarkStart w:id="112" w:name="fig-selectivity-sc5-compare"/>
+    <w:tbl>
+      <w:tblPr>
+        <w:tblStyle w:val="Table"/>
+        <w:tblW w:type="pct" w:w="4900"/>
+        <w:tblLayout w:type="fixed"/>
+        <w:tblLook w:firstRow="0" w:lastRow="0" w:firstColumn="0" w:lastColumn="0" w:noHBand="0" w:noVBand="0" w:val="0000"/>
+      </w:tblPr>
+      <w:tblGrid>
+        <w:gridCol w:w="3880"/>
+        <w:gridCol w:w="3880"/>
+      </w:tblGrid>
+      <w:tr>
+        <w:tc>
+          <w:tcPr/>
+          <w:tbl>
+            <w:tblPr>
+              <w:tblStyle w:val="Table"/>
+              <w:tblW w:type="pct" w:w="4900"/>
+              <w:tblLayout w:type="fixed"/>
+              <w:tblLook w:firstRow="0" w:lastRow="0" w:firstColumn="0" w:lastColumn="0" w:noHBand="0" w:noVBand="0" w:val="0000"/>
+            </w:tblPr>
+            <w:tblGrid>
+              <w:gridCol w:w="7761"/>
+            </w:tblGrid>
+            <w:tr>
+              <w:tc>
+                <w:tcPr/>
+                <w:bookmarkStart w:id="107" w:name="fig-selectivity-sc5-compare-1"/>
+                <w:p>
+                  <w:pPr>
+                    <w:pStyle w:val="Compact"/>
+                    <w:jc w:val="center"/>
+                    <w:jc w:val="left"/>
+                  </w:pPr>
+                  <w:r>
+                    <w:drawing>
+                      <wp:inline>
+                        <wp:extent cx="2971800" cy="4754880"/>
+                        <wp:effectExtent b="0" l="0" r="0" t="0"/>
+                        <wp:docPr descr="" title="" id="105" name="Picture"/>
+                        <a:graphic>
+                          <a:graphicData uri="http://schemas.openxmlformats.org/drawingml/2006/picture">
+                            <pic:pic>
+                              <pic:nvPicPr>
+                                <pic:cNvPr descr="JM-WP-BM-01_files/figure-docx/fig-selectivity-sc5-compare-1.png" id="106" name="Picture"/>
+                                <pic:cNvPicPr>
+                                  <a:picLocks noChangeArrowheads="1" noChangeAspect="1"/>
+                                </pic:cNvPicPr>
+                              </pic:nvPicPr>
+                              <pic:blipFill>
+                                <a:blip r:embed="rId104"/>
+                                <a:stretch>
+                                  <a:fillRect/>
+                                </a:stretch>
+                              </pic:blipFill>
+                              <pic:spPr bwMode="auto">
+                                <a:xfrm>
+                                  <a:off x="0" y="0"/>
+                                  <a:ext cx="2971800" cy="4754880"/>
+                                </a:xfrm>
+                                <a:prstGeom prst="rect">
+                                  <a:avLst/>
+                                </a:prstGeom>
+                                <a:noFill/>
+                                <a:ln w="9525">
+                                  <a:noFill/>
+                                  <a:headEnd/>
+                                  <a:tailEnd/>
+                                </a:ln>
+                              </pic:spPr>
+                            </pic:pic>
+                          </a:graphicData>
+                        </a:graphic>
+                      </wp:inline>
+                    </w:drawing>
+                  </w:r>
+                </w:p>
+                <w:p>
+                  <w:pPr>
+                    <w:jc w:val="center"/>
+                    <w:jc w:val="left"/>
+                  </w:pPr>
+                  <w:pPr>
+                    <w:jc w:val="left"/>
+                    <w:spacing w:before="200"/>
+                    <w:pStyle w:val="ImageCaption"/>
+                  </w:pPr>
+                  <w:r>
+                    <w:t xml:space="preserve">(a) Model</w:t>
+                  </w:r>
+                  <w:r>
+                    <w:t xml:space="preserve"> </w:t>
+                  </w:r>
+                  <w:r>
+                    <w:rPr>
+                      <w:rStyle w:val="VerbatimChar"/>
+                    </w:rPr>
+                    <w:t xml:space="preserve">h1_2.01.1</w:t>
+                  </w:r>
+                </w:p>
+                <w:bookmarkEnd w:id="107"/>
+              </w:tc>
+            </w:tr>
+          </w:tbl>
+          <w:p/>
+        </w:tc>
+        <w:tc>
+          <w:tcPr/>
+          <w:tbl>
+            <w:tblPr>
+              <w:tblStyle w:val="Table"/>
+              <w:tblW w:type="pct" w:w="4900"/>
+              <w:tblLayout w:type="fixed"/>
+              <w:tblLook w:firstRow="0" w:lastRow="0" w:firstColumn="0" w:lastColumn="0" w:noHBand="0" w:noVBand="0" w:val="0000"/>
+            </w:tblPr>
+            <w:tblGrid>
+              <w:gridCol w:w="7761"/>
+            </w:tblGrid>
+            <w:tr>
+              <w:tc>
+                <w:tcPr/>
+                <w:bookmarkStart w:id="111" w:name="fig-selectivity-sc5-compare-2"/>
+                <w:p>
+                  <w:pPr>
+                    <w:pStyle w:val="Compact"/>
+                    <w:jc w:val="center"/>
+                    <w:jc w:val="left"/>
+                  </w:pPr>
+                  <w:r>
+                    <w:drawing>
+                      <wp:inline>
+                        <wp:extent cx="2971800" cy="4754880"/>
+                        <wp:effectExtent b="0" l="0" r="0" t="0"/>
+                        <wp:docPr descr="" title="" id="109" name="Picture"/>
+                        <a:graphic>
+                          <a:graphicData uri="http://schemas.openxmlformats.org/drawingml/2006/picture">
+                            <pic:pic>
+                              <pic:nvPicPr>
+                                <pic:cNvPr descr="JM-WP-BM-01_files/figure-docx/fig-selectivity-sc5-compare-2.png" id="110" name="Picture"/>
+                                <pic:cNvPicPr>
+                                  <a:picLocks noChangeArrowheads="1" noChangeAspect="1"/>
+                                </pic:cNvPicPr>
+                              </pic:nvPicPr>
+                              <pic:blipFill>
+                                <a:blip r:embed="rId108"/>
+                                <a:stretch>
+                                  <a:fillRect/>
+                                </a:stretch>
+                              </pic:blipFill>
+                              <pic:spPr bwMode="auto">
+                                <a:xfrm>
+                                  <a:off x="0" y="0"/>
+                                  <a:ext cx="2971800" cy="4754880"/>
+                                </a:xfrm>
+                                <a:prstGeom prst="rect">
+                                  <a:avLst/>
+                                </a:prstGeom>
+                                <a:noFill/>
+                                <a:ln w="9525">
+                                  <a:noFill/>
+                                  <a:headEnd/>
+                                  <a:tailEnd/>
+                                </a:ln>
+                              </pic:spPr>
+                            </pic:pic>
+                          </a:graphicData>
+                        </a:graphic>
+                      </wp:inline>
+                    </w:drawing>
+                  </w:r>
+                </w:p>
+                <w:p>
+                  <w:pPr>
+                    <w:jc w:val="center"/>
+                    <w:jc w:val="left"/>
+                  </w:pPr>
+                  <w:pPr>
+                    <w:jc w:val="left"/>
+                    <w:spacing w:before="200"/>
+                    <w:pStyle w:val="ImageCaption"/>
+                  </w:pPr>
+                  <w:r>
+                    <w:t xml:space="preserve">(b) Model</w:t>
+                  </w:r>
+                  <w:r>
+                    <w:t xml:space="preserve"> </w:t>
+                  </w:r>
+                  <w:r>
+                    <w:rPr>
+                      <w:rStyle w:val="VerbatimChar"/>
+                    </w:rPr>
+                    <w:t xml:space="preserve">h1_2.01.2</w:t>
+                  </w:r>
+                </w:p>
+                <w:bookmarkEnd w:id="111"/>
+              </w:tc>
+            </w:tr>
+          </w:tbl>
+          <w:p/>
+        </w:tc>
+      </w:tr>
+    </w:tbl>
+    <w:p>
+      <w:pPr>
+        <w:pStyle w:val="BodyText"/>
+      </w:pPr>
+      <w:pPr>
+        <w:spacing w:before="200"/>
+        <w:pStyle w:val="ImageCaption"/>
+      </w:pPr>
+      <w:r>
+        <w:t xml:space="preserve">Figure 11: Estimates of selectivity by fishery over time for Models</w:t>
+      </w:r>
+      <w:r>
+        <w:t xml:space="preserve"> </w:t>
+      </w:r>
+      <w:r>
+        <w:rPr>
+          <w:rStyle w:val="VerbatimChar"/>
+        </w:rPr>
+        <w:t xml:space="preserve">h1_2.01.1</w:t>
+      </w:r>
+      <w:r>
+        <w:t xml:space="preserve"> </w:t>
+      </w:r>
+      <w:r>
+        <w:t xml:space="preserve">and</w:t>
+      </w:r>
+      <w:r>
+        <w:t xml:space="preserve"> </w:t>
+      </w:r>
+      <w:r>
+        <w:rPr>
+          <w:rStyle w:val="VerbatimChar"/>
+        </w:rPr>
+        <w:t xml:space="preserve">h1_2.01.2</w:t>
+      </w:r>
+      <w:r>
+        <w:t xml:space="preserve">, shown in the same style as Figure 37 of the SC13 Jack Mackerel Technical Annex</w:t>
+      </w:r>
+      <w:r>
+        <w:t xml:space="preserve"> </w:t>
+      </w:r>
+      <w:r>
+        <w:t xml:space="preserve">(SPRFMO Scientific Committee, 2025)</w:t>
+      </w:r>
+      <w:r>
+        <w:t xml:space="preserve">.</w:t>
+      </w:r>
+    </w:p>
+    <w:bookmarkEnd w:id="112"/>
+    <w:tbl>
+      <w:tblPr>
+        <w:tblStyle w:val="Table"/>
+        <w:tblW w:type="pct" w:w="5000"/>
+        <w:tblLayout w:type="fixed"/>
+        <w:tblLook w:firstRow="0" w:lastRow="0" w:firstColumn="0" w:lastColumn="0" w:noHBand="0" w:noVBand="0" w:val="0000"/>
+      </w:tblPr>
+      <w:tblGrid>
+        <w:gridCol w:w="7920"/>
+      </w:tblGrid>
+      <w:tr>
+        <w:tc>
+          <w:tcPr/>
+          <w:bookmarkStart w:id="116" w:name="fig-selectivity-sc5-ssb"/>
           <w:p>
             <w:pPr>
               <w:pStyle w:val="Compact"/>
@@ -15803,7 +15788,7 @@
                     <a:graphicData uri="http://schemas.openxmlformats.org/drawingml/2006/picture">
                       <pic:pic>
                         <pic:nvPicPr>
-                          <pic:cNvPr descr="JM-WP-BM-01_files/figure-docx/fig-selectivity-sc5-qtrend-1.png" id="115" name="Picture"/>
+                          <pic:cNvPr descr="JM-WP-BM-01_files/figure-docx/fig-selectivity-sc5-ssb-1.png" id="115" name="Picture"/>
                           <pic:cNvPicPr>
                             <a:picLocks noChangeArrowheads="1" noChangeAspect="1"/>
                           </pic:cNvPicPr>
@@ -15846,19 +15831,34 @@
               <w:pStyle w:val="ImageCaption"/>
             </w:pPr>
             <w:r>
-              <w:t xml:space="preserve">Figure 12: Time trend in fitted catchability for the retained comparable indices in</w:t>
-            </w:r>
-            <w:r>
-              <w:t xml:space="preserve"> </w:t>
+              <w:t xml:space="preserve">Figure 12: Comparison of spawning biomass trajectories for the original fishery-block model (</w:t>
             </w:r>
             <w:r>
               <w:rPr>
                 <w:rStyle w:val="VerbatimChar"/>
               </w:rPr>
-              <w:t xml:space="preserve">h1_2.01.3</w:t>
+              <w:t xml:space="preserve">h1_2.01</w:t>
             </w:r>
             <w:r>
-              <w:t xml:space="preserve">, rescaled so each series has mean 1 over 2009-2024, the shortest fitted random-walk window shared across the four series.</w:t>
+              <w:t xml:space="preserve">), the annual S-C Chile variant (</w:t>
+            </w:r>
+            <w:r>
+              <w:rPr>
+                <w:rStyle w:val="VerbatimChar"/>
+              </w:rPr>
+              <w:t xml:space="preserve">h1_2.01.1</w:t>
+            </w:r>
+            <w:r>
+              <w:t xml:space="preserve">), and the five-block S-C Chile variant (</w:t>
+            </w:r>
+            <w:r>
+              <w:rPr>
+                <w:rStyle w:val="VerbatimChar"/>
+              </w:rPr>
+              <w:t xml:space="preserve">h1_2.01.2</w:t>
+            </w:r>
+            <w:r>
+              <w:t xml:space="preserve">).</w:t>
             </w:r>
           </w:p>
           <w:bookmarkEnd w:id="116"/>

</xml_diff>